<commit_message>
change search twitter user's limit to 1000, cuz twitter policy
</commit_message>
<xml_diff>
--- a/www/docs/searching.docx
+++ b/www/docs/searching.docx
@@ -8,14 +8,14 @@
         <w:rPr>
           <w:rFonts w:asciiTheme="majorHAnsi" w:hAnsiTheme="majorHAnsi"/>
           <w:b/>
-          <w:sz w:val="28"/>
+          <w:sz w:val="24"/>
         </w:rPr>
       </w:pPr>
       <w:r>
         <w:rPr>
           <w:rFonts w:asciiTheme="majorHAnsi" w:hAnsiTheme="majorHAnsi"/>
           <w:b/>
-          <w:sz w:val="28"/>
+          <w:sz w:val="24"/>
         </w:rPr>
         <w:t>Pulling twitter</w:t>
       </w:r>
@@ -24,7 +24,7 @@
           <w:rStyle w:val="FootnoteReference"/>
           <w:rFonts w:asciiTheme="majorHAnsi" w:hAnsiTheme="majorHAnsi"/>
           <w:b/>
-          <w:sz w:val="28"/>
+          <w:sz w:val="24"/>
         </w:rPr>
         <w:footnoteReference w:id="1"/>
       </w:r>
@@ -32,7 +32,7 @@
         <w:rPr>
           <w:rFonts w:asciiTheme="majorHAnsi" w:hAnsiTheme="majorHAnsi"/>
           <w:b/>
-          <w:sz w:val="28"/>
+          <w:sz w:val="24"/>
         </w:rPr>
         <w:t xml:space="preserve"> data from its REST API</w:t>
       </w:r>
@@ -41,7 +41,7 @@
           <w:rStyle w:val="FootnoteReference"/>
           <w:rFonts w:asciiTheme="majorHAnsi" w:hAnsiTheme="majorHAnsi"/>
           <w:b/>
-          <w:sz w:val="28"/>
+          <w:sz w:val="24"/>
         </w:rPr>
         <w:footnoteReference w:id="2"/>
       </w:r>
@@ -56,12 +56,14 @@
         <w:rPr>
           <w:rFonts w:asciiTheme="majorHAnsi" w:hAnsiTheme="majorHAnsi"/>
           <w:b/>
+          <w:sz w:val="20"/>
         </w:rPr>
       </w:pPr>
       <w:r>
         <w:rPr>
           <w:rFonts w:asciiTheme="majorHAnsi" w:hAnsiTheme="majorHAnsi"/>
           <w:b/>
+          <w:sz w:val="20"/>
         </w:rPr>
         <w:t>Overview</w:t>
       </w:r>
@@ -71,83 +73,97 @@
         <w:ind w:left="360"/>
         <w:rPr>
           <w:rFonts w:asciiTheme="majorHAnsi" w:hAnsiTheme="majorHAnsi"/>
-        </w:rPr>
-      </w:pPr>
-      <w:r>
-        <w:rPr>
-          <w:rFonts w:asciiTheme="majorHAnsi" w:hAnsiTheme="majorHAnsi"/>
+          <w:sz w:val="20"/>
+        </w:rPr>
+      </w:pPr>
+      <w:r>
+        <w:rPr>
+          <w:rFonts w:asciiTheme="majorHAnsi" w:hAnsiTheme="majorHAnsi"/>
+          <w:sz w:val="20"/>
         </w:rPr>
         <w:t xml:space="preserve">In the SMILE application, we have implemented two different searching methods: </w:t>
       </w:r>
       <w:r>
         <w:rPr>
           <w:rFonts w:asciiTheme="majorHAnsi" w:hAnsiTheme="majorHAnsi"/>
+          <w:sz w:val="20"/>
         </w:rPr>
         <w:t>S</w:t>
       </w:r>
       <w:r>
         <w:rPr>
           <w:rFonts w:asciiTheme="majorHAnsi" w:hAnsiTheme="majorHAnsi"/>
+          <w:sz w:val="20"/>
         </w:rPr>
         <w:t>earch</w:t>
       </w:r>
       <w:r>
         <w:rPr>
           <w:rFonts w:asciiTheme="majorHAnsi" w:hAnsiTheme="majorHAnsi"/>
+          <w:sz w:val="20"/>
         </w:rPr>
         <w:t>ing</w:t>
       </w:r>
       <w:r>
         <w:rPr>
           <w:rFonts w:asciiTheme="majorHAnsi" w:hAnsiTheme="majorHAnsi"/>
+          <w:sz w:val="20"/>
         </w:rPr>
         <w:t xml:space="preserve"> the content (tweet) by keywords </w:t>
       </w:r>
       <w:r>
         <w:rPr>
           <w:rFonts w:asciiTheme="majorHAnsi" w:hAnsiTheme="majorHAnsi"/>
+          <w:sz w:val="20"/>
         </w:rPr>
         <w:t>with</w:t>
       </w:r>
       <w:r>
         <w:rPr>
           <w:rFonts w:asciiTheme="majorHAnsi" w:hAnsiTheme="majorHAnsi"/>
+          <w:sz w:val="20"/>
         </w:rPr>
         <w:t xml:space="preserve"> a set of parameters</w:t>
       </w:r>
       <w:r>
         <w:rPr>
           <w:rFonts w:asciiTheme="majorHAnsi" w:hAnsiTheme="majorHAnsi"/>
+          <w:sz w:val="20"/>
         </w:rPr>
         <w:t>, and searching</w:t>
       </w:r>
       <w:r>
         <w:rPr>
           <w:rFonts w:asciiTheme="majorHAnsi" w:hAnsiTheme="majorHAnsi"/>
+          <w:sz w:val="20"/>
         </w:rPr>
         <w:t xml:space="preserve"> the user account by keywords and other parameters. </w:t>
       </w:r>
       <w:r>
         <w:rPr>
           <w:rFonts w:asciiTheme="majorHAnsi" w:hAnsiTheme="majorHAnsi"/>
+          <w:sz w:val="20"/>
         </w:rPr>
         <w:t>We offer a user-friendly interface to facilitate the searching t</w:t>
       </w:r>
       <w:r>
         <w:rPr>
           <w:rFonts w:asciiTheme="majorHAnsi" w:hAnsiTheme="majorHAnsi"/>
+          <w:sz w:val="20"/>
         </w:rPr>
         <w:t xml:space="preserve">ask, while behind the veil, a GraphQL based data server is </w:t>
       </w:r>
       <w:r>
         <w:rPr>
           <w:rFonts w:asciiTheme="majorHAnsi" w:hAnsiTheme="majorHAnsi"/>
+          <w:sz w:val="20"/>
         </w:rPr>
         <w:t>handling</w:t>
       </w:r>
       <w:r>
         <w:rPr>
           <w:rFonts w:asciiTheme="majorHAnsi" w:hAnsiTheme="majorHAnsi"/>
+          <w:sz w:val="20"/>
         </w:rPr>
         <w:t xml:space="preserve"> the heavy lifting of interacting with twitter’s API. </w:t>
       </w:r>
@@ -157,6 +173,7 @@
         <w:ind w:left="360"/>
         <w:rPr>
           <w:rFonts w:asciiTheme="majorHAnsi" w:hAnsiTheme="majorHAnsi"/>
+          <w:sz w:val="20"/>
         </w:rPr>
       </w:pPr>
     </w:p>
@@ -165,17 +182,19 @@
         <w:ind w:left="360"/>
         <w:rPr>
           <w:rFonts w:asciiTheme="majorHAnsi" w:hAnsiTheme="majorHAnsi"/>
+          <w:sz w:val="20"/>
         </w:rPr>
       </w:pPr>
       <w:r>
         <w:rPr>
           <w:rFonts w:asciiTheme="majorHAnsi" w:hAnsiTheme="majorHAnsi"/>
           <w:noProof/>
+          <w:sz w:val="20"/>
         </w:rPr>
         <mc:AlternateContent>
           <mc:Choice Requires="wpg">
             <w:drawing>
-              <wp:anchor distT="0" distB="0" distL="114300" distR="114300" simplePos="0" relativeHeight="251674624" behindDoc="0" locked="0" layoutInCell="1" allowOverlap="1">
+              <wp:anchor distT="0" distB="0" distL="114300" distR="114300" simplePos="0" relativeHeight="251671552" behindDoc="0" locked="0" layoutInCell="1" allowOverlap="1">
                 <wp:simplePos x="0" y="0"/>
                 <wp:positionH relativeFrom="column">
                   <wp:posOffset>381000</wp:posOffset>
@@ -970,7 +989,7 @@
           </mc:Choice>
           <mc:Fallback>
             <w:pict>
-              <v:group id="Group 30" o:spid="_x0000_s1026" style="position:absolute;left:0;text-align:left;margin-left:30pt;margin-top:9.1pt;width:406.55pt;height:202.1pt;z-index:251674624" coordsize="51629,25666" o:gfxdata="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">
+              <v:group id="Group 30" o:spid="_x0000_s1026" style="position:absolute;left:0;text-align:left;margin-left:30pt;margin-top:9.1pt;width:406.55pt;height:202.1pt;z-index:251671552" coordsize="51629,25666" o:gfxdata="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">
                 <v:group id="Group 24" o:spid="_x0000_s1027" style="position:absolute;left:219;top:7315;width:51410;height:18351" coordorigin="219" coordsize="51425,18361" o:gfxdata="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">
                   <v:roundrect id="Rounded Rectangle 3" o:spid="_x0000_s1028" style="position:absolute;left:219;top:2048;width:9798;height:4826;visibility:visible;mso-wrap-style:square;v-text-anchor:middle" arcsize="10923f" o:gfxdata="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" fillcolor="#c00000" stroked="f" strokeweight="1pt">
                     <v:stroke joinstyle="miter"/>
@@ -1108,7 +1127,7 @@
                     <v:stroke joinstyle="miter"/>
                     <v:path gradientshapeok="t" o:connecttype="rect"/>
                   </v:shapetype>
-                  <v:shape id="Text Box 2" o:spid="_x0000_s1041" type="#_x0000_t202" style="position:absolute;left:585;top:585;width:4826;height:5715;visibility:visible;mso-wrap-style:square;v-text-anchor:top" o:gfxdata="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" stroked="f">
+                  <v:shape id="_x0000_s1041" type="#_x0000_t202" style="position:absolute;left:585;top:585;width:4826;height:5715;visibility:visible;mso-wrap-style:square;v-text-anchor:top" o:gfxdata="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" stroked="f">
                     <v:textbox style="mso-fit-shape-to-text:t">
                       <w:txbxContent>
                         <w:p>
@@ -1161,6 +1180,7 @@
         <w:ind w:left="360"/>
         <w:rPr>
           <w:rFonts w:asciiTheme="majorHAnsi" w:hAnsiTheme="majorHAnsi"/>
+          <w:sz w:val="20"/>
         </w:rPr>
       </w:pPr>
     </w:p>
@@ -1169,6 +1189,7 @@
         <w:ind w:left="360"/>
         <w:rPr>
           <w:rFonts w:asciiTheme="majorHAnsi" w:hAnsiTheme="majorHAnsi"/>
+          <w:sz w:val="20"/>
         </w:rPr>
       </w:pPr>
     </w:p>
@@ -1177,6 +1198,7 @@
         <w:ind w:left="360"/>
         <w:rPr>
           <w:rFonts w:asciiTheme="majorHAnsi" w:hAnsiTheme="majorHAnsi"/>
+          <w:sz w:val="20"/>
         </w:rPr>
       </w:pPr>
     </w:p>
@@ -1185,6 +1207,7 @@
         <w:ind w:left="360"/>
         <w:rPr>
           <w:rFonts w:asciiTheme="majorHAnsi" w:hAnsiTheme="majorHAnsi"/>
+          <w:sz w:val="20"/>
         </w:rPr>
       </w:pPr>
     </w:p>
@@ -1193,6 +1216,7 @@
         <w:ind w:left="360"/>
         <w:rPr>
           <w:rFonts w:asciiTheme="majorHAnsi" w:hAnsiTheme="majorHAnsi"/>
+          <w:sz w:val="20"/>
         </w:rPr>
       </w:pPr>
     </w:p>
@@ -1201,6 +1225,7 @@
         <w:ind w:left="360"/>
         <w:rPr>
           <w:rFonts w:asciiTheme="majorHAnsi" w:hAnsiTheme="majorHAnsi"/>
+          <w:sz w:val="20"/>
         </w:rPr>
       </w:pPr>
     </w:p>
@@ -1209,6 +1234,7 @@
         <w:ind w:left="360"/>
         <w:rPr>
           <w:rFonts w:asciiTheme="majorHAnsi" w:hAnsiTheme="majorHAnsi"/>
+          <w:sz w:val="20"/>
         </w:rPr>
       </w:pPr>
     </w:p>
@@ -1217,6 +1243,7 @@
         <w:ind w:left="360"/>
         <w:rPr>
           <w:rFonts w:asciiTheme="majorHAnsi" w:hAnsiTheme="majorHAnsi"/>
+          <w:sz w:val="20"/>
         </w:rPr>
       </w:pPr>
     </w:p>
@@ -1227,6 +1254,7 @@
         <w:rPr>
           <w:rFonts w:asciiTheme="majorHAnsi" w:hAnsiTheme="majorHAnsi"/>
           <w:b/>
+          <w:sz w:val="20"/>
         </w:rPr>
       </w:pPr>
     </w:p>
@@ -1236,18 +1264,21 @@
         <w:jc w:val="center"/>
         <w:rPr>
           <w:rFonts w:asciiTheme="majorHAnsi" w:hAnsiTheme="majorHAnsi"/>
+          <w:sz w:val="20"/>
         </w:rPr>
       </w:pPr>
       <w:r>
         <w:rPr>
           <w:rFonts w:asciiTheme="majorHAnsi" w:hAnsiTheme="majorHAnsi"/>
           <w:b/>
+          <w:sz w:val="20"/>
         </w:rPr>
         <w:t>Figure 1.</w:t>
       </w:r>
       <w:r>
         <w:rPr>
           <w:rFonts w:asciiTheme="majorHAnsi" w:hAnsiTheme="majorHAnsi"/>
+          <w:sz w:val="20"/>
         </w:rPr>
         <w:t xml:space="preserve"> The workflow of pulling data from twitter</w:t>
       </w:r>
@@ -1257,6 +1288,7 @@
         <w:ind w:left="360"/>
         <w:rPr>
           <w:rFonts w:asciiTheme="majorHAnsi" w:hAnsiTheme="majorHAnsi"/>
+          <w:sz w:val="20"/>
         </w:rPr>
       </w:pPr>
     </w:p>
@@ -1265,11 +1297,13 @@
         <w:ind w:left="360"/>
         <w:rPr>
           <w:rFonts w:asciiTheme="majorHAnsi" w:hAnsiTheme="majorHAnsi"/>
-        </w:rPr>
-      </w:pPr>
-      <w:r>
-        <w:rPr>
-          <w:rFonts w:asciiTheme="majorHAnsi" w:hAnsiTheme="majorHAnsi"/>
+          <w:sz w:val="20"/>
+        </w:rPr>
+      </w:pPr>
+      <w:r>
+        <w:rPr>
+          <w:rFonts w:asciiTheme="majorHAnsi" w:hAnsiTheme="majorHAnsi"/>
+          <w:sz w:val="20"/>
         </w:rPr>
         <w:t>GraphQL is a query language for APIs that can full fill queries with any existing data source</w:t>
       </w:r>
@@ -1277,216 +1311,252 @@
         <w:rPr>
           <w:rStyle w:val="FootnoteReference"/>
           <w:rFonts w:asciiTheme="majorHAnsi" w:hAnsiTheme="majorHAnsi"/>
+          <w:sz w:val="20"/>
         </w:rPr>
         <w:footnoteReference w:id="3"/>
       </w:r>
       <w:r>
         <w:rPr>
           <w:rFonts w:asciiTheme="majorHAnsi" w:hAnsiTheme="majorHAnsi"/>
+          <w:sz w:val="20"/>
         </w:rPr>
         <w:t xml:space="preserve">. </w:t>
       </w:r>
       <w:r>
         <w:rPr>
           <w:rFonts w:asciiTheme="majorHAnsi" w:hAnsiTheme="majorHAnsi"/>
+          <w:sz w:val="20"/>
         </w:rPr>
         <w:t xml:space="preserve">In the SMILE application, </w:t>
       </w:r>
       <w:r>
         <w:rPr>
           <w:rFonts w:asciiTheme="majorHAnsi" w:hAnsiTheme="majorHAnsi"/>
+          <w:sz w:val="20"/>
         </w:rPr>
         <w:t xml:space="preserve">GraphQL serves as a </w:t>
       </w:r>
       <w:r>
         <w:rPr>
           <w:rFonts w:asciiTheme="majorHAnsi" w:hAnsiTheme="majorHAnsi"/>
+          <w:sz w:val="20"/>
         </w:rPr>
         <w:t>“</w:t>
       </w:r>
       <w:r>
         <w:rPr>
           <w:rFonts w:asciiTheme="majorHAnsi" w:hAnsiTheme="majorHAnsi"/>
+          <w:sz w:val="20"/>
         </w:rPr>
         <w:t xml:space="preserve">middle </w:t>
       </w:r>
       <w:r>
         <w:rPr>
           <w:rFonts w:asciiTheme="majorHAnsi" w:hAnsiTheme="majorHAnsi"/>
+          <w:sz w:val="20"/>
         </w:rPr>
         <w:t xml:space="preserve">man” </w:t>
       </w:r>
       <w:r>
         <w:rPr>
           <w:rFonts w:asciiTheme="majorHAnsi" w:hAnsiTheme="majorHAnsi"/>
+          <w:sz w:val="20"/>
         </w:rPr>
         <w:t xml:space="preserve">that takes queries from user, assembles the requests and sends them off to Twitter.  </w:t>
       </w:r>
       <w:r>
         <w:rPr>
           <w:rFonts w:asciiTheme="majorHAnsi" w:hAnsiTheme="majorHAnsi"/>
+          <w:sz w:val="20"/>
         </w:rPr>
         <w:t xml:space="preserve">Twitter’s </w:t>
       </w:r>
       <w:r>
         <w:rPr>
           <w:rFonts w:asciiTheme="majorHAnsi" w:hAnsiTheme="majorHAnsi"/>
+          <w:sz w:val="20"/>
         </w:rPr>
         <w:t>API provides a way</w:t>
       </w:r>
       <w:r>
         <w:rPr>
           <w:rFonts w:asciiTheme="majorHAnsi" w:hAnsiTheme="majorHAnsi"/>
+          <w:sz w:val="20"/>
         </w:rPr>
         <w:t xml:space="preserve"> </w:t>
       </w:r>
       <w:r>
         <w:rPr>
           <w:rFonts w:asciiTheme="majorHAnsi" w:hAnsiTheme="majorHAnsi"/>
+          <w:sz w:val="20"/>
         </w:rPr>
         <w:t xml:space="preserve">to programmatically </w:t>
       </w:r>
       <w:r>
         <w:rPr>
           <w:rFonts w:asciiTheme="majorHAnsi" w:hAnsiTheme="majorHAnsi"/>
+          <w:sz w:val="20"/>
         </w:rPr>
         <w:t xml:space="preserve">access to </w:t>
       </w:r>
       <w:r>
         <w:rPr>
           <w:rFonts w:asciiTheme="majorHAnsi" w:hAnsiTheme="majorHAnsi"/>
+          <w:sz w:val="20"/>
         </w:rPr>
         <w:t xml:space="preserve">data from </w:t>
       </w:r>
       <w:r>
         <w:rPr>
           <w:rFonts w:asciiTheme="majorHAnsi" w:hAnsiTheme="majorHAnsi"/>
+          <w:sz w:val="20"/>
         </w:rPr>
         <w:t>its</w:t>
       </w:r>
       <w:r>
         <w:rPr>
           <w:rFonts w:asciiTheme="majorHAnsi" w:hAnsiTheme="majorHAnsi"/>
+          <w:sz w:val="20"/>
         </w:rPr>
         <w:t xml:space="preserve"> database using </w:t>
       </w:r>
       <w:r>
         <w:rPr>
           <w:rFonts w:asciiTheme="majorHAnsi" w:hAnsiTheme="majorHAnsi"/>
+          <w:sz w:val="20"/>
         </w:rPr>
         <w:t>application credentials plus each</w:t>
       </w:r>
       <w:r>
         <w:rPr>
           <w:rFonts w:asciiTheme="majorHAnsi" w:hAnsiTheme="majorHAnsi"/>
+          <w:sz w:val="20"/>
         </w:rPr>
         <w:t xml:space="preserve"> user’s</w:t>
       </w:r>
       <w:r>
         <w:rPr>
           <w:rFonts w:asciiTheme="majorHAnsi" w:hAnsiTheme="majorHAnsi"/>
+          <w:sz w:val="20"/>
         </w:rPr>
         <w:t xml:space="preserve"> own credentials.</w:t>
       </w:r>
       <w:r>
         <w:rPr>
           <w:rFonts w:asciiTheme="majorHAnsi" w:hAnsiTheme="majorHAnsi"/>
+          <w:sz w:val="20"/>
         </w:rPr>
         <w:t xml:space="preserve"> </w:t>
       </w:r>
       <w:r>
         <w:rPr>
           <w:rFonts w:asciiTheme="majorHAnsi" w:hAnsiTheme="majorHAnsi"/>
+          <w:sz w:val="20"/>
         </w:rPr>
         <w:t xml:space="preserve">Once twitter have received and </w:t>
       </w:r>
       <w:r>
         <w:rPr>
           <w:rFonts w:asciiTheme="majorHAnsi" w:hAnsiTheme="majorHAnsi"/>
+          <w:sz w:val="20"/>
         </w:rPr>
         <w:t>validated</w:t>
       </w:r>
       <w:r>
         <w:rPr>
           <w:rFonts w:asciiTheme="majorHAnsi" w:hAnsiTheme="majorHAnsi"/>
+          <w:sz w:val="20"/>
         </w:rPr>
         <w:t xml:space="preserve"> </w:t>
       </w:r>
       <w:r>
         <w:rPr>
           <w:rFonts w:asciiTheme="majorHAnsi" w:hAnsiTheme="majorHAnsi"/>
+          <w:sz w:val="20"/>
         </w:rPr>
         <w:t>those</w:t>
       </w:r>
       <w:r>
         <w:rPr>
           <w:rFonts w:asciiTheme="majorHAnsi" w:hAnsiTheme="majorHAnsi"/>
+          <w:sz w:val="20"/>
         </w:rPr>
         <w:t xml:space="preserve"> request</w:t>
       </w:r>
       <w:r>
         <w:rPr>
           <w:rFonts w:asciiTheme="majorHAnsi" w:hAnsiTheme="majorHAnsi"/>
+          <w:sz w:val="20"/>
         </w:rPr>
         <w:t>s</w:t>
       </w:r>
       <w:r>
         <w:rPr>
           <w:rFonts w:asciiTheme="majorHAnsi" w:hAnsiTheme="majorHAnsi"/>
+          <w:sz w:val="20"/>
         </w:rPr>
         <w:t xml:space="preserve">, data will be returned </w:t>
       </w:r>
       <w:r>
         <w:rPr>
           <w:rFonts w:asciiTheme="majorHAnsi" w:hAnsiTheme="majorHAnsi"/>
+          <w:sz w:val="20"/>
         </w:rPr>
         <w:t xml:space="preserve">back </w:t>
       </w:r>
       <w:r>
         <w:rPr>
           <w:rFonts w:asciiTheme="majorHAnsi" w:hAnsiTheme="majorHAnsi"/>
+          <w:sz w:val="20"/>
         </w:rPr>
         <w:t>correspondingly.</w:t>
       </w:r>
       <w:r>
         <w:rPr>
           <w:rFonts w:asciiTheme="majorHAnsi" w:hAnsiTheme="majorHAnsi"/>
+          <w:sz w:val="20"/>
         </w:rPr>
         <w:t xml:space="preserve"> GraphQL </w:t>
       </w:r>
       <w:r>
         <w:rPr>
           <w:rFonts w:asciiTheme="majorHAnsi" w:hAnsiTheme="majorHAnsi"/>
+          <w:sz w:val="20"/>
         </w:rPr>
         <w:t xml:space="preserve">server </w:t>
       </w:r>
       <w:r>
         <w:rPr>
           <w:rFonts w:asciiTheme="majorHAnsi" w:hAnsiTheme="majorHAnsi"/>
+          <w:sz w:val="20"/>
         </w:rPr>
         <w:t xml:space="preserve">then </w:t>
       </w:r>
       <w:r>
         <w:rPr>
           <w:rFonts w:asciiTheme="majorHAnsi" w:hAnsiTheme="majorHAnsi"/>
+          <w:sz w:val="20"/>
         </w:rPr>
         <w:t xml:space="preserve">conformed those </w:t>
       </w:r>
       <w:r>
         <w:rPr>
           <w:rFonts w:asciiTheme="majorHAnsi" w:hAnsiTheme="majorHAnsi"/>
+          <w:sz w:val="20"/>
         </w:rPr>
         <w:t>data</w:t>
       </w:r>
       <w:r>
         <w:rPr>
           <w:rFonts w:asciiTheme="majorHAnsi" w:hAnsiTheme="majorHAnsi"/>
+          <w:sz w:val="20"/>
         </w:rPr>
         <w:t xml:space="preserve"> to a pre-designed schema and send them</w:t>
       </w:r>
       <w:r>
         <w:rPr>
           <w:rFonts w:asciiTheme="majorHAnsi" w:hAnsiTheme="majorHAnsi"/>
+          <w:sz w:val="20"/>
         </w:rPr>
         <w:t xml:space="preserve"> back to the analytics server in a JSON format</w:t>
       </w:r>
@@ -1494,48 +1564,56 @@
         <w:rPr>
           <w:rStyle w:val="FootnoteReference"/>
           <w:rFonts w:asciiTheme="majorHAnsi" w:hAnsiTheme="majorHAnsi"/>
+          <w:sz w:val="20"/>
         </w:rPr>
         <w:footnoteReference w:id="4"/>
       </w:r>
       <w:r>
         <w:rPr>
           <w:rFonts w:asciiTheme="majorHAnsi" w:hAnsiTheme="majorHAnsi"/>
+          <w:sz w:val="20"/>
         </w:rPr>
         <w:t xml:space="preserve">. Analytics server </w:t>
       </w:r>
       <w:r>
         <w:rPr>
           <w:rFonts w:asciiTheme="majorHAnsi" w:hAnsiTheme="majorHAnsi"/>
+          <w:sz w:val="20"/>
         </w:rPr>
         <w:t xml:space="preserve">are able to </w:t>
       </w:r>
       <w:r>
         <w:rPr>
           <w:rFonts w:asciiTheme="majorHAnsi" w:hAnsiTheme="majorHAnsi"/>
+          <w:sz w:val="20"/>
         </w:rPr>
         <w:t>utilize these data for the following computing tasks, as well as b</w:t>
       </w:r>
       <w:r>
         <w:rPr>
           <w:rFonts w:asciiTheme="majorHAnsi" w:hAnsiTheme="majorHAnsi"/>
+          <w:sz w:val="20"/>
         </w:rPr>
         <w:t>e able to convert the data into a tabular format (.csv)</w:t>
       </w:r>
       <w:r>
         <w:rPr>
           <w:rFonts w:asciiTheme="majorHAnsi" w:hAnsiTheme="majorHAnsi"/>
+          <w:sz w:val="20"/>
         </w:rPr>
         <w:t xml:space="preserve"> and</w:t>
       </w:r>
       <w:r>
         <w:rPr>
           <w:rFonts w:asciiTheme="majorHAnsi" w:hAnsiTheme="majorHAnsi"/>
+          <w:sz w:val="20"/>
         </w:rPr>
         <w:t xml:space="preserve"> allow downloading</w:t>
       </w:r>
       <w:r>
         <w:rPr>
           <w:rFonts w:asciiTheme="majorHAnsi" w:hAnsiTheme="majorHAnsi"/>
+          <w:sz w:val="20"/>
         </w:rPr>
         <w:t xml:space="preserve">. </w:t>
       </w:r>
@@ -1545,6 +1623,7 @@
         <w:rPr>
           <w:rFonts w:asciiTheme="majorHAnsi" w:hAnsiTheme="majorHAnsi"/>
           <w:b/>
+          <w:sz w:val="20"/>
         </w:rPr>
       </w:pPr>
     </w:p>
@@ -1558,14 +1637,15 @@
         <w:rPr>
           <w:rFonts w:asciiTheme="majorHAnsi" w:hAnsiTheme="majorHAnsi"/>
           <w:b/>
+          <w:sz w:val="20"/>
         </w:rPr>
       </w:pPr>
       <w:r>
         <w:rPr>
           <w:rFonts w:asciiTheme="majorHAnsi" w:hAnsiTheme="majorHAnsi"/>
           <w:b/>
-        </w:rPr>
-        <w:lastRenderedPageBreak/>
+          <w:sz w:val="20"/>
+        </w:rPr>
         <w:t>Authentication and Authorization</w:t>
       </w:r>
     </w:p>
@@ -1573,17 +1653,20 @@
       <w:pPr>
         <w:rPr>
           <w:rFonts w:asciiTheme="majorHAnsi" w:hAnsiTheme="majorHAnsi"/>
+          <w:sz w:val="20"/>
         </w:rPr>
       </w:pPr>
       <w:r>
         <w:rPr>
           <w:rFonts w:asciiTheme="majorHAnsi" w:hAnsiTheme="majorHAnsi"/>
           <w:noProof/>
-        </w:rPr>
+          <w:sz w:val="20"/>
+        </w:rPr>
+        <w:lastRenderedPageBreak/>
         <mc:AlternateContent>
           <mc:Choice Requires="wpg">
             <w:drawing>
-              <wp:anchor distT="0" distB="0" distL="114300" distR="114300" simplePos="0" relativeHeight="251736064" behindDoc="0" locked="0" layoutInCell="1" allowOverlap="1">
+              <wp:anchor distT="0" distB="0" distL="114300" distR="114300" simplePos="0" relativeHeight="251732992" behindDoc="0" locked="0" layoutInCell="1" allowOverlap="1">
                 <wp:simplePos x="0" y="0"/>
                 <wp:positionH relativeFrom="column">
                   <wp:posOffset>-82550</wp:posOffset>
@@ -1914,7 +1997,7 @@
           </mc:Choice>
           <mc:Fallback>
             <w:pict>
-              <v:group id="Group 236" o:spid="_x0000_s1045" style="position:absolute;margin-left:-6.5pt;margin-top:78.55pt;width:501.4pt;height:272.35pt;z-index:251736064" coordsize="63677,34588" o:gfxdata="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">
+              <v:group id="Group 236" o:spid="_x0000_s1045" style="position:absolute;margin-left:-6.5pt;margin-top:78.55pt;width:501.4pt;height:272.35pt;z-index:251732992" coordsize="63677,34588" o:gfxdata="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">
                 <v:shapetype id="_x0000_t75" coordsize="21600,21600" o:spt="75" o:preferrelative="t" path="m@4@5l@4@11@9@11@9@5xe" filled="f" stroked="f">
                   <v:stroke joinstyle="miter"/>
                   <v:formulas>
@@ -2096,24 +2179,76 @@
       <w:r>
         <w:rPr>
           <w:rFonts w:asciiTheme="majorHAnsi" w:hAnsiTheme="majorHAnsi"/>
+          <w:sz w:val="20"/>
         </w:rPr>
         <w:t xml:space="preserve">The first time user enters the search page, an authorization must be performed by the user to grant the SMILE application for requesting data from twitter on user’s behalf. </w:t>
       </w:r>
       <w:r>
         <w:rPr>
           <w:rFonts w:asciiTheme="majorHAnsi" w:hAnsiTheme="majorHAnsi"/>
-        </w:rPr>
-        <w:t xml:space="preserve">After clicking the “Authorize with your Twitter account” button, SMILE will redirect user to </w:t>
-      </w:r>
-      <w:r>
-        <w:rPr>
-          <w:rFonts w:asciiTheme="majorHAnsi" w:hAnsiTheme="majorHAnsi"/>
+          <w:sz w:val="20"/>
+        </w:rPr>
+        <w:t xml:space="preserve">After clicking the </w:t>
+      </w:r>
+      <w:r>
+        <w:rPr>
+          <w:noProof/>
+          <w:sz w:val="20"/>
+        </w:rPr>
+        <w:drawing>
+          <wp:inline distT="0" distB="0" distL="0" distR="0" wp14:anchorId="0C315C9F" wp14:editId="228DCF9D">
+            <wp:extent cx="1866900" cy="189978"/>
+            <wp:effectExtent l="0" t="0" r="0" b="635"/>
+            <wp:docPr id="267" name="Picture 267"/>
+            <wp:cNvGraphicFramePr>
+              <a:graphicFrameLocks xmlns:a="http://schemas.openxmlformats.org/drawingml/2006/main" noChangeAspect="1"/>
+            </wp:cNvGraphicFramePr>
+            <a:graphic xmlns:a="http://schemas.openxmlformats.org/drawingml/2006/main">
+              <a:graphicData uri="http://schemas.openxmlformats.org/drawingml/2006/picture">
+                <pic:pic xmlns:pic="http://schemas.openxmlformats.org/drawingml/2006/picture">
+                  <pic:nvPicPr>
+                    <pic:cNvPr id="1" name=""/>
+                    <pic:cNvPicPr/>
+                  </pic:nvPicPr>
+                  <pic:blipFill>
+                    <a:blip r:embed="rId14"/>
+                    <a:stretch>
+                      <a:fillRect/>
+                    </a:stretch>
+                  </pic:blipFill>
+                  <pic:spPr>
+                    <a:xfrm>
+                      <a:off x="0" y="0"/>
+                      <a:ext cx="2026604" cy="206230"/>
+                    </a:xfrm>
+                    <a:prstGeom prst="rect">
+                      <a:avLst/>
+                    </a:prstGeom>
+                  </pic:spPr>
+                </pic:pic>
+              </a:graphicData>
+            </a:graphic>
+          </wp:inline>
+        </w:drawing>
+      </w:r>
+      <w:r>
+        <w:rPr>
+          <w:rFonts w:asciiTheme="majorHAnsi" w:hAnsiTheme="majorHAnsi"/>
+          <w:sz w:val="20"/>
+        </w:rPr>
+        <w:t xml:space="preserve"> button, SMILE will redirect user to </w:t>
+      </w:r>
+      <w:r>
+        <w:rPr>
+          <w:rFonts w:asciiTheme="majorHAnsi" w:hAnsiTheme="majorHAnsi"/>
+          <w:sz w:val="20"/>
         </w:rPr>
         <w:t xml:space="preserve">the </w:t>
       </w:r>
       <w:r>
         <w:rPr>
           <w:rFonts w:asciiTheme="majorHAnsi" w:hAnsiTheme="majorHAnsi"/>
+          <w:sz w:val="20"/>
           <w:u w:val="dotted"/>
         </w:rPr>
         <w:t>T</w:t>
@@ -2121,6 +2256,7 @@
       <w:r>
         <w:rPr>
           <w:rFonts w:asciiTheme="majorHAnsi" w:hAnsiTheme="majorHAnsi"/>
+          <w:sz w:val="20"/>
           <w:u w:val="dotted"/>
         </w:rPr>
         <w:t>witter’s authorize page</w:t>
@@ -2128,90 +2264,105 @@
       <w:r>
         <w:rPr>
           <w:rFonts w:asciiTheme="majorHAnsi" w:hAnsiTheme="majorHAnsi"/>
+          <w:sz w:val="20"/>
         </w:rPr>
         <w:t xml:space="preserve"> where </w:t>
       </w:r>
       <w:r>
         <w:rPr>
           <w:rFonts w:asciiTheme="majorHAnsi" w:hAnsiTheme="majorHAnsi"/>
+          <w:sz w:val="20"/>
         </w:rPr>
         <w:t>it</w:t>
       </w:r>
       <w:r>
         <w:rPr>
           <w:rFonts w:asciiTheme="majorHAnsi" w:hAnsiTheme="majorHAnsi"/>
+          <w:sz w:val="20"/>
         </w:rPr>
         <w:t xml:space="preserve"> asks for </w:t>
       </w:r>
       <w:r>
         <w:rPr>
           <w:rFonts w:asciiTheme="majorHAnsi" w:hAnsiTheme="majorHAnsi"/>
+          <w:sz w:val="20"/>
         </w:rPr>
         <w:t>u</w:t>
       </w:r>
       <w:r>
         <w:rPr>
           <w:rFonts w:asciiTheme="majorHAnsi" w:hAnsiTheme="majorHAnsi"/>
+          <w:sz w:val="20"/>
         </w:rPr>
         <w:t>sername and pass</w:t>
       </w:r>
       <w:r>
         <w:rPr>
           <w:rFonts w:asciiTheme="majorHAnsi" w:hAnsiTheme="majorHAnsi"/>
+          <w:sz w:val="20"/>
         </w:rPr>
         <w:t xml:space="preserve">word. Once you hit the “authorize app” button, you have successfully fulfilled the </w:t>
       </w:r>
       <w:r>
         <w:rPr>
           <w:rFonts w:asciiTheme="majorHAnsi" w:hAnsiTheme="majorHAnsi"/>
+          <w:sz w:val="20"/>
         </w:rPr>
         <w:t>process</w:t>
       </w:r>
       <w:r>
         <w:rPr>
           <w:rFonts w:asciiTheme="majorHAnsi" w:hAnsiTheme="majorHAnsi"/>
+          <w:sz w:val="20"/>
         </w:rPr>
         <w:t xml:space="preserve"> and will be redirect to the SMILE search page. </w:t>
       </w:r>
       <w:r>
         <w:rPr>
           <w:rFonts w:asciiTheme="majorHAnsi" w:hAnsiTheme="majorHAnsi"/>
+          <w:sz w:val="20"/>
         </w:rPr>
         <w:t xml:space="preserve">This </w:t>
       </w:r>
       <w:r>
         <w:rPr>
           <w:rFonts w:asciiTheme="majorHAnsi" w:hAnsiTheme="majorHAnsi"/>
+          <w:sz w:val="20"/>
         </w:rPr>
         <w:t>process</w:t>
       </w:r>
       <w:r>
         <w:rPr>
           <w:rFonts w:asciiTheme="majorHAnsi" w:hAnsiTheme="majorHAnsi"/>
+          <w:sz w:val="20"/>
         </w:rPr>
         <w:t xml:space="preserve"> follows</w:t>
       </w:r>
       <w:r>
         <w:rPr>
           <w:rFonts w:asciiTheme="majorHAnsi" w:hAnsiTheme="majorHAnsi"/>
+          <w:sz w:val="20"/>
         </w:rPr>
         <w:t xml:space="preserve"> a generic 3-legged</w:t>
       </w:r>
       <w:r>
         <w:rPr>
           <w:rFonts w:asciiTheme="majorHAnsi" w:hAnsiTheme="majorHAnsi"/>
+          <w:sz w:val="20"/>
         </w:rPr>
         <w:t xml:space="preserve"> OAuth flow</w:t>
       </w:r>
       <w:r>
         <w:rPr>
           <w:rFonts w:asciiTheme="majorHAnsi" w:hAnsiTheme="majorHAnsi"/>
+          <w:sz w:val="20"/>
         </w:rPr>
         <w:t xml:space="preserve"> practice</w:t>
       </w:r>
       <w:r>
         <w:rPr>
           <w:rFonts w:asciiTheme="majorHAnsi" w:hAnsiTheme="majorHAnsi"/>
+          <w:sz w:val="20"/>
         </w:rPr>
         <w:t xml:space="preserve">. </w:t>
       </w:r>
@@ -2220,6 +2371,7 @@
       <w:pPr>
         <w:rPr>
           <w:noProof/>
+          <w:sz w:val="20"/>
         </w:rPr>
       </w:pPr>
     </w:p>
@@ -2229,24 +2381,28 @@
         <w:jc w:val="center"/>
         <w:rPr>
           <w:rFonts w:asciiTheme="majorHAnsi" w:hAnsiTheme="majorHAnsi"/>
+          <w:sz w:val="20"/>
         </w:rPr>
       </w:pPr>
       <w:r>
         <w:rPr>
           <w:rFonts w:asciiTheme="majorHAnsi" w:hAnsiTheme="majorHAnsi"/>
           <w:b/>
+          <w:sz w:val="20"/>
         </w:rPr>
         <w:t>Figure 2</w:t>
       </w:r>
       <w:r>
         <w:rPr>
           <w:rFonts w:asciiTheme="majorHAnsi" w:hAnsiTheme="majorHAnsi"/>
+          <w:sz w:val="20"/>
         </w:rPr>
         <w:t>. The authorization process in the SMILE application</w:t>
       </w:r>
       <w:r>
         <w:rPr>
           <w:rFonts w:asciiTheme="majorHAnsi" w:hAnsiTheme="majorHAnsi"/>
+          <w:sz w:val="20"/>
         </w:rPr>
         <w:t xml:space="preserve"> </w:t>
       </w:r>
@@ -2255,29 +2411,34 @@
       <w:pPr>
         <w:rPr>
           <w:rFonts w:asciiTheme="majorHAnsi" w:hAnsiTheme="majorHAnsi"/>
-        </w:rPr>
-      </w:pPr>
-      <w:r>
-        <w:rPr>
-          <w:rFonts w:asciiTheme="majorHAnsi" w:hAnsiTheme="majorHAnsi"/>
+          <w:sz w:val="20"/>
+        </w:rPr>
+      </w:pPr>
+      <w:r>
+        <w:rPr>
+          <w:rFonts w:asciiTheme="majorHAnsi" w:hAnsiTheme="majorHAnsi"/>
+          <w:sz w:val="20"/>
         </w:rPr>
         <w:t xml:space="preserve">OAuth </w:t>
       </w:r>
       <w:r>
         <w:rPr>
           <w:rFonts w:asciiTheme="majorHAnsi" w:hAnsiTheme="majorHAnsi"/>
+          <w:sz w:val="20"/>
         </w:rPr>
         <w:t>(</w:t>
       </w:r>
       <w:r>
         <w:rPr>
           <w:rFonts w:asciiTheme="majorHAnsi" w:hAnsiTheme="majorHAnsi"/>
+          <w:sz w:val="20"/>
         </w:rPr>
         <w:t>Open Authorization</w:t>
       </w:r>
       <w:r>
         <w:rPr>
           <w:rFonts w:asciiTheme="majorHAnsi" w:hAnsiTheme="majorHAnsi"/>
+          <w:sz w:val="20"/>
         </w:rPr>
         <w:t>)</w:t>
       </w:r>
@@ -2285,128 +2446,178 @@
         <w:rPr>
           <w:rStyle w:val="FootnoteReference"/>
           <w:rFonts w:asciiTheme="majorHAnsi" w:hAnsiTheme="majorHAnsi"/>
+          <w:sz w:val="20"/>
         </w:rPr>
         <w:footnoteReference w:id="5"/>
       </w:r>
       <w:r>
         <w:rPr>
           <w:rFonts w:asciiTheme="majorHAnsi" w:hAnsiTheme="majorHAnsi"/>
+          <w:sz w:val="20"/>
         </w:rPr>
         <w:t xml:space="preserve"> is an open </w:t>
       </w:r>
       <w:r>
         <w:rPr>
           <w:rFonts w:asciiTheme="majorHAnsi" w:hAnsiTheme="majorHAnsi"/>
+          <w:sz w:val="20"/>
         </w:rPr>
         <w:t>protocol</w:t>
       </w:r>
       <w:r>
         <w:rPr>
           <w:rFonts w:asciiTheme="majorHAnsi" w:hAnsiTheme="majorHAnsi"/>
-        </w:rPr>
-        <w:t xml:space="preserve"> for token-based authentication and authorization on the internet. It </w:t>
-      </w:r>
-      <w:r>
-        <w:rPr>
-          <w:rFonts w:asciiTheme="majorHAnsi" w:hAnsiTheme="majorHAnsi"/>
-        </w:rPr>
-        <w:t>allows an end user's account information to be used by third-party services</w:t>
-      </w:r>
-      <w:r>
-        <w:rPr>
-          <w:rFonts w:asciiTheme="majorHAnsi" w:hAnsiTheme="majorHAnsi"/>
-        </w:rPr>
-        <w:t xml:space="preserve"> (SMILE)</w:t>
-      </w:r>
-      <w:r>
-        <w:rPr>
-          <w:rFonts w:asciiTheme="majorHAnsi" w:hAnsiTheme="majorHAnsi"/>
-        </w:rPr>
-        <w:t xml:space="preserve">, without </w:t>
-      </w:r>
-      <w:r>
-        <w:rPr>
-          <w:rFonts w:asciiTheme="majorHAnsi" w:hAnsiTheme="majorHAnsi"/>
-        </w:rPr>
-        <w:t>actually exposing</w:t>
-      </w:r>
-      <w:r>
-        <w:rPr>
-          <w:rFonts w:asciiTheme="majorHAnsi" w:hAnsiTheme="majorHAnsi"/>
-        </w:rPr>
-        <w:t xml:space="preserve"> the user's passwor</w:t>
-      </w:r>
-      <w:r>
-        <w:rPr>
-          <w:rFonts w:asciiTheme="majorHAnsi" w:hAnsiTheme="majorHAnsi"/>
-        </w:rPr>
-        <w:t xml:space="preserve">d to that services. </w:t>
-      </w:r>
-      <w:r>
-        <w:rPr>
-          <w:rFonts w:asciiTheme="majorHAnsi" w:hAnsiTheme="majorHAnsi"/>
+          <w:sz w:val="20"/>
+        </w:rPr>
+        <w:t xml:space="preserve"> for token-based authentication and authorization on the internet. It allows an end user's account information to be used by third-party services (SMILE), without actually exposing the user's password to that services. </w:t>
+      </w:r>
+      <w:r>
+        <w:rPr>
+          <w:rFonts w:asciiTheme="majorHAnsi" w:hAnsiTheme="majorHAnsi"/>
+          <w:sz w:val="20"/>
         </w:rPr>
         <w:t xml:space="preserve">A 3-legged OAuth flow is illustrated below (figure 3). </w:t>
       </w:r>
       <w:r>
         <w:rPr>
           <w:rFonts w:asciiTheme="majorHAnsi" w:hAnsiTheme="majorHAnsi"/>
+          <w:sz w:val="20"/>
         </w:rPr>
         <w:t>The main ide</w:t>
       </w:r>
       <w:r>
         <w:rPr>
           <w:rFonts w:asciiTheme="majorHAnsi" w:hAnsiTheme="majorHAnsi"/>
+          <w:sz w:val="20"/>
         </w:rPr>
         <w:t xml:space="preserve">a </w:t>
       </w:r>
       <w:r>
         <w:rPr>
           <w:rFonts w:asciiTheme="majorHAnsi" w:hAnsiTheme="majorHAnsi"/>
-        </w:rPr>
-        <w:t>behind is:</w:t>
-      </w:r>
-      <w:r>
-        <w:rPr>
-          <w:rFonts w:asciiTheme="majorHAnsi" w:hAnsiTheme="majorHAnsi"/>
+          <w:sz w:val="20"/>
+        </w:rPr>
+        <w:t>behind this is</w:t>
+      </w:r>
+      <w:r>
+        <w:rPr>
+          <w:rFonts w:asciiTheme="majorHAnsi" w:hAnsiTheme="majorHAnsi"/>
+          <w:sz w:val="20"/>
         </w:rPr>
         <w:t xml:space="preserve"> twit</w:t>
       </w:r>
       <w:r>
         <w:rPr>
           <w:rFonts w:asciiTheme="majorHAnsi" w:hAnsiTheme="majorHAnsi"/>
+          <w:sz w:val="20"/>
         </w:rPr>
         <w:t>ter or any social media service</w:t>
       </w:r>
       <w:r>
         <w:rPr>
           <w:rFonts w:asciiTheme="majorHAnsi" w:hAnsiTheme="majorHAnsi"/>
+          <w:sz w:val="20"/>
         </w:rPr>
         <w:t xml:space="preserve"> will grant the application </w:t>
       </w:r>
       <w:r>
         <w:rPr>
           <w:rFonts w:asciiTheme="majorHAnsi" w:hAnsiTheme="majorHAnsi"/>
+          <w:sz w:val="20"/>
         </w:rPr>
         <w:t xml:space="preserve">certain </w:t>
       </w:r>
       <w:r>
         <w:rPr>
           <w:rFonts w:asciiTheme="majorHAnsi" w:hAnsiTheme="majorHAnsi"/>
-        </w:rPr>
-        <w:t>access token which allows application to</w:t>
-      </w:r>
-      <w:r>
-        <w:rPr>
-          <w:rFonts w:asciiTheme="majorHAnsi" w:hAnsiTheme="majorHAnsi"/>
-        </w:rPr>
-        <w:t xml:space="preserve"> act on behalf of the user to either retrieve </w:t>
-      </w:r>
-      <w:r>
-        <w:rPr>
-          <w:rFonts w:asciiTheme="majorHAnsi" w:hAnsiTheme="majorHAnsi"/>
-        </w:rPr>
-        <w:t xml:space="preserve">or posting data from those social media. </w:t>
+          <w:sz w:val="20"/>
+          <w:u w:val="dotted"/>
+        </w:rPr>
+        <w:t>access token</w:t>
+      </w:r>
+      <w:r>
+        <w:rPr>
+          <w:rFonts w:asciiTheme="majorHAnsi" w:hAnsiTheme="majorHAnsi"/>
+          <w:sz w:val="20"/>
+        </w:rPr>
+        <w:t xml:space="preserve"> which allows </w:t>
+      </w:r>
+      <w:r>
+        <w:rPr>
+          <w:rFonts w:asciiTheme="majorHAnsi" w:hAnsiTheme="majorHAnsi"/>
+          <w:sz w:val="20"/>
+        </w:rPr>
+        <w:t xml:space="preserve">the </w:t>
+      </w:r>
+      <w:r>
+        <w:rPr>
+          <w:rFonts w:asciiTheme="majorHAnsi" w:hAnsiTheme="majorHAnsi"/>
+          <w:sz w:val="20"/>
+        </w:rPr>
+        <w:t>application to</w:t>
+      </w:r>
+      <w:r>
+        <w:rPr>
+          <w:rFonts w:asciiTheme="majorHAnsi" w:hAnsiTheme="majorHAnsi"/>
+          <w:sz w:val="20"/>
+        </w:rPr>
+        <w:t xml:space="preserve"> act on behalf of the user</w:t>
+      </w:r>
+      <w:r>
+        <w:rPr>
+          <w:rFonts w:asciiTheme="majorHAnsi" w:hAnsiTheme="majorHAnsi"/>
+          <w:sz w:val="20"/>
+        </w:rPr>
+        <w:t xml:space="preserve">. </w:t>
+      </w:r>
+      <w:r>
+        <w:rPr>
+          <w:rFonts w:asciiTheme="majorHAnsi" w:hAnsiTheme="majorHAnsi"/>
+          <w:sz w:val="20"/>
+        </w:rPr>
+        <w:t>The SMILE application intends to attain th</w:t>
+      </w:r>
+      <w:r>
+        <w:rPr>
+          <w:rFonts w:asciiTheme="majorHAnsi" w:hAnsiTheme="majorHAnsi"/>
+          <w:sz w:val="20"/>
+        </w:rPr>
+        <w:t>is</w:t>
+      </w:r>
+      <w:r>
+        <w:rPr>
+          <w:rFonts w:asciiTheme="majorHAnsi" w:hAnsiTheme="majorHAnsi"/>
+          <w:sz w:val="20"/>
+        </w:rPr>
+        <w:t xml:space="preserve"> access token, pass it to the </w:t>
+      </w:r>
+      <w:r>
+        <w:rPr>
+          <w:rFonts w:asciiTheme="majorHAnsi" w:hAnsiTheme="majorHAnsi"/>
+          <w:sz w:val="20"/>
+        </w:rPr>
+        <w:t>GraphQL data server, and send</w:t>
+      </w:r>
+      <w:r>
+        <w:rPr>
+          <w:rFonts w:asciiTheme="majorHAnsi" w:hAnsiTheme="majorHAnsi"/>
+          <w:sz w:val="20"/>
+        </w:rPr>
+        <w:t xml:space="preserve"> this access token along with user’s request to twitter</w:t>
+      </w:r>
+      <w:r>
+        <w:rPr>
+          <w:rFonts w:asciiTheme="majorHAnsi" w:hAnsiTheme="majorHAnsi"/>
+          <w:sz w:val="20"/>
+        </w:rPr>
+        <w:t xml:space="preserve"> in order to fetch data</w:t>
+      </w:r>
+      <w:r>
+        <w:rPr>
+          <w:rFonts w:asciiTheme="majorHAnsi" w:hAnsiTheme="majorHAnsi"/>
+          <w:sz w:val="20"/>
+        </w:rPr>
+        <w:t xml:space="preserve">. </w:t>
       </w:r>
     </w:p>
     <w:p>
@@ -2414,18 +2625,20 @@
         <w:jc w:val="center"/>
         <w:rPr>
           <w:rFonts w:asciiTheme="majorHAnsi" w:hAnsiTheme="majorHAnsi"/>
+          <w:sz w:val="20"/>
         </w:rPr>
       </w:pPr>
       <w:r>
         <w:rPr>
           <w:rFonts w:asciiTheme="majorHAnsi" w:hAnsiTheme="majorHAnsi"/>
           <w:noProof/>
+          <w:sz w:val="20"/>
         </w:rPr>
         <w:lastRenderedPageBreak/>
         <mc:AlternateContent>
           <mc:Choice Requires="wpg">
             <w:drawing>
-              <wp:anchor distT="0" distB="0" distL="114300" distR="114300" simplePos="0" relativeHeight="251728896" behindDoc="0" locked="0" layoutInCell="1" allowOverlap="1">
+              <wp:anchor distT="0" distB="0" distL="114300" distR="114300" simplePos="0" relativeHeight="251725824" behindDoc="0" locked="0" layoutInCell="1" allowOverlap="1">
                 <wp:simplePos x="0" y="0"/>
                 <wp:positionH relativeFrom="column">
                   <wp:posOffset>1092200</wp:posOffset>
@@ -2458,7 +2671,7 @@
                           </pic:cNvPicPr>
                         </pic:nvPicPr>
                         <pic:blipFill>
-                          <a:blip r:embed="rId14">
+                          <a:blip r:embed="rId15">
                             <a:extLst>
                               <a:ext uri="{28A0092B-C50C-407E-A947-70E740481C1C}">
                                 <a14:useLocalDpi xmlns:a14="http://schemas.microsoft.com/office/drawing/2010/main" val="0"/>
@@ -3070,14 +3283,14 @@
           </mc:Choice>
           <mc:Fallback>
             <w:pict>
-              <v:group id="Group 232" o:spid="_x0000_s1052" style="position:absolute;left:0;text-align:left;margin-left:86pt;margin-top:13.5pt;width:332.6pt;height:499.95pt;z-index:251728896;mso-width-relative:margin;mso-height-relative:margin" coordsize="42240,63493" o:gfxdata="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">
+              <v:group id="Group 232" o:spid="_x0000_s1052" style="position:absolute;left:0;text-align:left;margin-left:86pt;margin-top:13.5pt;width:332.6pt;height:499.95pt;z-index:251725824;mso-width-relative:margin;mso-height-relative:margin" coordsize="42240,63493" o:gfxdata="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">
                 <v:shape id="Picture 197" o:spid="_x0000_s1053" type="#_x0000_t75" alt="https://malalanayake.files.wordpress.com/2013/01/oauth_graph.gif" style="position:absolute;width:42240;height:63493;visibility:visible;mso-wrap-style:square" o:gfxdata="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">
-                  <v:imagedata r:id="rId15" o:title="oauth_graph"/>
+                  <v:imagedata r:id="rId16" o:title="oauth_graph"/>
                   <v:path arrowok="t"/>
                 </v:shape>
                 <v:group id="Group 231" o:spid="_x0000_s1054" style="position:absolute;left:2286;top:444;width:35433;height:54864" coordsize="35433,54864" o:gfxdata="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">
                   <v:group id="Group 230" o:spid="_x0000_s1055" style="position:absolute;left:571;width:22225;height:1841" coordsize="22225,1841" o:gfxdata="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">
-                    <v:shape id="Text Box 2" o:spid="_x0000_s1056" type="#_x0000_t202" style="position:absolute;left:17526;width:4699;height:1778;visibility:visible;mso-wrap-style:square;v-text-anchor:middle" o:gfxdata="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" stroked="f">
+                    <v:shape id="_x0000_s1056" type="#_x0000_t202" style="position:absolute;left:17526;width:4699;height:1778;visibility:visible;mso-wrap-style:square;v-text-anchor:middle" o:gfxdata="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" stroked="f">
                       <v:textbox inset="0,0,0,0">
                         <w:txbxContent>
                           <w:p>
@@ -3098,7 +3311,7 @@
                         </w:txbxContent>
                       </v:textbox>
                     </v:shape>
-                    <v:shape id="Text Box 2" o:spid="_x0000_s1057" type="#_x0000_t202" style="position:absolute;top:63;width:8890;height:1778;visibility:visible;mso-wrap-style:square;v-text-anchor:middle" o:gfxdata="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" stroked="f">
+                    <v:shape id="_x0000_s1057" type="#_x0000_t202" style="position:absolute;top:63;width:8890;height:1778;visibility:visible;mso-wrap-style:square;v-text-anchor:middle" o:gfxdata="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" stroked="f">
                       <v:textbox inset="0,0,0,0">
                         <w:txbxContent>
                           <w:p>
@@ -3122,7 +3335,7 @@
                     </v:shape>
                   </v:group>
                   <v:group id="Group 228" o:spid="_x0000_s1058" style="position:absolute;top:3683;width:35433;height:51181" coordsize="35433,51181" o:gfxdata="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">
-                    <v:shape id="Text Box 2" o:spid="_x0000_s1059" type="#_x0000_t202" style="position:absolute;left:5397;top:18796;width:2731;height:952;visibility:visible;mso-wrap-style:square;v-text-anchor:middle" o:gfxdata="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" stroked="f">
+                    <v:shape id="_x0000_s1059" type="#_x0000_t202" style="position:absolute;left:5397;top:18796;width:2731;height:952;visibility:visible;mso-wrap-style:square;v-text-anchor:middle" o:gfxdata="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" stroked="f">
                       <v:textbox inset="0,0,0,0">
                         <w:txbxContent>
                           <w:p>
@@ -3143,7 +3356,7 @@
                       </v:textbox>
                     </v:shape>
                     <v:group id="Group 227" o:spid="_x0000_s1060" style="position:absolute;width:35433;height:51181" coordsize="35433,51181" o:gfxdata="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">
-                      <v:shape id="Text Box 2" o:spid="_x0000_s1061" type="#_x0000_t202" style="position:absolute;left:33337;top:50228;width:2096;height:953;visibility:visible;mso-wrap-style:square;v-text-anchor:middle" o:gfxdata="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" stroked="f">
+                      <v:shape id="_x0000_s1061" type="#_x0000_t202" style="position:absolute;left:33337;top:50228;width:2096;height:953;visibility:visible;mso-wrap-style:square;v-text-anchor:middle" o:gfxdata="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" stroked="f">
                         <v:textbox inset="0,0,0,0">
                           <w:txbxContent>
                             <w:p>
@@ -3162,7 +3375,7 @@
                           </w:txbxContent>
                         </v:textbox>
                       </v:shape>
-                      <v:shape id="Text Box 2" o:spid="_x0000_s1062" type="#_x0000_t202" style="position:absolute;left:15938;top:49022;width:2731;height:952;visibility:visible;mso-wrap-style:square;v-text-anchor:middle" o:gfxdata="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" stroked="f">
+                      <v:shape id="_x0000_s1062" type="#_x0000_t202" style="position:absolute;left:15938;top:49022;width:2731;height:952;visibility:visible;mso-wrap-style:square;v-text-anchor:middle" o:gfxdata="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" stroked="f">
                         <v:textbox inset="0,0,0,0">
                           <w:txbxContent>
                             <w:p>
@@ -3182,7 +3395,7 @@
                           </w:txbxContent>
                         </v:textbox>
                       </v:shape>
-                      <v:shape id="Text Box 2" o:spid="_x0000_s1063" type="#_x0000_t202" style="position:absolute;left:15811;top:31813;width:2731;height:953;visibility:visible;mso-wrap-style:square;v-text-anchor:middle" o:gfxdata="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" stroked="f">
+                      <v:shape id="_x0000_s1063" type="#_x0000_t202" style="position:absolute;left:15811;top:31813;width:2731;height:953;visibility:visible;mso-wrap-style:square;v-text-anchor:middle" o:gfxdata="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" stroked="f">
                         <v:textbox inset="0,0,0,0">
                           <w:txbxContent>
                             <w:p>
@@ -3203,7 +3416,7 @@
                         </v:textbox>
                       </v:shape>
                       <v:group id="Group 226" o:spid="_x0000_s1064" style="position:absolute;left:15875;width:2921;height:26670" coordsize="2921,26670" o:gfxdata="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">
-                        <v:shape id="Text Box 2" o:spid="_x0000_s1065" type="#_x0000_t202" style="position:absolute;left:190;top:25717;width:2731;height:953;visibility:visible;mso-wrap-style:square;v-text-anchor:middle" o:gfxdata="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" stroked="f">
+                        <v:shape id="_x0000_s1065" type="#_x0000_t202" style="position:absolute;left:190;top:25717;width:2731;height:953;visibility:visible;mso-wrap-style:square;v-text-anchor:middle" o:gfxdata="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" stroked="f">
                           <v:textbox inset="0,0,0,0">
                             <w:txbxContent>
                               <w:p>
@@ -3223,7 +3436,7 @@
                             </w:txbxContent>
                           </v:textbox>
                         </v:shape>
-                        <v:shape id="Text Box 2" o:spid="_x0000_s1066" type="#_x0000_t202" style="position:absolute;left:63;top:20447;width:2731;height:952;visibility:visible;mso-wrap-style:square;v-text-anchor:middle" o:gfxdata="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" stroked="f">
+                        <v:shape id="_x0000_s1066" type="#_x0000_t202" style="position:absolute;left:63;top:20447;width:2731;height:952;visibility:visible;mso-wrap-style:square;v-text-anchor:middle" o:gfxdata="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" stroked="f">
                           <v:textbox inset="0,0,0,0">
                             <w:txbxContent>
                               <w:p>
@@ -3244,7 +3457,7 @@
                           </v:textbox>
                         </v:shape>
                         <v:group id="Group 225" o:spid="_x0000_s1067" style="position:absolute;width:2794;height:7239" coordsize="2794,7239" o:gfxdata="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">
-                          <v:shape id="Text Box 2" o:spid="_x0000_s1068" type="#_x0000_t202" style="position:absolute;top:6286;width:2730;height:953;visibility:visible;mso-wrap-style:square;v-text-anchor:middle" o:gfxdata="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" stroked="f">
+                          <v:shape id="_x0000_s1068" type="#_x0000_t202" style="position:absolute;top:6286;width:2730;height:953;visibility:visible;mso-wrap-style:square;v-text-anchor:middle" o:gfxdata="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" stroked="f">
                             <v:textbox inset="0,0,0,0">
                               <w:txbxContent>
                                 <w:p>
@@ -3264,7 +3477,7 @@
                               </w:txbxContent>
                             </v:textbox>
                           </v:shape>
-                          <v:shape id="Text Box 2" o:spid="_x0000_s1069" type="#_x0000_t202" style="position:absolute;left:63;width:2731;height:952;visibility:visible;mso-wrap-style:square;v-text-anchor:middle" o:gfxdata="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" stroked="f">
+                          <v:shape id="_x0000_s1069" type="#_x0000_t202" style="position:absolute;left:63;width:2731;height:952;visibility:visible;mso-wrap-style:square;v-text-anchor:middle" o:gfxdata="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" stroked="f">
                             <v:textbox inset="0,0,0,0">
                               <w:txbxContent>
                                 <w:p>
@@ -3286,7 +3499,7 @@
                           </v:shape>
                         </v:group>
                       </v:group>
-                      <v:shape id="Text Box 2" o:spid="_x0000_s1070" type="#_x0000_t202" style="position:absolute;top:44513;width:2730;height:953;visibility:visible;mso-wrap-style:square;v-text-anchor:middle" o:gfxdata="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" fillcolor="#0d85af" stroked="f">
+                      <v:shape id="_x0000_s1070" type="#_x0000_t202" style="position:absolute;top:44513;width:2730;height:953;visibility:visible;mso-wrap-style:square;v-text-anchor:middle" o:gfxdata="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" fillcolor="#0d85af" stroked="f">
                         <v:textbox inset="0,0,0,0">
                           <w:txbxContent>
                             <w:p>
@@ -3324,6 +3537,7 @@
         <w:jc w:val="center"/>
         <w:rPr>
           <w:rFonts w:asciiTheme="majorHAnsi" w:hAnsiTheme="majorHAnsi"/>
+          <w:sz w:val="20"/>
         </w:rPr>
       </w:pPr>
     </w:p>
@@ -3332,18 +3546,21 @@
         <w:jc w:val="center"/>
         <w:rPr>
           <w:rFonts w:asciiTheme="majorHAnsi" w:hAnsiTheme="majorHAnsi"/>
+          <w:sz w:val="20"/>
         </w:rPr>
       </w:pPr>
       <w:r>
         <w:rPr>
           <w:rFonts w:asciiTheme="majorHAnsi" w:hAnsiTheme="majorHAnsi"/>
           <w:b/>
+          <w:sz w:val="20"/>
         </w:rPr>
         <w:t>Figure 3.</w:t>
       </w:r>
       <w:r>
         <w:rPr>
           <w:rFonts w:asciiTheme="majorHAnsi" w:hAnsiTheme="majorHAnsi"/>
+          <w:sz w:val="20"/>
         </w:rPr>
         <w:t xml:space="preserve"> Three-legged OAuth Flow</w:t>
       </w:r>
@@ -3353,6 +3570,7 @@
         <w:jc w:val="center"/>
         <w:rPr>
           <w:rFonts w:asciiTheme="majorHAnsi" w:hAnsiTheme="majorHAnsi"/>
+          <w:sz w:val="20"/>
         </w:rPr>
       </w:pPr>
     </w:p>
@@ -3366,12 +3584,14 @@
         <w:rPr>
           <w:rFonts w:asciiTheme="majorHAnsi" w:hAnsiTheme="majorHAnsi"/>
           <w:b/>
+          <w:sz w:val="20"/>
         </w:rPr>
       </w:pPr>
       <w:r>
         <w:rPr>
           <w:rFonts w:asciiTheme="majorHAnsi" w:hAnsiTheme="majorHAnsi"/>
           <w:b/>
+          <w:sz w:val="20"/>
         </w:rPr>
         <w:t>Search Tweets</w:t>
       </w:r>
@@ -3382,26 +3602,29 @@
         <w:ind w:left="360"/>
         <w:rPr>
           <w:rFonts w:asciiTheme="majorHAnsi" w:hAnsiTheme="majorHAnsi"/>
-        </w:rPr>
-      </w:pPr>
-      <w:r>
-        <w:rPr>
-          <w:rFonts w:asciiTheme="majorHAnsi" w:hAnsiTheme="majorHAnsi"/>
-        </w:rPr>
-        <w:lastRenderedPageBreak/>
+          <w:sz w:val="20"/>
+        </w:rPr>
+      </w:pPr>
+      <w:r>
+        <w:rPr>
+          <w:rFonts w:asciiTheme="majorHAnsi" w:hAnsiTheme="majorHAnsi"/>
+          <w:sz w:val="20"/>
+        </w:rPr>
         <w:t>The Twitter Search API</w:t>
       </w:r>
       <w:r>
         <w:rPr>
           <w:rFonts w:asciiTheme="majorHAnsi" w:hAnsiTheme="majorHAnsi"/>
+          <w:sz w:val="20"/>
         </w:rPr>
         <w:t xml:space="preserve">, which is essentially the endpoint of </w:t>
       </w:r>
-      <w:hyperlink r:id="rId16" w:history="1">
+      <w:hyperlink r:id="rId17" w:history="1">
         <w:r>
           <w:rPr>
             <w:rStyle w:val="Hyperlink"/>
             <w:rFonts w:asciiTheme="majorHAnsi" w:hAnsiTheme="majorHAnsi"/>
+            <w:sz w:val="20"/>
           </w:rPr>
           <w:t>https://api.twitter.com/1.1/search/tweets.json</w:t>
         </w:r>
@@ -3410,44 +3633,135 @@
         <w:rPr>
           <w:rStyle w:val="FootnoteReference"/>
           <w:rFonts w:asciiTheme="majorHAnsi" w:hAnsiTheme="majorHAnsi"/>
+          <w:sz w:val="20"/>
         </w:rPr>
         <w:footnoteReference w:id="6"/>
       </w:r>
       <w:r>
         <w:rPr>
           <w:rFonts w:asciiTheme="majorHAnsi" w:hAnsiTheme="majorHAnsi"/>
+          <w:sz w:val="20"/>
         </w:rPr>
         <w:t xml:space="preserve">, will return a collection of relevant Tweets matching a specific query. </w:t>
       </w:r>
       <w:r>
         <w:rPr>
           <w:rFonts w:asciiTheme="majorHAnsi" w:hAnsiTheme="majorHAnsi"/>
+          <w:sz w:val="20"/>
         </w:rPr>
         <w:t>The</w:t>
       </w:r>
       <w:r>
         <w:rPr>
           <w:rFonts w:asciiTheme="majorHAnsi" w:hAnsiTheme="majorHAnsi"/>
+          <w:sz w:val="20"/>
         </w:rPr>
         <w:t xml:space="preserve"> searches </w:t>
       </w:r>
       <w:r>
         <w:rPr>
           <w:rFonts w:asciiTheme="majorHAnsi" w:hAnsiTheme="majorHAnsi"/>
+          <w:sz w:val="20"/>
         </w:rPr>
         <w:t xml:space="preserve">will be performed </w:t>
       </w:r>
       <w:r>
         <w:rPr>
           <w:rFonts w:asciiTheme="majorHAnsi" w:hAnsiTheme="majorHAnsi"/>
-        </w:rPr>
-        <w:t>against a sampling of recent Tweets published in the past 7 days.</w:t>
-      </w:r>
-      <w:r>
-        <w:rPr>
-          <w:rFonts w:asciiTheme="majorHAnsi" w:hAnsiTheme="majorHAnsi"/>
-        </w:rPr>
-        <w:t xml:space="preserve"> Each user can specify a few parameters to make their search more accurate: </w:t>
+          <w:sz w:val="20"/>
+        </w:rPr>
+        <w:t xml:space="preserve">against a sampling of recent </w:t>
+      </w:r>
+      <w:r>
+        <w:rPr>
+          <w:rFonts w:asciiTheme="majorHAnsi" w:hAnsiTheme="majorHAnsi"/>
+          <w:sz w:val="20"/>
+        </w:rPr>
+        <w:lastRenderedPageBreak/>
+        <w:t>Tweets published in the past 7 days.</w:t>
+      </w:r>
+      <w:r>
+        <w:rPr>
+          <w:rFonts w:asciiTheme="majorHAnsi" w:hAnsiTheme="majorHAnsi"/>
+          <w:sz w:val="20"/>
+        </w:rPr>
+        <w:t xml:space="preserve"> </w:t>
+      </w:r>
+      <w:r>
+        <w:rPr>
+          <w:rFonts w:asciiTheme="majorHAnsi" w:hAnsiTheme="majorHAnsi"/>
+          <w:sz w:val="20"/>
+        </w:rPr>
+        <w:t xml:space="preserve">The default setting only return the maximum number of 1,800 tweets that matches user’s query, while there are other </w:t>
+      </w:r>
+      <w:r>
+        <w:rPr>
+          <w:rFonts w:asciiTheme="majorHAnsi" w:hAnsiTheme="majorHAnsi"/>
+          <w:sz w:val="20"/>
+        </w:rPr>
+        <w:t xml:space="preserve">parameters to make </w:t>
+      </w:r>
+      <w:r>
+        <w:rPr>
+          <w:rFonts w:asciiTheme="majorHAnsi" w:hAnsiTheme="majorHAnsi"/>
+          <w:sz w:val="20"/>
+        </w:rPr>
+        <w:t xml:space="preserve">the </w:t>
+      </w:r>
+      <w:r>
+        <w:rPr>
+          <w:rFonts w:asciiTheme="majorHAnsi" w:hAnsiTheme="majorHAnsi"/>
+          <w:sz w:val="20"/>
+        </w:rPr>
+        <w:t xml:space="preserve">search more accurate. When you hit the </w:t>
+      </w:r>
+      <w:r>
+        <w:rPr>
+          <w:noProof/>
+          <w:sz w:val="20"/>
+        </w:rPr>
+        <w:drawing>
+          <wp:inline distT="0" distB="0" distL="0" distR="0" wp14:anchorId="2EB56F2B" wp14:editId="4E30D906">
+            <wp:extent cx="714375" cy="213645"/>
+            <wp:effectExtent l="0" t="0" r="0" b="0"/>
+            <wp:docPr id="240" name="Picture 240"/>
+            <wp:cNvGraphicFramePr>
+              <a:graphicFrameLocks xmlns:a="http://schemas.openxmlformats.org/drawingml/2006/main" noChangeAspect="1"/>
+            </wp:cNvGraphicFramePr>
+            <a:graphic xmlns:a="http://schemas.openxmlformats.org/drawingml/2006/main">
+              <a:graphicData uri="http://schemas.openxmlformats.org/drawingml/2006/picture">
+                <pic:pic xmlns:pic="http://schemas.openxmlformats.org/drawingml/2006/picture">
+                  <pic:nvPicPr>
+                    <pic:cNvPr id="1" name=""/>
+                    <pic:cNvPicPr/>
+                  </pic:nvPicPr>
+                  <pic:blipFill>
+                    <a:blip r:embed="rId18"/>
+                    <a:stretch>
+                      <a:fillRect/>
+                    </a:stretch>
+                  </pic:blipFill>
+                  <pic:spPr>
+                    <a:xfrm>
+                      <a:off x="0" y="0"/>
+                      <a:ext cx="736577" cy="220285"/>
+                    </a:xfrm>
+                    <a:prstGeom prst="rect">
+                      <a:avLst/>
+                    </a:prstGeom>
+                  </pic:spPr>
+                </pic:pic>
+              </a:graphicData>
+            </a:graphic>
+          </wp:inline>
+        </w:drawing>
+      </w:r>
+      <w:r>
+        <w:rPr>
+          <w:rFonts w:asciiTheme="majorHAnsi" w:hAnsiTheme="majorHAnsi"/>
+          <w:sz w:val="20"/>
+        </w:rPr>
+        <w:t xml:space="preserve"> button, a dropdown list will appear with the following options:</w:t>
       </w:r>
     </w:p>
     <w:p>
@@ -3459,49 +3773,93 @@
         </w:numPr>
         <w:rPr>
           <w:rFonts w:asciiTheme="majorHAnsi" w:hAnsiTheme="majorHAnsi"/>
-        </w:rPr>
-      </w:pPr>
-      <w:r>
-        <w:rPr>
-          <w:rFonts w:asciiTheme="majorHAnsi" w:hAnsiTheme="majorHAnsi"/>
+          <w:sz w:val="20"/>
+        </w:rPr>
+      </w:pPr>
+      <w:r>
+        <w:rPr>
+          <w:rFonts w:asciiTheme="majorHAnsi" w:hAnsiTheme="majorHAnsi"/>
+          <w:sz w:val="20"/>
         </w:rPr>
         <w:t xml:space="preserve">English keyword, </w:t>
       </w:r>
       <w:r>
         <w:rPr>
           <w:rFonts w:asciiTheme="majorHAnsi" w:hAnsiTheme="majorHAnsi"/>
+          <w:sz w:val="20"/>
         </w:rPr>
         <w:t>phrases</w:t>
       </w:r>
       <w:r>
         <w:rPr>
           <w:rFonts w:asciiTheme="majorHAnsi" w:hAnsiTheme="majorHAnsi"/>
-        </w:rPr>
-        <w:t>, numbers, and any combination of them</w:t>
-      </w:r>
-      <w:r>
-        <w:rPr>
-          <w:rFonts w:asciiTheme="majorHAnsi" w:hAnsiTheme="majorHAnsi"/>
+          <w:sz w:val="20"/>
+        </w:rPr>
+        <w:t xml:space="preserve">, numbers, </w:t>
+      </w:r>
+      <w:r>
+        <w:rPr>
+          <w:rFonts w:asciiTheme="majorHAnsi" w:hAnsiTheme="majorHAnsi"/>
+          <w:sz w:val="20"/>
+        </w:rPr>
+        <w:t xml:space="preserve">operators, </w:t>
+      </w:r>
+      <w:r>
+        <w:rPr>
+          <w:rFonts w:asciiTheme="majorHAnsi" w:hAnsiTheme="majorHAnsi"/>
+          <w:sz w:val="20"/>
+        </w:rPr>
+        <w:t>and any combination of them</w:t>
+      </w:r>
+      <w:r>
+        <w:rPr>
+          <w:rFonts w:asciiTheme="majorHAnsi" w:hAnsiTheme="majorHAnsi"/>
+          <w:sz w:val="20"/>
         </w:rPr>
         <w:t xml:space="preserve"> that are no longer than </w:t>
       </w:r>
       <w:r>
         <w:rPr>
           <w:rFonts w:asciiTheme="majorHAnsi" w:hAnsiTheme="majorHAnsi"/>
+          <w:sz w:val="20"/>
         </w:rPr>
         <w:t>500</w:t>
       </w:r>
       <w:r>
         <w:rPr>
           <w:rFonts w:asciiTheme="majorHAnsi" w:hAnsiTheme="majorHAnsi"/>
+          <w:sz w:val="20"/>
         </w:rPr>
         <w:t xml:space="preserve"> </w:t>
       </w:r>
       <w:r>
         <w:rPr>
           <w:rFonts w:asciiTheme="majorHAnsi" w:hAnsiTheme="majorHAnsi"/>
+          <w:sz w:val="20"/>
         </w:rPr>
         <w:t>characters</w:t>
+      </w:r>
+      <w:r>
+        <w:rPr>
+          <w:rFonts w:asciiTheme="majorHAnsi" w:hAnsiTheme="majorHAnsi"/>
+          <w:sz w:val="20"/>
+        </w:rPr>
+        <w:t xml:space="preserve">. This is corresponding to the </w:t>
+      </w:r>
+      <w:r>
+        <w:rPr>
+          <w:rFonts w:asciiTheme="majorHAnsi" w:hAnsiTheme="majorHAnsi"/>
+          <w:i/>
+          <w:sz w:val="20"/>
+        </w:rPr>
+        <w:t>“q”</w:t>
+      </w:r>
+      <w:r>
+        <w:rPr>
+          <w:rFonts w:asciiTheme="majorHAnsi" w:hAnsiTheme="majorHAnsi"/>
+          <w:sz w:val="20"/>
+        </w:rPr>
+        <w:t xml:space="preserve"> parameter for the endpoint. </w:t>
       </w:r>
     </w:p>
     <w:p>
@@ -3513,13 +3871,66 @@
         </w:numPr>
         <w:rPr>
           <w:rFonts w:asciiTheme="majorHAnsi" w:hAnsiTheme="majorHAnsi"/>
-        </w:rPr>
-      </w:pPr>
-      <w:r>
-        <w:rPr>
-          <w:rFonts w:asciiTheme="majorHAnsi" w:hAnsiTheme="majorHAnsi"/>
-        </w:rPr>
-        <w:t xml:space="preserve">; maximum number of tweets </w:t>
+          <w:sz w:val="20"/>
+        </w:rPr>
+      </w:pPr>
+      <w:r>
+        <w:rPr>
+          <w:rFonts w:asciiTheme="majorHAnsi" w:hAnsiTheme="majorHAnsi"/>
+          <w:sz w:val="20"/>
+        </w:rPr>
+        <w:t>Maximum</w:t>
+      </w:r>
+      <w:r>
+        <w:rPr>
+          <w:rFonts w:asciiTheme="majorHAnsi" w:hAnsiTheme="majorHAnsi"/>
+          <w:sz w:val="20"/>
+        </w:rPr>
+        <w:t xml:space="preserve"> number of tweets</w:t>
+      </w:r>
+      <w:r>
+        <w:rPr>
+          <w:rFonts w:asciiTheme="majorHAnsi" w:hAnsiTheme="majorHAnsi"/>
+          <w:sz w:val="20"/>
+        </w:rPr>
+        <w:t xml:space="preserve"> (Note: the maximum num</w:t>
+      </w:r>
+      <w:r>
+        <w:rPr>
+          <w:rFonts w:asciiTheme="majorHAnsi" w:hAnsiTheme="majorHAnsi"/>
+          <w:sz w:val="20"/>
+        </w:rPr>
+        <w:t>ber of matches will be returned.)</w:t>
+      </w:r>
+      <w:r>
+        <w:rPr>
+          <w:rFonts w:asciiTheme="majorHAnsi" w:hAnsiTheme="majorHAnsi"/>
+          <w:sz w:val="20"/>
+        </w:rPr>
+        <w:t xml:space="preserve"> This will be translated into twitter’s fashion of pagination, i.e. </w:t>
+      </w:r>
+      <w:r>
+        <w:rPr>
+          <w:rFonts w:asciiTheme="majorHAnsi" w:hAnsiTheme="majorHAnsi"/>
+          <w:i/>
+          <w:sz w:val="20"/>
+        </w:rPr>
+        <w:t xml:space="preserve">“count”, </w:t>
+      </w:r>
+      <w:r>
+        <w:rPr>
+          <w:rFonts w:asciiTheme="majorHAnsi" w:hAnsiTheme="majorHAnsi"/>
+          <w:i/>
+          <w:sz w:val="20"/>
+        </w:rPr>
+        <w:t>“since_id” and “max_id”</w:t>
+      </w:r>
+      <w:r>
+        <w:rPr>
+          <w:rFonts w:asciiTheme="majorHAnsi" w:hAnsiTheme="majorHAnsi"/>
+          <w:sz w:val="20"/>
+        </w:rPr>
+        <w:t xml:space="preserve"> parameters.</w:t>
       </w:r>
     </w:p>
     <w:p>
@@ -3531,34 +3942,1346 @@
         </w:numPr>
         <w:rPr>
           <w:rFonts w:asciiTheme="majorHAnsi" w:hAnsiTheme="majorHAnsi"/>
-        </w:rPr>
-      </w:pPr>
-      <w:bookmarkStart w:id="0" w:name="_GoBack"/>
-      <w:bookmarkEnd w:id="0"/>
+          <w:sz w:val="20"/>
+        </w:rPr>
+      </w:pPr>
+      <w:r>
+        <w:rPr>
+          <w:rFonts w:asciiTheme="majorHAnsi" w:hAnsiTheme="majorHAnsi"/>
+          <w:sz w:val="20"/>
+        </w:rPr>
+        <w:t xml:space="preserve">Date Range of the search results </w:t>
+      </w:r>
+      <w:r>
+        <w:rPr>
+          <w:rFonts w:asciiTheme="majorHAnsi" w:hAnsiTheme="majorHAnsi"/>
+          <w:sz w:val="20"/>
+        </w:rPr>
+        <w:t xml:space="preserve">can be selected by the user, </w:t>
+      </w:r>
+      <w:r>
+        <w:rPr>
+          <w:rFonts w:asciiTheme="majorHAnsi" w:hAnsiTheme="majorHAnsi"/>
+          <w:sz w:val="20"/>
+        </w:rPr>
+        <w:t xml:space="preserve">with the starting date </w:t>
+      </w:r>
+      <w:r>
+        <w:rPr>
+          <w:rFonts w:asciiTheme="majorHAnsi" w:hAnsiTheme="majorHAnsi"/>
+          <w:sz w:val="20"/>
+        </w:rPr>
+        <w:t xml:space="preserve">fixed as </w:t>
+      </w:r>
+      <w:r>
+        <w:rPr>
+          <w:rFonts w:asciiTheme="majorHAnsi" w:hAnsiTheme="majorHAnsi"/>
+          <w:sz w:val="20"/>
+        </w:rPr>
+        <w:t xml:space="preserve">7 days ago and an end date of </w:t>
+      </w:r>
+      <w:r>
+        <w:rPr>
+          <w:rFonts w:asciiTheme="majorHAnsi" w:hAnsiTheme="majorHAnsi"/>
+          <w:sz w:val="20"/>
+        </w:rPr>
+        <w:t>user’s</w:t>
+      </w:r>
+      <w:r>
+        <w:rPr>
+          <w:rFonts w:asciiTheme="majorHAnsi" w:hAnsiTheme="majorHAnsi"/>
+          <w:sz w:val="20"/>
+        </w:rPr>
+        <w:t xml:space="preserve"> choice.</w:t>
+      </w:r>
+      <w:r>
+        <w:rPr>
+          <w:rFonts w:asciiTheme="majorHAnsi" w:hAnsiTheme="majorHAnsi"/>
+          <w:sz w:val="20"/>
+        </w:rPr>
+        <w:t xml:space="preserve"> This is the </w:t>
+      </w:r>
+      <w:r>
+        <w:rPr>
+          <w:rFonts w:asciiTheme="majorHAnsi" w:hAnsiTheme="majorHAnsi"/>
+          <w:i/>
+          <w:sz w:val="20"/>
+        </w:rPr>
+        <w:t>“until”</w:t>
+      </w:r>
+      <w:r>
+        <w:rPr>
+          <w:rFonts w:asciiTheme="majorHAnsi" w:hAnsiTheme="majorHAnsi"/>
+          <w:sz w:val="20"/>
+        </w:rPr>
+        <w:t xml:space="preserve"> parameter</w:t>
+      </w:r>
+      <w:r>
+        <w:rPr>
+          <w:rFonts w:asciiTheme="majorHAnsi" w:hAnsiTheme="majorHAnsi"/>
+          <w:sz w:val="20"/>
+        </w:rPr>
+        <w:t xml:space="preserve">. </w:t>
+      </w:r>
     </w:p>
     <w:p>
       <w:pPr>
         <w:pStyle w:val="ListParagraph"/>
+        <w:numPr>
+          <w:ilvl w:val="0"/>
+          <w:numId w:val="2"/>
+        </w:numPr>
+        <w:rPr>
+          <w:rFonts w:asciiTheme="majorHAnsi" w:hAnsiTheme="majorHAnsi"/>
+          <w:sz w:val="20"/>
+        </w:rPr>
+      </w:pPr>
+      <w:r>
+        <w:rPr>
+          <w:rFonts w:asciiTheme="majorHAnsi" w:hAnsiTheme="majorHAnsi"/>
+          <w:sz w:val="20"/>
+        </w:rPr>
+        <w:t xml:space="preserve">You can </w:t>
+      </w:r>
+      <w:r>
+        <w:rPr>
+          <w:rFonts w:asciiTheme="majorHAnsi" w:hAnsiTheme="majorHAnsi"/>
+          <w:sz w:val="20"/>
+        </w:rPr>
+        <w:t xml:space="preserve">search within an area on the map if you can provide the latitude, </w:t>
+      </w:r>
+      <w:r>
+        <w:rPr>
+          <w:rFonts w:asciiTheme="majorHAnsi" w:hAnsiTheme="majorHAnsi"/>
+          <w:sz w:val="20"/>
+        </w:rPr>
+        <w:t>longitude</w:t>
+      </w:r>
+      <w:r>
+        <w:rPr>
+          <w:rFonts w:asciiTheme="majorHAnsi" w:hAnsiTheme="majorHAnsi"/>
+          <w:sz w:val="20"/>
+        </w:rPr>
+        <w:t xml:space="preserve"> as well as the radius in miles.</w:t>
+      </w:r>
+      <w:r>
+        <w:rPr>
+          <w:rFonts w:asciiTheme="majorHAnsi" w:hAnsiTheme="majorHAnsi"/>
+          <w:sz w:val="20"/>
+        </w:rPr>
+        <w:t xml:space="preserve"> These are corresponding to the </w:t>
+      </w:r>
+      <w:r>
+        <w:rPr>
+          <w:rFonts w:asciiTheme="majorHAnsi" w:hAnsiTheme="majorHAnsi"/>
+          <w:i/>
+          <w:sz w:val="20"/>
+        </w:rPr>
+        <w:t>“geocode”</w:t>
+      </w:r>
+      <w:r>
+        <w:rPr>
+          <w:rFonts w:asciiTheme="majorHAnsi" w:hAnsiTheme="majorHAnsi"/>
+          <w:sz w:val="20"/>
+        </w:rPr>
+        <w:t xml:space="preserve"> parameter.</w:t>
+      </w:r>
+    </w:p>
+    <w:p>
+      <w:pPr>
+        <w:pStyle w:val="ListParagraph"/>
+        <w:numPr>
+          <w:ilvl w:val="0"/>
+          <w:numId w:val="2"/>
+        </w:numPr>
+        <w:rPr>
+          <w:rFonts w:asciiTheme="majorHAnsi" w:hAnsiTheme="majorHAnsi"/>
+          <w:sz w:val="20"/>
+        </w:rPr>
+      </w:pPr>
+      <w:r>
+        <w:rPr>
+          <w:rFonts w:asciiTheme="majorHAnsi" w:hAnsiTheme="majorHAnsi"/>
+          <w:sz w:val="20"/>
+        </w:rPr>
+        <w:t xml:space="preserve">You can decide what fields you want in the return data. For example, some user might only want </w:t>
+      </w:r>
+      <w:r>
+        <w:rPr>
+          <w:rFonts w:asciiTheme="majorHAnsi" w:hAnsiTheme="majorHAnsi"/>
+          <w:sz w:val="20"/>
+        </w:rPr>
+        <w:t xml:space="preserve">tweet </w:t>
+      </w:r>
+      <w:r>
+        <w:rPr>
+          <w:rFonts w:asciiTheme="majorHAnsi" w:hAnsiTheme="majorHAnsi"/>
+          <w:sz w:val="20"/>
+        </w:rPr>
+        <w:t>“text”</w:t>
+      </w:r>
+      <w:r>
+        <w:rPr>
+          <w:rFonts w:asciiTheme="majorHAnsi" w:hAnsiTheme="majorHAnsi"/>
+          <w:sz w:val="20"/>
+        </w:rPr>
+        <w:t xml:space="preserve"> </w:t>
+      </w:r>
+      <w:r>
+        <w:rPr>
+          <w:rFonts w:asciiTheme="majorHAnsi" w:hAnsiTheme="majorHAnsi"/>
+          <w:sz w:val="20"/>
+        </w:rPr>
+        <w:t>and others might only want the “id” of the tweet.</w:t>
+      </w:r>
+      <w:r>
+        <w:rPr>
+          <w:rFonts w:asciiTheme="majorHAnsi" w:hAnsiTheme="majorHAnsi"/>
+          <w:noProof/>
+          <w:sz w:val="20"/>
+        </w:rPr>
+        <w:t xml:space="preserve"> </w:t>
+      </w:r>
+    </w:p>
+    <w:p>
+      <w:pPr>
+        <w:pStyle w:val="ListParagraph"/>
+        <w:ind w:left="1080"/>
+        <w:rPr>
+          <w:rFonts w:asciiTheme="majorHAnsi" w:hAnsiTheme="majorHAnsi"/>
+          <w:sz w:val="20"/>
+        </w:rPr>
+      </w:pPr>
+    </w:p>
+    <w:p>
+      <w:pPr>
+        <w:jc w:val="center"/>
+        <w:rPr>
+          <w:rFonts w:asciiTheme="majorHAnsi" w:hAnsiTheme="majorHAnsi"/>
+          <w:sz w:val="20"/>
+        </w:rPr>
+      </w:pPr>
+      <w:r>
+        <w:rPr>
+          <w:noProof/>
+          <w:sz w:val="20"/>
+        </w:rPr>
+        <mc:AlternateContent>
+          <mc:Choice Requires="wpg">
+            <w:drawing>
+              <wp:inline distT="0" distB="0" distL="0" distR="0" wp14:anchorId="41B4ED8E" wp14:editId="550A2824">
+                <wp:extent cx="4887595" cy="3959860"/>
+                <wp:effectExtent l="0" t="0" r="8255" b="2540"/>
+                <wp:docPr id="264" name="Group 264"/>
+                <wp:cNvGraphicFramePr/>
+                <a:graphic xmlns:a="http://schemas.openxmlformats.org/drawingml/2006/main">
+                  <a:graphicData uri="http://schemas.microsoft.com/office/word/2010/wordprocessingGroup">
+                    <wpg:wgp>
+                      <wpg:cNvGrpSpPr/>
+                      <wpg:grpSpPr>
+                        <a:xfrm>
+                          <a:off x="0" y="0"/>
+                          <a:ext cx="4887595" cy="3959860"/>
+                          <a:chOff x="0" y="0"/>
+                          <a:chExt cx="4887595" cy="3959860"/>
+                        </a:xfrm>
+                      </wpg:grpSpPr>
+                      <wpg:grpSp>
+                        <wpg:cNvPr id="246" name="Group 246"/>
+                        <wpg:cNvGrpSpPr/>
+                        <wpg:grpSpPr>
+                          <a:xfrm>
+                            <a:off x="0" y="0"/>
+                            <a:ext cx="4887595" cy="3959860"/>
+                            <a:chOff x="0" y="0"/>
+                            <a:chExt cx="4887595" cy="3959860"/>
+                          </a:xfrm>
+                        </wpg:grpSpPr>
+                        <pic:pic xmlns:pic="http://schemas.openxmlformats.org/drawingml/2006/picture">
+                          <pic:nvPicPr>
+                            <pic:cNvPr id="237" name="Picture 237"/>
+                            <pic:cNvPicPr>
+                              <a:picLocks noChangeAspect="1"/>
+                            </pic:cNvPicPr>
+                          </pic:nvPicPr>
+                          <pic:blipFill>
+                            <a:blip r:embed="rId19">
+                              <a:extLst>
+                                <a:ext uri="{28A0092B-C50C-407E-A947-70E740481C1C}">
+                                  <a14:useLocalDpi xmlns:a14="http://schemas.microsoft.com/office/drawing/2010/main" val="0"/>
+                                </a:ext>
+                              </a:extLst>
+                            </a:blip>
+                            <a:stretch>
+                              <a:fillRect/>
+                            </a:stretch>
+                          </pic:blipFill>
+                          <pic:spPr>
+                            <a:xfrm>
+                              <a:off x="0" y="0"/>
+                              <a:ext cx="4887595" cy="3959860"/>
+                            </a:xfrm>
+                            <a:prstGeom prst="rect">
+                              <a:avLst/>
+                            </a:prstGeom>
+                          </pic:spPr>
+                        </pic:pic>
+                        <wps:wsp>
+                          <wps:cNvPr id="241" name="Rectangle 241"/>
+                          <wps:cNvSpPr/>
+                          <wps:spPr>
+                            <a:xfrm>
+                              <a:off x="25400" y="38100"/>
+                              <a:ext cx="596900" cy="228600"/>
+                            </a:xfrm>
+                            <a:prstGeom prst="rect">
+                              <a:avLst/>
+                            </a:prstGeom>
+                            <a:noFill/>
+                            <a:ln w="19050">
+                              <a:solidFill>
+                                <a:srgbClr val="C00000"/>
+                              </a:solidFill>
+                            </a:ln>
+                          </wps:spPr>
+                          <wps:style>
+                            <a:lnRef idx="2">
+                              <a:schemeClr val="accent1">
+                                <a:shade val="50000"/>
+                              </a:schemeClr>
+                            </a:lnRef>
+                            <a:fillRef idx="1">
+                              <a:schemeClr val="accent1"/>
+                            </a:fillRef>
+                            <a:effectRef idx="0">
+                              <a:schemeClr val="accent1"/>
+                            </a:effectRef>
+                            <a:fontRef idx="minor">
+                              <a:schemeClr val="lt1"/>
+                            </a:fontRef>
+                          </wps:style>
+                          <wps:bodyPr rot="0" spcFirstLastPara="0" vertOverflow="overflow" horzOverflow="overflow" vert="horz" wrap="square" lIns="91440" tIns="45720" rIns="91440" bIns="45720" numCol="1" spcCol="0" rtlCol="0" fromWordArt="0" anchor="ctr" anchorCtr="0" forceAA="0" compatLnSpc="1">
+                            <a:prstTxWarp prst="textNoShape">
+                              <a:avLst/>
+                            </a:prstTxWarp>
+                            <a:noAutofit/>
+                          </wps:bodyPr>
+                        </wps:wsp>
+                        <wps:wsp>
+                          <wps:cNvPr id="242" name="Rectangle 242"/>
+                          <wps:cNvSpPr/>
+                          <wps:spPr>
+                            <a:xfrm>
+                              <a:off x="1073150" y="31750"/>
+                              <a:ext cx="1003300" cy="234950"/>
+                            </a:xfrm>
+                            <a:prstGeom prst="rect">
+                              <a:avLst/>
+                            </a:prstGeom>
+                            <a:noFill/>
+                            <a:ln w="19050">
+                              <a:solidFill>
+                                <a:srgbClr val="C00000"/>
+                              </a:solidFill>
+                            </a:ln>
+                          </wps:spPr>
+                          <wps:style>
+                            <a:lnRef idx="2">
+                              <a:schemeClr val="accent1">
+                                <a:shade val="50000"/>
+                              </a:schemeClr>
+                            </a:lnRef>
+                            <a:fillRef idx="1">
+                              <a:schemeClr val="accent1"/>
+                            </a:fillRef>
+                            <a:effectRef idx="0">
+                              <a:schemeClr val="accent1"/>
+                            </a:effectRef>
+                            <a:fontRef idx="minor">
+                              <a:schemeClr val="lt1"/>
+                            </a:fontRef>
+                          </wps:style>
+                          <wps:bodyPr rot="0" spcFirstLastPara="0" vertOverflow="overflow" horzOverflow="overflow" vert="horz" wrap="square" lIns="91440" tIns="45720" rIns="91440" bIns="45720" numCol="1" spcCol="0" rtlCol="0" fromWordArt="0" anchor="ctr" anchorCtr="0" forceAA="0" compatLnSpc="1">
+                            <a:prstTxWarp prst="textNoShape">
+                              <a:avLst/>
+                            </a:prstTxWarp>
+                            <a:noAutofit/>
+                          </wps:bodyPr>
+                        </wps:wsp>
+                        <wps:wsp>
+                          <wps:cNvPr id="243" name="Rectangle 243"/>
+                          <wps:cNvSpPr/>
+                          <wps:spPr>
+                            <a:xfrm>
+                              <a:off x="1219200" y="457200"/>
+                              <a:ext cx="3530600" cy="292100"/>
+                            </a:xfrm>
+                            <a:prstGeom prst="rect">
+                              <a:avLst/>
+                            </a:prstGeom>
+                            <a:noFill/>
+                            <a:ln w="19050">
+                              <a:solidFill>
+                                <a:srgbClr val="C00000"/>
+                              </a:solidFill>
+                            </a:ln>
+                          </wps:spPr>
+                          <wps:style>
+                            <a:lnRef idx="2">
+                              <a:schemeClr val="accent1">
+                                <a:shade val="50000"/>
+                              </a:schemeClr>
+                            </a:lnRef>
+                            <a:fillRef idx="1">
+                              <a:schemeClr val="accent1"/>
+                            </a:fillRef>
+                            <a:effectRef idx="0">
+                              <a:schemeClr val="accent1"/>
+                            </a:effectRef>
+                            <a:fontRef idx="minor">
+                              <a:schemeClr val="lt1"/>
+                            </a:fontRef>
+                          </wps:style>
+                          <wps:bodyPr rot="0" spcFirstLastPara="0" vertOverflow="overflow" horzOverflow="overflow" vert="horz" wrap="square" lIns="91440" tIns="45720" rIns="91440" bIns="45720" numCol="1" spcCol="0" rtlCol="0" fromWordArt="0" anchor="ctr" anchorCtr="0" forceAA="0" compatLnSpc="1">
+                            <a:prstTxWarp prst="textNoShape">
+                              <a:avLst/>
+                            </a:prstTxWarp>
+                            <a:noAutofit/>
+                          </wps:bodyPr>
+                        </wps:wsp>
+                        <wps:wsp>
+                          <wps:cNvPr id="244" name="Rectangle 244"/>
+                          <wps:cNvSpPr/>
+                          <wps:spPr>
+                            <a:xfrm>
+                              <a:off x="1454150" y="952500"/>
+                              <a:ext cx="3175000" cy="387350"/>
+                            </a:xfrm>
+                            <a:prstGeom prst="rect">
+                              <a:avLst/>
+                            </a:prstGeom>
+                            <a:noFill/>
+                            <a:ln w="19050">
+                              <a:solidFill>
+                                <a:srgbClr val="C00000"/>
+                              </a:solidFill>
+                            </a:ln>
+                          </wps:spPr>
+                          <wps:style>
+                            <a:lnRef idx="2">
+                              <a:schemeClr val="accent1">
+                                <a:shade val="50000"/>
+                              </a:schemeClr>
+                            </a:lnRef>
+                            <a:fillRef idx="1">
+                              <a:schemeClr val="accent1"/>
+                            </a:fillRef>
+                            <a:effectRef idx="0">
+                              <a:schemeClr val="accent1"/>
+                            </a:effectRef>
+                            <a:fontRef idx="minor">
+                              <a:schemeClr val="lt1"/>
+                            </a:fontRef>
+                          </wps:style>
+                          <wps:bodyPr rot="0" spcFirstLastPara="0" vertOverflow="overflow" horzOverflow="overflow" vert="horz" wrap="square" lIns="91440" tIns="45720" rIns="91440" bIns="45720" numCol="1" spcCol="0" rtlCol="0" fromWordArt="0" anchor="ctr" anchorCtr="0" forceAA="0" compatLnSpc="1">
+                            <a:prstTxWarp prst="textNoShape">
+                              <a:avLst/>
+                            </a:prstTxWarp>
+                            <a:noAutofit/>
+                          </wps:bodyPr>
+                        </wps:wsp>
+                        <wps:wsp>
+                          <wps:cNvPr id="245" name="Rectangle 245"/>
+                          <wps:cNvSpPr/>
+                          <wps:spPr>
+                            <a:xfrm>
+                              <a:off x="1250950" y="1581150"/>
+                              <a:ext cx="3517900" cy="349250"/>
+                            </a:xfrm>
+                            <a:prstGeom prst="rect">
+                              <a:avLst/>
+                            </a:prstGeom>
+                            <a:noFill/>
+                            <a:ln w="19050">
+                              <a:solidFill>
+                                <a:srgbClr val="C00000"/>
+                              </a:solidFill>
+                            </a:ln>
+                          </wps:spPr>
+                          <wps:style>
+                            <a:lnRef idx="2">
+                              <a:schemeClr val="accent1">
+                                <a:shade val="50000"/>
+                              </a:schemeClr>
+                            </a:lnRef>
+                            <a:fillRef idx="1">
+                              <a:schemeClr val="accent1"/>
+                            </a:fillRef>
+                            <a:effectRef idx="0">
+                              <a:schemeClr val="accent1"/>
+                            </a:effectRef>
+                            <a:fontRef idx="minor">
+                              <a:schemeClr val="lt1"/>
+                            </a:fontRef>
+                          </wps:style>
+                          <wps:bodyPr rot="0" spcFirstLastPara="0" vertOverflow="overflow" horzOverflow="overflow" vert="horz" wrap="square" lIns="91440" tIns="45720" rIns="91440" bIns="45720" numCol="1" spcCol="0" rtlCol="0" fromWordArt="0" anchor="ctr" anchorCtr="0" forceAA="0" compatLnSpc="1">
+                            <a:prstTxWarp prst="textNoShape">
+                              <a:avLst/>
+                            </a:prstTxWarp>
+                            <a:noAutofit/>
+                          </wps:bodyPr>
+                        </wps:wsp>
+                      </wpg:grpSp>
+                      <wpg:grpSp>
+                        <wpg:cNvPr id="263" name="Group 263"/>
+                        <wpg:cNvGrpSpPr/>
+                        <wpg:grpSpPr>
+                          <a:xfrm>
+                            <a:off x="25400" y="88900"/>
+                            <a:ext cx="4533900" cy="1898015"/>
+                            <a:chOff x="0" y="0"/>
+                            <a:chExt cx="4533900" cy="1898015"/>
+                          </a:xfrm>
+                        </wpg:grpSpPr>
+                        <wps:wsp>
+                          <wps:cNvPr id="247" name="Text Box 2"/>
+                          <wps:cNvSpPr txBox="1">
+                            <a:spLocks noChangeArrowheads="1"/>
+                          </wps:cNvSpPr>
+                          <wps:spPr bwMode="auto">
+                            <a:xfrm>
+                              <a:off x="0" y="209550"/>
+                              <a:ext cx="774700" cy="231140"/>
+                            </a:xfrm>
+                            <a:prstGeom prst="rect">
+                              <a:avLst/>
+                            </a:prstGeom>
+                            <a:noFill/>
+                            <a:ln>
+                              <a:noFill/>
+                              <a:headEnd/>
+                              <a:tailEnd/>
+                            </a:ln>
+                          </wps:spPr>
+                          <wps:style>
+                            <a:lnRef idx="2">
+                              <a:schemeClr val="dk1"/>
+                            </a:lnRef>
+                            <a:fillRef idx="1">
+                              <a:schemeClr val="lt1"/>
+                            </a:fillRef>
+                            <a:effectRef idx="0">
+                              <a:schemeClr val="dk1"/>
+                            </a:effectRef>
+                            <a:fontRef idx="minor">
+                              <a:schemeClr val="dk1"/>
+                            </a:fontRef>
+                          </wps:style>
+                          <wps:txbx>
+                            <w:txbxContent>
+                              <w:p>
+                                <w:pPr>
+                                  <w:rPr>
+                                    <w:color w:val="C00000"/>
+                                    <w:sz w:val="14"/>
+                                  </w:rPr>
+                                </w:pPr>
+                                <w:r>
+                                  <w:rPr>
+                                    <w:color w:val="C00000"/>
+                                    <w:sz w:val="14"/>
+                                  </w:rPr>
+                                  <w:t>S</w:t>
+                                </w:r>
+                                <w:r>
+                                  <w:rPr>
+                                    <w:color w:val="C00000"/>
+                                    <w:sz w:val="14"/>
+                                  </w:rPr>
+                                  <w:t>elect a</w:t>
+                                </w:r>
+                                <w:r>
+                                  <w:rPr>
+                                    <w:color w:val="C00000"/>
+                                    <w:sz w:val="14"/>
+                                  </w:rPr>
+                                  <w:t xml:space="preserve"> </w:t>
+                                </w:r>
+                                <w:r>
+                                  <w:rPr>
+                                    <w:color w:val="C00000"/>
+                                    <w:sz w:val="14"/>
+                                  </w:rPr>
+                                  <w:t>d</w:t>
+                                </w:r>
+                                <w:r>
+                                  <w:rPr>
+                                    <w:color w:val="C00000"/>
+                                    <w:sz w:val="14"/>
+                                  </w:rPr>
+                                  <w:t>ata source</w:t>
+                                </w:r>
+                              </w:p>
+                            </w:txbxContent>
+                          </wps:txbx>
+                          <wps:bodyPr rot="0" vert="horz" wrap="square" lIns="0" tIns="0" rIns="0" bIns="0" anchor="t" anchorCtr="0">
+                            <a:spAutoFit/>
+                          </wps:bodyPr>
+                        </wps:wsp>
+                        <wps:wsp>
+                          <wps:cNvPr id="248" name="Text Box 2"/>
+                          <wps:cNvSpPr txBox="1">
+                            <a:spLocks noChangeArrowheads="1"/>
+                          </wps:cNvSpPr>
+                          <wps:spPr bwMode="auto">
+                            <a:xfrm>
+                              <a:off x="2108200" y="0"/>
+                              <a:ext cx="774700" cy="231140"/>
+                            </a:xfrm>
+                            <a:prstGeom prst="rect">
+                              <a:avLst/>
+                            </a:prstGeom>
+                            <a:noFill/>
+                            <a:ln>
+                              <a:noFill/>
+                              <a:headEnd/>
+                              <a:tailEnd/>
+                            </a:ln>
+                          </wps:spPr>
+                          <wps:style>
+                            <a:lnRef idx="2">
+                              <a:schemeClr val="dk1"/>
+                            </a:lnRef>
+                            <a:fillRef idx="1">
+                              <a:schemeClr val="lt1"/>
+                            </a:fillRef>
+                            <a:effectRef idx="0">
+                              <a:schemeClr val="dk1"/>
+                            </a:effectRef>
+                            <a:fontRef idx="minor">
+                              <a:schemeClr val="dk1"/>
+                            </a:fontRef>
+                          </wps:style>
+                          <wps:txbx>
+                            <w:txbxContent>
+                              <w:p>
+                                <w:pPr>
+                                  <w:rPr>
+                                    <w:color w:val="C00000"/>
+                                    <w:sz w:val="14"/>
+                                  </w:rPr>
+                                </w:pPr>
+                                <w:r>
+                                  <w:rPr>
+                                    <w:color w:val="C00000"/>
+                                    <w:sz w:val="14"/>
+                                  </w:rPr>
+                                  <w:t>Keywords for query</w:t>
+                                </w:r>
+                              </w:p>
+                            </w:txbxContent>
+                          </wps:txbx>
+                          <wps:bodyPr rot="0" vert="horz" wrap="square" lIns="0" tIns="0" rIns="0" bIns="0" anchor="t" anchorCtr="0">
+                            <a:spAutoFit/>
+                          </wps:bodyPr>
+                        </wps:wsp>
+                        <wps:wsp>
+                          <wps:cNvPr id="249" name="Text Box 2"/>
+                          <wps:cNvSpPr txBox="1">
+                            <a:spLocks noChangeArrowheads="1"/>
+                          </wps:cNvSpPr>
+                          <wps:spPr bwMode="auto">
+                            <a:xfrm>
+                              <a:off x="2165350" y="495300"/>
+                              <a:ext cx="2089150" cy="231140"/>
+                            </a:xfrm>
+                            <a:prstGeom prst="rect">
+                              <a:avLst/>
+                            </a:prstGeom>
+                            <a:noFill/>
+                            <a:ln>
+                              <a:noFill/>
+                              <a:headEnd/>
+                              <a:tailEnd/>
+                            </a:ln>
+                          </wps:spPr>
+                          <wps:style>
+                            <a:lnRef idx="2">
+                              <a:schemeClr val="dk1"/>
+                            </a:lnRef>
+                            <a:fillRef idx="1">
+                              <a:schemeClr val="lt1"/>
+                            </a:fillRef>
+                            <a:effectRef idx="0">
+                              <a:schemeClr val="dk1"/>
+                            </a:effectRef>
+                            <a:fontRef idx="minor">
+                              <a:schemeClr val="dk1"/>
+                            </a:fontRef>
+                          </wps:style>
+                          <wps:txbx>
+                            <w:txbxContent>
+                              <w:p>
+                                <w:pPr>
+                                  <w:rPr>
+                                    <w:color w:val="C00000"/>
+                                    <w:sz w:val="14"/>
+                                  </w:rPr>
+                                </w:pPr>
+                                <w:r>
+                                  <w:rPr>
+                                    <w:color w:val="C00000"/>
+                                    <w:sz w:val="14"/>
+                                  </w:rPr>
+                                  <w:t>Move the slider to set a maximum number of tweets</w:t>
+                                </w:r>
+                              </w:p>
+                            </w:txbxContent>
+                          </wps:txbx>
+                          <wps:bodyPr rot="0" vert="horz" wrap="square" lIns="0" tIns="0" rIns="0" bIns="0" anchor="t" anchorCtr="0">
+                            <a:spAutoFit/>
+                          </wps:bodyPr>
+                        </wps:wsp>
+                        <wps:wsp>
+                          <wps:cNvPr id="250" name="Text Box 2"/>
+                          <wps:cNvSpPr txBox="1">
+                            <a:spLocks noChangeArrowheads="1"/>
+                          </wps:cNvSpPr>
+                          <wps:spPr bwMode="auto">
+                            <a:xfrm>
+                              <a:off x="2444750" y="952500"/>
+                              <a:ext cx="2089150" cy="247015"/>
+                            </a:xfrm>
+                            <a:prstGeom prst="rect">
+                              <a:avLst/>
+                            </a:prstGeom>
+                            <a:noFill/>
+                            <a:ln>
+                              <a:noFill/>
+                              <a:headEnd/>
+                              <a:tailEnd/>
+                            </a:ln>
+                          </wps:spPr>
+                          <wps:style>
+                            <a:lnRef idx="2">
+                              <a:schemeClr val="dk1"/>
+                            </a:lnRef>
+                            <a:fillRef idx="1">
+                              <a:schemeClr val="lt1"/>
+                            </a:fillRef>
+                            <a:effectRef idx="0">
+                              <a:schemeClr val="dk1"/>
+                            </a:effectRef>
+                            <a:fontRef idx="minor">
+                              <a:schemeClr val="dk1"/>
+                            </a:fontRef>
+                          </wps:style>
+                          <wps:txbx>
+                            <w:txbxContent>
+                              <w:p>
+                                <w:pPr>
+                                  <w:spacing w:after="0"/>
+                                  <w:rPr>
+                                    <w:color w:val="C00000"/>
+                                    <w:sz w:val="14"/>
+                                  </w:rPr>
+                                </w:pPr>
+                                <w:r>
+                                  <w:rPr>
+                                    <w:color w:val="C00000"/>
+                                    <w:sz w:val="14"/>
+                                  </w:rPr>
+                                  <w:t>Date range with a fixed start date of 7 days ago</w:t>
+                                </w:r>
+                              </w:p>
+                              <w:p>
+                                <w:pPr>
+                                  <w:spacing w:after="0"/>
+                                  <w:rPr>
+                                    <w:color w:val="C00000"/>
+                                    <w:sz w:val="14"/>
+                                  </w:rPr>
+                                </w:pPr>
+                                <w:r>
+                                  <w:rPr>
+                                    <w:color w:val="C00000"/>
+                                    <w:sz w:val="14"/>
+                                  </w:rPr>
+                                  <w:t>Set an end date here</w:t>
+                                </w:r>
+                              </w:p>
+                            </w:txbxContent>
+                          </wps:txbx>
+                          <wps:bodyPr rot="0" vert="horz" wrap="square" lIns="0" tIns="0" rIns="0" bIns="0" anchor="t" anchorCtr="0">
+                            <a:spAutoFit/>
+                          </wps:bodyPr>
+                        </wps:wsp>
+                        <wps:wsp>
+                          <wps:cNvPr id="251" name="Text Box 2"/>
+                          <wps:cNvSpPr txBox="1">
+                            <a:spLocks noChangeArrowheads="1"/>
+                          </wps:cNvSpPr>
+                          <wps:spPr bwMode="auto">
+                            <a:xfrm>
+                              <a:off x="1835150" y="1549400"/>
+                              <a:ext cx="685800" cy="348615"/>
+                            </a:xfrm>
+                            <a:prstGeom prst="rect">
+                              <a:avLst/>
+                            </a:prstGeom>
+                            <a:noFill/>
+                            <a:ln>
+                              <a:noFill/>
+                              <a:headEnd/>
+                              <a:tailEnd/>
+                            </a:ln>
+                          </wps:spPr>
+                          <wps:style>
+                            <a:lnRef idx="2">
+                              <a:schemeClr val="dk1"/>
+                            </a:lnRef>
+                            <a:fillRef idx="1">
+                              <a:schemeClr val="lt1"/>
+                            </a:fillRef>
+                            <a:effectRef idx="0">
+                              <a:schemeClr val="dk1"/>
+                            </a:effectRef>
+                            <a:fontRef idx="minor">
+                              <a:schemeClr val="dk1"/>
+                            </a:fontRef>
+                          </wps:style>
+                          <wps:txbx>
+                            <w:txbxContent>
+                              <w:p>
+                                <w:pPr>
+                                  <w:rPr>
+                                    <w:color w:val="C00000"/>
+                                    <w:sz w:val="14"/>
+                                  </w:rPr>
+                                </w:pPr>
+                                <w:r>
+                                  <w:rPr>
+                                    <w:color w:val="C00000"/>
+                                    <w:sz w:val="14"/>
+                                  </w:rPr>
+                                  <w:t xml:space="preserve">Use Google map </w:t>
+                                </w:r>
+                                <w:r>
+                                  <w:rPr>
+                                    <w:color w:val="C00000"/>
+                                    <w:sz w:val="14"/>
+                                  </w:rPr>
+                                  <w:t>get geocode</w:t>
+                                </w:r>
+                                <w:r>
+                                  <w:rPr>
+                                    <w:color w:val="C00000"/>
+                                    <w:sz w:val="14"/>
+                                  </w:rPr>
+                                  <w:t xml:space="preserve"> </w:t>
+                                </w:r>
+                              </w:p>
+                            </w:txbxContent>
+                          </wps:txbx>
+                          <wps:bodyPr rot="0" vert="horz" wrap="square" lIns="0" tIns="0" rIns="0" bIns="0" anchor="t" anchorCtr="0">
+                            <a:spAutoFit/>
+                          </wps:bodyPr>
+                        </wps:wsp>
+                      </wpg:grpSp>
+                    </wpg:wgp>
+                  </a:graphicData>
+                </a:graphic>
+              </wp:inline>
+            </w:drawing>
+          </mc:Choice>
+          <mc:Fallback>
+            <w:pict>
+              <v:group w14:anchorId="41B4ED8E" id="Group 264" o:spid="_x0000_s1071" style="width:384.85pt;height:311.8pt;mso-position-horizontal-relative:char;mso-position-vertical-relative:line" coordsize="48875,39598" o:gfxdata="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">
+                <v:group id="Group 246" o:spid="_x0000_s1072" style="position:absolute;width:48875;height:39598" coordsize="48875,39598" o:gfxdata="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">
+                  <v:shape id="Picture 237" o:spid="_x0000_s1073" type="#_x0000_t75" style="position:absolute;width:48875;height:39598;visibility:visible;mso-wrap-style:square" o:gfxdata="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">
+                    <v:imagedata r:id="rId20" o:title=""/>
+                    <v:path arrowok="t"/>
+                  </v:shape>
+                  <v:rect id="Rectangle 241" o:spid="_x0000_s1074" style="position:absolute;left:254;top:381;width:5969;height:2286;visibility:visible;mso-wrap-style:square;v-text-anchor:middle" o:gfxdata="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" filled="f" strokecolor="#c00000" strokeweight="1.5pt"/>
+                  <v:rect id="Rectangle 242" o:spid="_x0000_s1075" style="position:absolute;left:10731;top:317;width:10033;height:2350;visibility:visible;mso-wrap-style:square;v-text-anchor:middle" o:gfxdata="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" filled="f" strokecolor="#c00000" strokeweight="1.5pt"/>
+                  <v:rect id="Rectangle 243" o:spid="_x0000_s1076" style="position:absolute;left:12192;top:4572;width:35306;height:2921;visibility:visible;mso-wrap-style:square;v-text-anchor:middle" o:gfxdata="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" filled="f" strokecolor="#c00000" strokeweight="1.5pt"/>
+                  <v:rect id="Rectangle 244" o:spid="_x0000_s1077" style="position:absolute;left:14541;top:9525;width:31750;height:3873;visibility:visible;mso-wrap-style:square;v-text-anchor:middle" o:gfxdata="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" filled="f" strokecolor="#c00000" strokeweight="1.5pt"/>
+                  <v:rect id="Rectangle 245" o:spid="_x0000_s1078" style="position:absolute;left:12509;top:15811;width:35179;height:3493;visibility:visible;mso-wrap-style:square;v-text-anchor:middle" o:gfxdata="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" filled="f" strokecolor="#c00000" strokeweight="1.5pt"/>
+                </v:group>
+                <v:group id="Group 263" o:spid="_x0000_s1079" style="position:absolute;left:254;top:889;width:45339;height:18980" coordsize="45339,18980" o:gfxdata="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">
+                  <v:shape id="_x0000_s1080" type="#_x0000_t202" style="position:absolute;top:2095;width:7747;height:2311;visibility:visible;mso-wrap-style:square;v-text-anchor:top" o:gfxdata="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" filled="f" stroked="f" strokeweight="1pt">
+                    <v:textbox style="mso-fit-shape-to-text:t" inset="0,0,0,0">
+                      <w:txbxContent>
+                        <w:p>
+                          <w:pPr>
+                            <w:rPr>
+                              <w:color w:val="C00000"/>
+                              <w:sz w:val="14"/>
+                            </w:rPr>
+                          </w:pPr>
+                          <w:r>
+                            <w:rPr>
+                              <w:color w:val="C00000"/>
+                              <w:sz w:val="14"/>
+                            </w:rPr>
+                            <w:t>S</w:t>
+                          </w:r>
+                          <w:r>
+                            <w:rPr>
+                              <w:color w:val="C00000"/>
+                              <w:sz w:val="14"/>
+                            </w:rPr>
+                            <w:t>elect a</w:t>
+                          </w:r>
+                          <w:r>
+                            <w:rPr>
+                              <w:color w:val="C00000"/>
+                              <w:sz w:val="14"/>
+                            </w:rPr>
+                            <w:t xml:space="preserve"> </w:t>
+                          </w:r>
+                          <w:r>
+                            <w:rPr>
+                              <w:color w:val="C00000"/>
+                              <w:sz w:val="14"/>
+                            </w:rPr>
+                            <w:t>d</w:t>
+                          </w:r>
+                          <w:r>
+                            <w:rPr>
+                              <w:color w:val="C00000"/>
+                              <w:sz w:val="14"/>
+                            </w:rPr>
+                            <w:t>ata source</w:t>
+                          </w:r>
+                        </w:p>
+                      </w:txbxContent>
+                    </v:textbox>
+                  </v:shape>
+                  <v:shape id="_x0000_s1081" type="#_x0000_t202" style="position:absolute;left:21082;width:7747;height:2311;visibility:visible;mso-wrap-style:square;v-text-anchor:top" o:gfxdata="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" filled="f" stroked="f" strokeweight="1pt">
+                    <v:textbox style="mso-fit-shape-to-text:t" inset="0,0,0,0">
+                      <w:txbxContent>
+                        <w:p>
+                          <w:pPr>
+                            <w:rPr>
+                              <w:color w:val="C00000"/>
+                              <w:sz w:val="14"/>
+                            </w:rPr>
+                          </w:pPr>
+                          <w:r>
+                            <w:rPr>
+                              <w:color w:val="C00000"/>
+                              <w:sz w:val="14"/>
+                            </w:rPr>
+                            <w:t>Keywords for query</w:t>
+                          </w:r>
+                        </w:p>
+                      </w:txbxContent>
+                    </v:textbox>
+                  </v:shape>
+                  <v:shape id="_x0000_s1082" type="#_x0000_t202" style="position:absolute;left:21653;top:4953;width:20892;height:2311;visibility:visible;mso-wrap-style:square;v-text-anchor:top" o:gfxdata="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" filled="f" stroked="f" strokeweight="1pt">
+                    <v:textbox style="mso-fit-shape-to-text:t" inset="0,0,0,0">
+                      <w:txbxContent>
+                        <w:p>
+                          <w:pPr>
+                            <w:rPr>
+                              <w:color w:val="C00000"/>
+                              <w:sz w:val="14"/>
+                            </w:rPr>
+                          </w:pPr>
+                          <w:r>
+                            <w:rPr>
+                              <w:color w:val="C00000"/>
+                              <w:sz w:val="14"/>
+                            </w:rPr>
+                            <w:t>Move the slider to set a maximum number of tweets</w:t>
+                          </w:r>
+                        </w:p>
+                      </w:txbxContent>
+                    </v:textbox>
+                  </v:shape>
+                  <v:shape id="_x0000_s1083" type="#_x0000_t202" style="position:absolute;left:24447;top:9525;width:20892;height:2470;visibility:visible;mso-wrap-style:square;v-text-anchor:top" o:gfxdata="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" filled="f" stroked="f" strokeweight="1pt">
+                    <v:textbox style="mso-fit-shape-to-text:t" inset="0,0,0,0">
+                      <w:txbxContent>
+                        <w:p>
+                          <w:pPr>
+                            <w:spacing w:after="0"/>
+                            <w:rPr>
+                              <w:color w:val="C00000"/>
+                              <w:sz w:val="14"/>
+                            </w:rPr>
+                          </w:pPr>
+                          <w:r>
+                            <w:rPr>
+                              <w:color w:val="C00000"/>
+                              <w:sz w:val="14"/>
+                            </w:rPr>
+                            <w:t>Date range with a fixed start date of 7 days ago</w:t>
+                          </w:r>
+                        </w:p>
+                        <w:p>
+                          <w:pPr>
+                            <w:spacing w:after="0"/>
+                            <w:rPr>
+                              <w:color w:val="C00000"/>
+                              <w:sz w:val="14"/>
+                            </w:rPr>
+                          </w:pPr>
+                          <w:r>
+                            <w:rPr>
+                              <w:color w:val="C00000"/>
+                              <w:sz w:val="14"/>
+                            </w:rPr>
+                            <w:t>Set an end date here</w:t>
+                          </w:r>
+                        </w:p>
+                      </w:txbxContent>
+                    </v:textbox>
+                  </v:shape>
+                  <v:shape id="_x0000_s1084" type="#_x0000_t202" style="position:absolute;left:18351;top:15494;width:6858;height:3486;visibility:visible;mso-wrap-style:square;v-text-anchor:top" o:gfxdata="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" filled="f" stroked="f" strokeweight="1pt">
+                    <v:textbox style="mso-fit-shape-to-text:t" inset="0,0,0,0">
+                      <w:txbxContent>
+                        <w:p>
+                          <w:pPr>
+                            <w:rPr>
+                              <w:color w:val="C00000"/>
+                              <w:sz w:val="14"/>
+                            </w:rPr>
+                          </w:pPr>
+                          <w:r>
+                            <w:rPr>
+                              <w:color w:val="C00000"/>
+                              <w:sz w:val="14"/>
+                            </w:rPr>
+                            <w:t xml:space="preserve">Use Google map </w:t>
+                          </w:r>
+                          <w:r>
+                            <w:rPr>
+                              <w:color w:val="C00000"/>
+                              <w:sz w:val="14"/>
+                            </w:rPr>
+                            <w:t>get geocode</w:t>
+                          </w:r>
+                          <w:r>
+                            <w:rPr>
+                              <w:color w:val="C00000"/>
+                              <w:sz w:val="14"/>
+                            </w:rPr>
+                            <w:t xml:space="preserve"> </w:t>
+                          </w:r>
+                        </w:p>
+                      </w:txbxContent>
+                    </v:textbox>
+                  </v:shape>
+                </v:group>
+                <w10:anchorlock/>
+              </v:group>
+            </w:pict>
+          </mc:Fallback>
+        </mc:AlternateContent>
+      </w:r>
+    </w:p>
+    <w:p>
+      <w:pPr>
         <w:ind w:left="360"/>
-        <w:rPr>
-          <w:rFonts w:asciiTheme="majorHAnsi" w:hAnsiTheme="majorHAnsi"/>
-        </w:rPr>
-      </w:pPr>
-      <w:r>
-        <w:rPr>
-          <w:rFonts w:asciiTheme="majorHAnsi" w:hAnsiTheme="majorHAnsi"/>
+        <w:jc w:val="center"/>
+        <w:rPr>
+          <w:rFonts w:asciiTheme="majorHAnsi" w:hAnsiTheme="majorHAnsi"/>
+          <w:sz w:val="20"/>
+        </w:rPr>
+      </w:pPr>
+      <w:r>
+        <w:rPr>
+          <w:noProof/>
+          <w:sz w:val="20"/>
+        </w:rPr>
+        <w:lastRenderedPageBreak/>
+        <mc:AlternateContent>
+          <mc:Choice Requires="wps">
+            <w:drawing>
+              <wp:anchor distT="0" distB="0" distL="114300" distR="114300" simplePos="0" relativeHeight="251737088" behindDoc="0" locked="0" layoutInCell="1" allowOverlap="1" wp14:anchorId="717212D6" wp14:editId="404995CD">
+                <wp:simplePos x="0" y="0"/>
+                <wp:positionH relativeFrom="column">
+                  <wp:posOffset>1301750</wp:posOffset>
+                </wp:positionH>
+                <wp:positionV relativeFrom="paragraph">
+                  <wp:posOffset>2359660</wp:posOffset>
+                </wp:positionV>
+                <wp:extent cx="1016000" cy="348615"/>
+                <wp:effectExtent l="0" t="0" r="0" b="0"/>
+                <wp:wrapNone/>
+                <wp:docPr id="266" name="Text Box 2"/>
+                <wp:cNvGraphicFramePr>
+                  <a:graphicFrameLocks xmlns:a="http://schemas.openxmlformats.org/drawingml/2006/main"/>
+                </wp:cNvGraphicFramePr>
+                <a:graphic xmlns:a="http://schemas.openxmlformats.org/drawingml/2006/main">
+                  <a:graphicData uri="http://schemas.microsoft.com/office/word/2010/wordprocessingShape">
+                    <wps:wsp>
+                      <wps:cNvSpPr txBox="1">
+                        <a:spLocks noChangeArrowheads="1"/>
+                      </wps:cNvSpPr>
+                      <wps:spPr bwMode="auto">
+                        <a:xfrm>
+                          <a:off x="0" y="0"/>
+                          <a:ext cx="1016000" cy="348615"/>
+                        </a:xfrm>
+                        <a:prstGeom prst="rect">
+                          <a:avLst/>
+                        </a:prstGeom>
+                        <a:noFill/>
+                        <a:ln>
+                          <a:noFill/>
+                          <a:headEnd/>
+                          <a:tailEnd/>
+                        </a:ln>
+                      </wps:spPr>
+                      <wps:style>
+                        <a:lnRef idx="2">
+                          <a:schemeClr val="dk1"/>
+                        </a:lnRef>
+                        <a:fillRef idx="1">
+                          <a:schemeClr val="lt1"/>
+                        </a:fillRef>
+                        <a:effectRef idx="0">
+                          <a:schemeClr val="dk1"/>
+                        </a:effectRef>
+                        <a:fontRef idx="minor">
+                          <a:schemeClr val="dk1"/>
+                        </a:fontRef>
+                      </wps:style>
+                      <wps:txbx>
+                        <w:txbxContent>
+                          <w:p>
+                            <w:pPr>
+                              <w:rPr>
+                                <w:color w:val="C00000"/>
+                                <w:sz w:val="14"/>
+                              </w:rPr>
+                            </w:pPr>
+                            <w:r>
+                              <w:rPr>
+                                <w:color w:val="C00000"/>
+                                <w:sz w:val="14"/>
+                              </w:rPr>
+                              <w:t xml:space="preserve">Select the fields you want </w:t>
+                            </w:r>
+                          </w:p>
+                        </w:txbxContent>
+                      </wps:txbx>
+                      <wps:bodyPr rot="0" vert="horz" wrap="square" lIns="0" tIns="0" rIns="0" bIns="0" anchor="t" anchorCtr="0">
+                        <a:spAutoFit/>
+                      </wps:bodyPr>
+                    </wps:wsp>
+                  </a:graphicData>
+                </a:graphic>
+                <wp14:sizeRelH relativeFrom="margin">
+                  <wp14:pctWidth>0</wp14:pctWidth>
+                </wp14:sizeRelH>
+              </wp:anchor>
+            </w:drawing>
+          </mc:Choice>
+          <mc:Fallback>
+            <w:pict>
+              <v:shape w14:anchorId="717212D6" id="Text Box 2" o:spid="_x0000_s1085" type="#_x0000_t202" style="position:absolute;left:0;text-align:left;margin-left:102.5pt;margin-top:185.8pt;width:80pt;height:27.45pt;z-index:251737088;visibility:visible;mso-wrap-style:square;mso-width-percent:0;mso-wrap-distance-left:9pt;mso-wrap-distance-top:0;mso-wrap-distance-right:9pt;mso-wrap-distance-bottom:0;mso-position-horizontal:absolute;mso-position-horizontal-relative:text;mso-position-vertical:absolute;mso-position-vertical-relative:text;mso-width-percent:0;mso-width-relative:margin;v-text-anchor:top" o:gfxdata="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" filled="f" stroked="f" strokeweight="1pt">
+                <v:textbox style="mso-fit-shape-to-text:t" inset="0,0,0,0">
+                  <w:txbxContent>
+                    <w:p>
+                      <w:pPr>
+                        <w:rPr>
+                          <w:color w:val="C00000"/>
+                          <w:sz w:val="14"/>
+                        </w:rPr>
+                      </w:pPr>
+                      <w:r>
+                        <w:rPr>
+                          <w:color w:val="C00000"/>
+                          <w:sz w:val="14"/>
+                        </w:rPr>
+                        <w:t xml:space="preserve">Select the fields you want </w:t>
+                      </w:r>
+                    </w:p>
+                  </w:txbxContent>
+                </v:textbox>
+              </v:shape>
+            </w:pict>
+          </mc:Fallback>
+        </mc:AlternateContent>
+      </w:r>
+      <w:r>
+        <w:rPr>
+          <w:noProof/>
+          <w:sz w:val="20"/>
+        </w:rPr>
+        <mc:AlternateContent>
+          <mc:Choice Requires="wps">
+            <w:drawing>
+              <wp:anchor distT="0" distB="0" distL="114300" distR="114300" simplePos="0" relativeHeight="251735040" behindDoc="0" locked="0" layoutInCell="1" allowOverlap="1" wp14:anchorId="76A9547C" wp14:editId="591AFECC">
+                <wp:simplePos x="0" y="0"/>
+                <wp:positionH relativeFrom="column">
+                  <wp:posOffset>1066800</wp:posOffset>
+                </wp:positionH>
+                <wp:positionV relativeFrom="paragraph">
+                  <wp:posOffset>2241550</wp:posOffset>
+                </wp:positionV>
+                <wp:extent cx="3517900" cy="349250"/>
+                <wp:effectExtent l="0" t="0" r="0" b="0"/>
+                <wp:wrapNone/>
+                <wp:docPr id="265" name="Rectangle 265"/>
+                <wp:cNvGraphicFramePr/>
+                <a:graphic xmlns:a="http://schemas.openxmlformats.org/drawingml/2006/main">
+                  <a:graphicData uri="http://schemas.microsoft.com/office/word/2010/wordprocessingShape">
+                    <wps:wsp>
+                      <wps:cNvSpPr/>
+                      <wps:spPr>
+                        <a:xfrm>
+                          <a:off x="0" y="0"/>
+                          <a:ext cx="3517900" cy="349250"/>
+                        </a:xfrm>
+                        <a:prstGeom prst="rect">
+                          <a:avLst/>
+                        </a:prstGeom>
+                        <a:noFill/>
+                        <a:ln w="19050">
+                          <a:solidFill>
+                            <a:srgbClr val="C00000"/>
+                          </a:solidFill>
+                        </a:ln>
+                      </wps:spPr>
+                      <wps:style>
+                        <a:lnRef idx="2">
+                          <a:schemeClr val="accent1">
+                            <a:shade val="50000"/>
+                          </a:schemeClr>
+                        </a:lnRef>
+                        <a:fillRef idx="1">
+                          <a:schemeClr val="accent1"/>
+                        </a:fillRef>
+                        <a:effectRef idx="0">
+                          <a:schemeClr val="accent1"/>
+                        </a:effectRef>
+                        <a:fontRef idx="minor">
+                          <a:schemeClr val="lt1"/>
+                        </a:fontRef>
+                      </wps:style>
+                      <wps:bodyPr rot="0" spcFirstLastPara="0" vertOverflow="overflow" horzOverflow="overflow" vert="horz" wrap="square" lIns="91440" tIns="45720" rIns="91440" bIns="45720" numCol="1" spcCol="0" rtlCol="0" fromWordArt="0" anchor="ctr" anchorCtr="0" forceAA="0" compatLnSpc="1">
+                        <a:prstTxWarp prst="textNoShape">
+                          <a:avLst/>
+                        </a:prstTxWarp>
+                        <a:noAutofit/>
+                      </wps:bodyPr>
+                    </wps:wsp>
+                  </a:graphicData>
+                </a:graphic>
+              </wp:anchor>
+            </w:drawing>
+          </mc:Choice>
+          <mc:Fallback>
+            <w:pict>
+              <v:rect w14:anchorId="1125B6DD" id="Rectangle 265" o:spid="_x0000_s1026" style="position:absolute;margin-left:84pt;margin-top:176.5pt;width:277pt;height:27.5pt;z-index:251735040;visibility:visible;mso-wrap-style:square;mso-wrap-distance-left:9pt;mso-wrap-distance-top:0;mso-wrap-distance-right:9pt;mso-wrap-distance-bottom:0;mso-position-horizontal:absolute;mso-position-horizontal-relative:text;mso-position-vertical:absolute;mso-position-vertical-relative:text;v-text-anchor:middle" o:gfxdata="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" filled="f" strokecolor="#c00000" strokeweight="1.5pt"/>
+            </w:pict>
+          </mc:Fallback>
+        </mc:AlternateContent>
+      </w:r>
+      <w:r>
+        <w:rPr>
+          <w:noProof/>
+          <w:sz w:val="20"/>
+        </w:rPr>
+        <w:drawing>
+          <wp:inline distT="0" distB="0" distL="0" distR="0">
+            <wp:extent cx="5241083" cy="2578100"/>
+            <wp:effectExtent l="0" t="0" r="0" b="0"/>
+            <wp:docPr id="239" name="Picture 239"/>
+            <wp:cNvGraphicFramePr>
+              <a:graphicFrameLocks xmlns:a="http://schemas.openxmlformats.org/drawingml/2006/main" noChangeAspect="1"/>
+            </wp:cNvGraphicFramePr>
+            <a:graphic xmlns:a="http://schemas.openxmlformats.org/drawingml/2006/main">
+              <a:graphicData uri="http://schemas.openxmlformats.org/drawingml/2006/picture">
+                <pic:pic xmlns:pic="http://schemas.openxmlformats.org/drawingml/2006/picture">
+                  <pic:nvPicPr>
+                    <pic:cNvPr id="1" name=""/>
+                    <pic:cNvPicPr/>
+                  </pic:nvPicPr>
+                  <pic:blipFill>
+                    <a:blip r:embed="rId21">
+                      <a:extLst>
+                        <a:ext uri="{28A0092B-C50C-407E-A947-70E740481C1C}">
+                          <a14:useLocalDpi xmlns:a14="http://schemas.microsoft.com/office/drawing/2010/main" val="0"/>
+                        </a:ext>
+                      </a:extLst>
+                    </a:blip>
+                    <a:stretch>
+                      <a:fillRect/>
+                    </a:stretch>
+                  </pic:blipFill>
+                  <pic:spPr>
+                    <a:xfrm>
+                      <a:off x="0" y="0"/>
+                      <a:ext cx="5247893" cy="2581450"/>
+                    </a:xfrm>
+                    <a:prstGeom prst="rect">
+                      <a:avLst/>
+                    </a:prstGeom>
+                  </pic:spPr>
+                </pic:pic>
+              </a:graphicData>
+            </a:graphic>
+          </wp:inline>
+        </w:drawing>
+      </w:r>
+    </w:p>
+    <w:p>
+      <w:pPr>
+        <w:ind w:left="360"/>
+        <w:jc w:val="center"/>
+        <w:rPr>
+          <w:rFonts w:asciiTheme="majorHAnsi" w:hAnsiTheme="majorHAnsi"/>
+          <w:sz w:val="20"/>
+        </w:rPr>
+      </w:pPr>
+      <w:r>
+        <w:rPr>
+          <w:rFonts w:asciiTheme="majorHAnsi" w:hAnsiTheme="majorHAnsi"/>
+          <w:b/>
+          <w:sz w:val="20"/>
+        </w:rPr>
+        <w:t>Figure 4.</w:t>
+      </w:r>
+      <w:r>
+        <w:rPr>
+          <w:rFonts w:asciiTheme="majorHAnsi" w:hAnsiTheme="majorHAnsi"/>
+          <w:sz w:val="20"/>
+        </w:rPr>
+        <w:t xml:space="preserve"> The advanced setting for the search interface of the SMILE</w:t>
+      </w:r>
+    </w:p>
+    <w:p>
+      <w:pPr>
+        <w:pStyle w:val="ListParagraph"/>
+        <w:ind w:left="360"/>
+        <w:rPr>
+          <w:rFonts w:asciiTheme="majorHAnsi" w:hAnsiTheme="majorHAnsi"/>
+          <w:sz w:val="20"/>
+        </w:rPr>
+      </w:pPr>
+      <w:r>
+        <w:rPr>
+          <w:rFonts w:asciiTheme="majorHAnsi" w:hAnsiTheme="majorHAnsi"/>
+          <w:sz w:val="20"/>
         </w:rPr>
         <w:t xml:space="preserve">It is </w:t>
       </w:r>
       <w:r>
         <w:rPr>
           <w:rFonts w:asciiTheme="majorHAnsi" w:hAnsiTheme="majorHAnsi"/>
+          <w:sz w:val="20"/>
         </w:rPr>
         <w:t xml:space="preserve">important to know that the Search API </w:t>
       </w:r>
       <w:r>
         <w:rPr>
           <w:rFonts w:asciiTheme="majorHAnsi" w:hAnsiTheme="majorHAnsi"/>
+          <w:sz w:val="20"/>
           <w:u w:val="dotted"/>
         </w:rPr>
         <w:t>is focused on relevance and not completeness</w:t>
@@ -3566,27 +5289,184 @@
       <w:r>
         <w:rPr>
           <w:rFonts w:asciiTheme="majorHAnsi" w:hAnsiTheme="majorHAnsi"/>
+          <w:sz w:val="20"/>
         </w:rPr>
         <w:t xml:space="preserve">. This means that some Tweets and users may be missing from search results. If you want to match for completeness you should consider </w:t>
       </w:r>
       <w:r>
         <w:rPr>
           <w:rFonts w:asciiTheme="majorHAnsi" w:hAnsiTheme="majorHAnsi"/>
-        </w:rPr>
-        <w:t>searching against our archived twitter streaming data</w:t>
-      </w:r>
-      <w:r>
-        <w:rPr>
-          <w:rFonts w:asciiTheme="majorHAnsi" w:hAnsiTheme="majorHAnsi"/>
+          <w:sz w:val="20"/>
+        </w:rPr>
+        <w:t xml:space="preserve">searching against our archived streaming </w:t>
+      </w:r>
+      <w:r>
+        <w:rPr>
+          <w:rFonts w:asciiTheme="majorHAnsi" w:hAnsiTheme="majorHAnsi"/>
+          <w:sz w:val="20"/>
+        </w:rPr>
+        <w:t>tweets</w:t>
+      </w:r>
+      <w:r>
+        <w:rPr>
+          <w:noProof/>
+          <w:sz w:val="20"/>
+        </w:rPr>
+        <w:drawing>
+          <wp:inline distT="0" distB="0" distL="0" distR="0" wp14:anchorId="306A69D1" wp14:editId="1B44527B">
+            <wp:extent cx="1231900" cy="212585"/>
+            <wp:effectExtent l="0" t="0" r="6350" b="0"/>
+            <wp:docPr id="269" name="Picture 269"/>
+            <wp:cNvGraphicFramePr>
+              <a:graphicFrameLocks xmlns:a="http://schemas.openxmlformats.org/drawingml/2006/main" noChangeAspect="1"/>
+            </wp:cNvGraphicFramePr>
+            <a:graphic xmlns:a="http://schemas.openxmlformats.org/drawingml/2006/main">
+              <a:graphicData uri="http://schemas.openxmlformats.org/drawingml/2006/picture">
+                <pic:pic xmlns:pic="http://schemas.openxmlformats.org/drawingml/2006/picture">
+                  <pic:nvPicPr>
+                    <pic:cNvPr id="1" name=""/>
+                    <pic:cNvPicPr/>
+                  </pic:nvPicPr>
+                  <pic:blipFill>
+                    <a:blip r:embed="rId22"/>
+                    <a:stretch>
+                      <a:fillRect/>
+                    </a:stretch>
+                  </pic:blipFill>
+                  <pic:spPr>
+                    <a:xfrm>
+                      <a:off x="0" y="0"/>
+                      <a:ext cx="1321454" cy="228039"/>
+                    </a:xfrm>
+                    <a:prstGeom prst="rect">
+                      <a:avLst/>
+                    </a:prstGeom>
+                  </pic:spPr>
+                </pic:pic>
+              </a:graphicData>
+            </a:graphic>
+          </wp:inline>
+        </w:drawing>
+      </w:r>
+      <w:r>
+        <w:rPr>
+          <w:rFonts w:asciiTheme="majorHAnsi" w:hAnsiTheme="majorHAnsi"/>
+          <w:sz w:val="20"/>
         </w:rPr>
         <w:t>.</w:t>
       </w:r>
-      <w:r>
-        <w:rPr>
-          <w:rFonts w:asciiTheme="majorHAnsi" w:hAnsiTheme="majorHAnsi"/>
-        </w:rPr>
-        <w:t xml:space="preserve"> </w:t>
-      </w:r>
+    </w:p>
+    <w:p>
+      <w:pPr>
+        <w:pStyle w:val="ListParagraph"/>
+        <w:ind w:left="360"/>
+        <w:rPr>
+          <w:rFonts w:asciiTheme="majorHAnsi" w:hAnsiTheme="majorHAnsi"/>
+          <w:sz w:val="20"/>
+        </w:rPr>
+      </w:pPr>
+    </w:p>
+    <w:p>
+      <w:pPr>
+        <w:pStyle w:val="ListParagraph"/>
+        <w:ind w:left="360"/>
+        <w:rPr>
+          <w:rFonts w:asciiTheme="majorHAnsi" w:hAnsiTheme="majorHAnsi"/>
+          <w:sz w:val="20"/>
+        </w:rPr>
+      </w:pPr>
+      <w:r>
+        <w:rPr>
+          <w:rFonts w:asciiTheme="majorHAnsi" w:hAnsiTheme="majorHAnsi"/>
+          <w:sz w:val="20"/>
+        </w:rPr>
+        <w:t xml:space="preserve">Another thing worth noticing is, </w:t>
+      </w:r>
+      <w:r>
+        <w:rPr>
+          <w:rFonts w:asciiTheme="majorHAnsi" w:hAnsiTheme="majorHAnsi"/>
+          <w:sz w:val="20"/>
+        </w:rPr>
+        <w:t>if you set the maximum number of tweets to a big number, you’re risking to have rate limit</w:t>
+      </w:r>
+      <w:r>
+        <w:rPr>
+          <w:rFonts w:asciiTheme="majorHAnsi" w:hAnsiTheme="majorHAnsi"/>
+          <w:sz w:val="20"/>
+        </w:rPr>
+        <w:t>ing</w:t>
+      </w:r>
+      <w:r>
+        <w:rPr>
+          <w:rStyle w:val="FootnoteReference"/>
+          <w:rFonts w:asciiTheme="majorHAnsi" w:hAnsiTheme="majorHAnsi"/>
+          <w:sz w:val="20"/>
+        </w:rPr>
+        <w:footnoteReference w:id="7"/>
+      </w:r>
+      <w:r>
+        <w:rPr>
+          <w:rFonts w:asciiTheme="majorHAnsi" w:hAnsiTheme="majorHAnsi"/>
+          <w:sz w:val="20"/>
+        </w:rPr>
+        <w:t>. Twitter’s rate limit</w:t>
+      </w:r>
+      <w:r>
+        <w:rPr>
+          <w:rFonts w:asciiTheme="majorHAnsi" w:hAnsiTheme="majorHAnsi"/>
+          <w:sz w:val="20"/>
+        </w:rPr>
+        <w:t>ing</w:t>
+      </w:r>
+      <w:r>
+        <w:rPr>
+          <w:rFonts w:asciiTheme="majorHAnsi" w:hAnsiTheme="majorHAnsi"/>
+          <w:sz w:val="20"/>
+        </w:rPr>
+        <w:t xml:space="preserve"> policy determines that a maximum of 180 requests can be sent with any 15-minutes window. For each request, the maximum number of returned tweets is 100. In another word, </w:t>
+      </w:r>
+      <w:r>
+        <w:rPr>
+          <w:rFonts w:asciiTheme="majorHAnsi" w:hAnsiTheme="majorHAnsi"/>
+          <w:sz w:val="20"/>
+          <w:u w:val="dotted"/>
+        </w:rPr>
+        <w:t>you can only get 100 × 180 = 18000 tweets every 15 minutes</w:t>
+      </w:r>
+      <w:r>
+        <w:rPr>
+          <w:rFonts w:asciiTheme="majorHAnsi" w:hAnsiTheme="majorHAnsi"/>
+          <w:sz w:val="20"/>
+        </w:rPr>
+        <w:t>. An error will appear and you will not be able to get any data if you hit this rate limit</w:t>
+      </w:r>
+      <w:r>
+        <w:rPr>
+          <w:rFonts w:asciiTheme="majorHAnsi" w:hAnsiTheme="majorHAnsi"/>
+          <w:sz w:val="20"/>
+        </w:rPr>
+        <w:t xml:space="preserve">. </w:t>
+      </w:r>
+    </w:p>
+    <w:p>
+      <w:pPr>
+        <w:pStyle w:val="ListParagraph"/>
+        <w:ind w:left="360"/>
+        <w:rPr>
+          <w:rFonts w:asciiTheme="majorHAnsi" w:hAnsiTheme="majorHAnsi"/>
+          <w:sz w:val="20"/>
+        </w:rPr>
+      </w:pPr>
+    </w:p>
+    <w:p>
+      <w:pPr>
+        <w:pStyle w:val="ListParagraph"/>
+        <w:ind w:left="360"/>
+        <w:rPr>
+          <w:rFonts w:asciiTheme="majorHAnsi" w:hAnsiTheme="majorHAnsi"/>
+          <w:sz w:val="20"/>
+        </w:rPr>
+      </w:pPr>
     </w:p>
     <w:p>
       <w:pPr>
@@ -3597,14 +5477,447 @@
         </w:numPr>
         <w:rPr>
           <w:rFonts w:asciiTheme="majorHAnsi" w:hAnsiTheme="majorHAnsi"/>
-        </w:rPr>
-      </w:pPr>
-      <w:r>
-        <w:rPr>
-          <w:rFonts w:asciiTheme="majorHAnsi" w:hAnsiTheme="majorHAnsi"/>
+          <w:b/>
+          <w:sz w:val="20"/>
+        </w:rPr>
+      </w:pPr>
+      <w:r>
+        <w:rPr>
+          <w:rFonts w:asciiTheme="majorHAnsi" w:hAnsiTheme="majorHAnsi"/>
+          <w:b/>
+          <w:sz w:val="20"/>
         </w:rPr>
         <w:t>Search Users</w:t>
       </w:r>
+    </w:p>
+    <w:p>
+      <w:pPr>
+        <w:ind w:left="360"/>
+        <w:rPr>
+          <w:rFonts w:asciiTheme="majorHAnsi" w:hAnsiTheme="majorHAnsi"/>
+          <w:sz w:val="20"/>
+        </w:rPr>
+      </w:pPr>
+      <w:r>
+        <w:rPr>
+          <w:rFonts w:asciiTheme="majorHAnsi" w:hAnsiTheme="majorHAnsi"/>
+          <w:sz w:val="20"/>
+        </w:rPr>
+        <w:t xml:space="preserve">The endpoint </w:t>
+      </w:r>
+      <w:hyperlink r:id="rId23" w:history="1">
+        <w:r>
+          <w:rPr>
+            <w:rStyle w:val="Hyperlink"/>
+            <w:rFonts w:asciiTheme="majorHAnsi" w:hAnsiTheme="majorHAnsi"/>
+            <w:sz w:val="20"/>
+          </w:rPr>
+          <w:t>https://api.twitter.com/1.1/users/search.json</w:t>
+        </w:r>
+      </w:hyperlink>
+      <w:r>
+        <w:rPr>
+          <w:rStyle w:val="FootnoteReference"/>
+          <w:rFonts w:asciiTheme="majorHAnsi" w:hAnsiTheme="majorHAnsi"/>
+          <w:sz w:val="20"/>
+        </w:rPr>
+        <w:footnoteReference w:id="8"/>
+      </w:r>
+      <w:r>
+        <w:rPr>
+          <w:rFonts w:asciiTheme="majorHAnsi" w:hAnsiTheme="majorHAnsi"/>
+          <w:sz w:val="20"/>
+        </w:rPr>
+        <w:t xml:space="preserve"> p</w:t>
+      </w:r>
+      <w:r>
+        <w:rPr>
+          <w:rFonts w:asciiTheme="majorHAnsi" w:hAnsiTheme="majorHAnsi"/>
+          <w:sz w:val="20"/>
+        </w:rPr>
+        <w:t>rovides a simple, relevance-based search interface to public user accounts on Twitter. Try querying by topical interest, full name, company name, location, or other criteria. Exact match searches are not supported.</w:t>
+      </w:r>
+      <w:r>
+        <w:rPr>
+          <w:rFonts w:asciiTheme="majorHAnsi" w:hAnsiTheme="majorHAnsi"/>
+          <w:sz w:val="20"/>
+        </w:rPr>
+        <w:t xml:space="preserve"> </w:t>
+      </w:r>
+      <w:r>
+        <w:rPr>
+          <w:rFonts w:asciiTheme="majorHAnsi" w:hAnsiTheme="majorHAnsi"/>
+          <w:sz w:val="20"/>
+        </w:rPr>
+        <w:t>Only the first 1,000 matching results are available.</w:t>
+      </w:r>
+    </w:p>
+    <w:p>
+      <w:pPr>
+        <w:pStyle w:val="ListParagraph"/>
+        <w:ind w:left="360"/>
+        <w:rPr>
+          <w:rFonts w:asciiTheme="majorHAnsi" w:hAnsiTheme="majorHAnsi"/>
+          <w:sz w:val="20"/>
+        </w:rPr>
+      </w:pPr>
+      <w:r>
+        <w:rPr>
+          <w:rFonts w:asciiTheme="majorHAnsi" w:hAnsiTheme="majorHAnsi"/>
+          <w:sz w:val="20"/>
+        </w:rPr>
+        <w:t xml:space="preserve">When you hit the </w:t>
+      </w:r>
+      <w:r>
+        <w:rPr>
+          <w:noProof/>
+          <w:sz w:val="20"/>
+        </w:rPr>
+        <w:drawing>
+          <wp:inline distT="0" distB="0" distL="0" distR="0" wp14:anchorId="1B931C71" wp14:editId="75B6E9DF">
+            <wp:extent cx="714375" cy="213645"/>
+            <wp:effectExtent l="0" t="0" r="0" b="0"/>
+            <wp:docPr id="270" name="Picture 270"/>
+            <wp:cNvGraphicFramePr>
+              <a:graphicFrameLocks xmlns:a="http://schemas.openxmlformats.org/drawingml/2006/main" noChangeAspect="1"/>
+            </wp:cNvGraphicFramePr>
+            <a:graphic xmlns:a="http://schemas.openxmlformats.org/drawingml/2006/main">
+              <a:graphicData uri="http://schemas.openxmlformats.org/drawingml/2006/picture">
+                <pic:pic xmlns:pic="http://schemas.openxmlformats.org/drawingml/2006/picture">
+                  <pic:nvPicPr>
+                    <pic:cNvPr id="1" name=""/>
+                    <pic:cNvPicPr/>
+                  </pic:nvPicPr>
+                  <pic:blipFill>
+                    <a:blip r:embed="rId18"/>
+                    <a:stretch>
+                      <a:fillRect/>
+                    </a:stretch>
+                  </pic:blipFill>
+                  <pic:spPr>
+                    <a:xfrm>
+                      <a:off x="0" y="0"/>
+                      <a:ext cx="736577" cy="220285"/>
+                    </a:xfrm>
+                    <a:prstGeom prst="rect">
+                      <a:avLst/>
+                    </a:prstGeom>
+                  </pic:spPr>
+                </pic:pic>
+              </a:graphicData>
+            </a:graphic>
+          </wp:inline>
+        </w:drawing>
+      </w:r>
+      <w:r>
+        <w:rPr>
+          <w:rFonts w:asciiTheme="majorHAnsi" w:hAnsiTheme="majorHAnsi"/>
+          <w:sz w:val="20"/>
+        </w:rPr>
+        <w:t xml:space="preserve"> button, a dropdown list will appear with the following options:</w:t>
+      </w:r>
+    </w:p>
+    <w:p>
+      <w:pPr>
+        <w:pStyle w:val="ListParagraph"/>
+        <w:numPr>
+          <w:ilvl w:val="0"/>
+          <w:numId w:val="2"/>
+        </w:numPr>
+        <w:rPr>
+          <w:rFonts w:asciiTheme="majorHAnsi" w:hAnsiTheme="majorHAnsi"/>
+          <w:sz w:val="20"/>
+        </w:rPr>
+      </w:pPr>
+      <w:r>
+        <w:rPr>
+          <w:rFonts w:asciiTheme="majorHAnsi" w:hAnsiTheme="majorHAnsi"/>
+          <w:sz w:val="20"/>
+        </w:rPr>
+        <w:t>The search query to run against people search</w:t>
+      </w:r>
+      <w:r>
+        <w:rPr>
+          <w:rFonts w:asciiTheme="majorHAnsi" w:hAnsiTheme="majorHAnsi"/>
+          <w:sz w:val="20"/>
+        </w:rPr>
+        <w:t xml:space="preserve"> should be consist of </w:t>
+      </w:r>
+      <w:r>
+        <w:rPr>
+          <w:rFonts w:asciiTheme="majorHAnsi" w:hAnsiTheme="majorHAnsi"/>
+          <w:sz w:val="20"/>
+        </w:rPr>
+        <w:t>English keyword, phrases, numb</w:t>
+      </w:r>
+      <w:r>
+        <w:rPr>
+          <w:rFonts w:asciiTheme="majorHAnsi" w:hAnsiTheme="majorHAnsi"/>
+          <w:sz w:val="20"/>
+        </w:rPr>
+        <w:t>ers, and any combination of them</w:t>
+      </w:r>
+      <w:r>
+        <w:rPr>
+          <w:rFonts w:asciiTheme="majorHAnsi" w:hAnsiTheme="majorHAnsi"/>
+          <w:sz w:val="20"/>
+        </w:rPr>
+        <w:t xml:space="preserve">. This is corresponding to the </w:t>
+      </w:r>
+      <w:r>
+        <w:rPr>
+          <w:rFonts w:asciiTheme="majorHAnsi" w:hAnsiTheme="majorHAnsi"/>
+          <w:i/>
+          <w:sz w:val="20"/>
+        </w:rPr>
+        <w:t>“q”</w:t>
+      </w:r>
+      <w:r>
+        <w:rPr>
+          <w:rFonts w:asciiTheme="majorHAnsi" w:hAnsiTheme="majorHAnsi"/>
+          <w:sz w:val="20"/>
+        </w:rPr>
+        <w:t xml:space="preserve"> parameter. </w:t>
+      </w:r>
+    </w:p>
+    <w:p>
+      <w:pPr>
+        <w:pStyle w:val="ListParagraph"/>
+        <w:numPr>
+          <w:ilvl w:val="0"/>
+          <w:numId w:val="2"/>
+        </w:numPr>
+        <w:rPr>
+          <w:rFonts w:asciiTheme="majorHAnsi" w:hAnsiTheme="majorHAnsi"/>
+          <w:sz w:val="20"/>
+        </w:rPr>
+      </w:pPr>
+      <w:r>
+        <w:rPr>
+          <w:rFonts w:asciiTheme="majorHAnsi" w:hAnsiTheme="majorHAnsi"/>
+          <w:sz w:val="20"/>
+        </w:rPr>
+        <w:t xml:space="preserve">Maximum number of </w:t>
+      </w:r>
+      <w:r>
+        <w:rPr>
+          <w:rFonts w:asciiTheme="majorHAnsi" w:hAnsiTheme="majorHAnsi"/>
+          <w:sz w:val="20"/>
+        </w:rPr>
+        <w:t>users</w:t>
+      </w:r>
+      <w:r>
+        <w:rPr>
+          <w:rFonts w:asciiTheme="majorHAnsi" w:hAnsiTheme="majorHAnsi"/>
+          <w:sz w:val="20"/>
+        </w:rPr>
+        <w:t xml:space="preserve"> (Note: the maximum number of matches will be returned.) This will be translated into twitter’s fashion of pagination, i.e. </w:t>
+      </w:r>
+      <w:r>
+        <w:rPr>
+          <w:rFonts w:asciiTheme="majorHAnsi" w:hAnsiTheme="majorHAnsi"/>
+          <w:i/>
+          <w:sz w:val="20"/>
+        </w:rPr>
+        <w:t>“</w:t>
+      </w:r>
+      <w:r>
+        <w:rPr>
+          <w:rFonts w:asciiTheme="majorHAnsi" w:hAnsiTheme="majorHAnsi"/>
+          <w:i/>
+          <w:sz w:val="20"/>
+        </w:rPr>
+        <w:t>page” and</w:t>
+      </w:r>
+      <w:r>
+        <w:rPr>
+          <w:rFonts w:asciiTheme="majorHAnsi" w:hAnsiTheme="majorHAnsi"/>
+          <w:i/>
+          <w:sz w:val="20"/>
+        </w:rPr>
+        <w:t xml:space="preserve"> </w:t>
+      </w:r>
+      <w:r>
+        <w:rPr>
+          <w:rFonts w:asciiTheme="majorHAnsi" w:hAnsiTheme="majorHAnsi"/>
+          <w:i/>
+          <w:sz w:val="20"/>
+        </w:rPr>
+        <w:t>“count</w:t>
+      </w:r>
+      <w:r>
+        <w:rPr>
+          <w:rFonts w:asciiTheme="majorHAnsi" w:hAnsiTheme="majorHAnsi"/>
+          <w:i/>
+          <w:sz w:val="20"/>
+        </w:rPr>
+        <w:t xml:space="preserve">” </w:t>
+      </w:r>
+      <w:r>
+        <w:rPr>
+          <w:rFonts w:asciiTheme="majorHAnsi" w:hAnsiTheme="majorHAnsi"/>
+          <w:sz w:val="20"/>
+        </w:rPr>
+        <w:t>parameters.</w:t>
+      </w:r>
+      <w:r>
+        <w:rPr>
+          <w:rFonts w:asciiTheme="majorHAnsi" w:hAnsiTheme="majorHAnsi"/>
+          <w:sz w:val="20"/>
+        </w:rPr>
+        <w:t xml:space="preserve"> </w:t>
+      </w:r>
+      <w:r>
+        <w:rPr>
+          <w:rFonts w:asciiTheme="majorHAnsi" w:hAnsiTheme="majorHAnsi"/>
+          <w:sz w:val="20"/>
+        </w:rPr>
+        <w:t>Only the first 1,000 matching results are available.</w:t>
+      </w:r>
+    </w:p>
+    <w:p>
+      <w:pPr>
+        <w:pStyle w:val="ListParagraph"/>
+        <w:numPr>
+          <w:ilvl w:val="0"/>
+          <w:numId w:val="2"/>
+        </w:numPr>
+        <w:rPr>
+          <w:rFonts w:asciiTheme="majorHAnsi" w:hAnsiTheme="majorHAnsi"/>
+          <w:sz w:val="20"/>
+        </w:rPr>
+      </w:pPr>
+      <w:r>
+        <w:rPr>
+          <w:rFonts w:asciiTheme="majorHAnsi" w:hAnsiTheme="majorHAnsi"/>
+          <w:sz w:val="20"/>
+        </w:rPr>
+        <w:t xml:space="preserve">Date Range of the search results can be selected by the user, with the starting date fixed as 7 days ago and an end date of user’s choice. This is the </w:t>
+      </w:r>
+      <w:r>
+        <w:rPr>
+          <w:rFonts w:asciiTheme="majorHAnsi" w:hAnsiTheme="majorHAnsi"/>
+          <w:i/>
+          <w:sz w:val="20"/>
+        </w:rPr>
+        <w:t>“until”</w:t>
+      </w:r>
+      <w:r>
+        <w:rPr>
+          <w:rFonts w:asciiTheme="majorHAnsi" w:hAnsiTheme="majorHAnsi"/>
+          <w:sz w:val="20"/>
+        </w:rPr>
+        <w:t xml:space="preserve"> parameter. </w:t>
+      </w:r>
+    </w:p>
+    <w:p>
+      <w:pPr>
+        <w:pStyle w:val="ListParagraph"/>
+        <w:numPr>
+          <w:ilvl w:val="0"/>
+          <w:numId w:val="2"/>
+        </w:numPr>
+        <w:rPr>
+          <w:rFonts w:asciiTheme="majorHAnsi" w:hAnsiTheme="majorHAnsi"/>
+          <w:sz w:val="20"/>
+        </w:rPr>
+      </w:pPr>
+      <w:r>
+        <w:rPr>
+          <w:rFonts w:asciiTheme="majorHAnsi" w:hAnsiTheme="majorHAnsi"/>
+          <w:sz w:val="20"/>
+        </w:rPr>
+        <w:t>You can decide what fields you want in the return</w:t>
+      </w:r>
+      <w:r>
+        <w:rPr>
+          <w:rFonts w:asciiTheme="majorHAnsi" w:hAnsiTheme="majorHAnsi"/>
+          <w:sz w:val="20"/>
+        </w:rPr>
+        <w:t>ed</w:t>
+      </w:r>
+      <w:r>
+        <w:rPr>
+          <w:rFonts w:asciiTheme="majorHAnsi" w:hAnsiTheme="majorHAnsi"/>
+          <w:sz w:val="20"/>
+        </w:rPr>
+        <w:t xml:space="preserve"> data. For example, some user might only want </w:t>
+      </w:r>
+      <w:r>
+        <w:rPr>
+          <w:rFonts w:asciiTheme="majorHAnsi" w:hAnsiTheme="majorHAnsi"/>
+          <w:sz w:val="20"/>
+        </w:rPr>
+        <w:t>the “author id</w:t>
+      </w:r>
+      <w:r>
+        <w:rPr>
+          <w:rFonts w:asciiTheme="majorHAnsi" w:hAnsiTheme="majorHAnsi"/>
+          <w:sz w:val="20"/>
+        </w:rPr>
+        <w:t xml:space="preserve">” </w:t>
+      </w:r>
+      <w:r>
+        <w:rPr>
+          <w:rFonts w:asciiTheme="majorHAnsi" w:hAnsiTheme="majorHAnsi"/>
+          <w:sz w:val="20"/>
+        </w:rPr>
+        <w:t xml:space="preserve">and others might </w:t>
+      </w:r>
+      <w:r>
+        <w:rPr>
+          <w:rFonts w:asciiTheme="majorHAnsi" w:hAnsiTheme="majorHAnsi"/>
+          <w:sz w:val="20"/>
+        </w:rPr>
+        <w:t xml:space="preserve">want the </w:t>
+      </w:r>
+      <w:r>
+        <w:rPr>
+          <w:rFonts w:asciiTheme="majorHAnsi" w:hAnsiTheme="majorHAnsi"/>
+          <w:sz w:val="20"/>
+        </w:rPr>
+        <w:t>“screen_name</w:t>
+      </w:r>
+      <w:bookmarkStart w:id="0" w:name="_GoBack"/>
+      <w:bookmarkEnd w:id="0"/>
+      <w:r>
+        <w:rPr>
+          <w:rFonts w:asciiTheme="majorHAnsi" w:hAnsiTheme="majorHAnsi"/>
+          <w:sz w:val="20"/>
+        </w:rPr>
+        <w:t xml:space="preserve">” </w:t>
+      </w:r>
+      <w:r>
+        <w:rPr>
+          <w:rFonts w:asciiTheme="majorHAnsi" w:hAnsiTheme="majorHAnsi"/>
+          <w:sz w:val="20"/>
+        </w:rPr>
+        <w:t>as well as the “description”</w:t>
+      </w:r>
+      <w:r>
+        <w:rPr>
+          <w:rFonts w:asciiTheme="majorHAnsi" w:hAnsiTheme="majorHAnsi"/>
+          <w:sz w:val="20"/>
+        </w:rPr>
+        <w:t>.</w:t>
+      </w:r>
+      <w:r>
+        <w:rPr>
+          <w:rFonts w:asciiTheme="majorHAnsi" w:hAnsiTheme="majorHAnsi"/>
+          <w:noProof/>
+          <w:sz w:val="20"/>
+        </w:rPr>
+        <w:t xml:space="preserve"> </w:t>
+      </w:r>
+    </w:p>
+    <w:p>
+      <w:pPr>
+        <w:ind w:left="360"/>
+        <w:rPr>
+          <w:rFonts w:asciiTheme="majorHAnsi" w:hAnsiTheme="majorHAnsi"/>
+          <w:sz w:val="20"/>
+        </w:rPr>
+      </w:pPr>
     </w:p>
     <w:p>
       <w:pPr>
@@ -3615,13 +5928,22 @@
         </w:numPr>
         <w:rPr>
           <w:rFonts w:asciiTheme="majorHAnsi" w:hAnsiTheme="majorHAnsi"/>
-        </w:rPr>
-      </w:pPr>
-      <w:r>
-        <w:rPr>
-          <w:rFonts w:asciiTheme="majorHAnsi" w:hAnsiTheme="majorHAnsi"/>
-        </w:rPr>
-        <w:t>Pagination</w:t>
+          <w:sz w:val="20"/>
+        </w:rPr>
+      </w:pPr>
+      <w:r>
+        <w:rPr>
+          <w:rFonts w:asciiTheme="majorHAnsi" w:hAnsiTheme="majorHAnsi"/>
+          <w:sz w:val="20"/>
+        </w:rPr>
+        <w:t>Data aggregation</w:t>
+      </w:r>
+      <w:r>
+        <w:rPr>
+          <w:rFonts w:asciiTheme="majorHAnsi" w:hAnsiTheme="majorHAnsi"/>
+          <w:sz w:val="20"/>
+        </w:rPr>
+        <w:t>, storage and distribution</w:t>
       </w:r>
     </w:p>
     <w:p>
@@ -3633,11 +5955,13 @@
         </w:numPr>
         <w:rPr>
           <w:rFonts w:asciiTheme="majorHAnsi" w:hAnsiTheme="majorHAnsi"/>
-        </w:rPr>
-      </w:pPr>
-      <w:r>
-        <w:rPr>
-          <w:rFonts w:asciiTheme="majorHAnsi" w:hAnsiTheme="majorHAnsi"/>
+          <w:sz w:val="20"/>
+        </w:rPr>
+      </w:pPr>
+      <w:r>
+        <w:rPr>
+          <w:rFonts w:asciiTheme="majorHAnsi" w:hAnsiTheme="majorHAnsi"/>
+          <w:sz w:val="20"/>
         </w:rPr>
         <w:t>A Short Intro of GraphQL – the next generation API language</w:t>
       </w:r>
@@ -3651,25 +5975,22 @@
         </w:numPr>
         <w:rPr>
           <w:rFonts w:asciiTheme="majorHAnsi" w:hAnsiTheme="majorHAnsi"/>
-        </w:rPr>
-      </w:pPr>
-      <w:r>
-        <w:rPr>
-          <w:rFonts w:asciiTheme="majorHAnsi" w:hAnsiTheme="majorHAnsi"/>
-        </w:rPr>
-        <w:t xml:space="preserve">Data </w:t>
-      </w:r>
-      <w:r>
-        <w:rPr>
-          <w:rFonts w:asciiTheme="majorHAnsi" w:hAnsiTheme="majorHAnsi"/>
-        </w:rPr>
-        <w:t>aggregation</w:t>
+          <w:sz w:val="20"/>
+        </w:rPr>
+      </w:pPr>
+      <w:r>
+        <w:rPr>
+          <w:rFonts w:asciiTheme="majorHAnsi" w:hAnsiTheme="majorHAnsi"/>
+          <w:sz w:val="20"/>
+        </w:rPr>
+        <w:t>Pagination</w:t>
       </w:r>
     </w:p>
     <w:p>
       <w:pPr>
         <w:rPr>
           <w:rFonts w:asciiTheme="majorHAnsi" w:hAnsiTheme="majorHAnsi"/>
+          <w:sz w:val="20"/>
         </w:rPr>
       </w:pPr>
     </w:p>
@@ -3845,6 +6166,44 @@
       </w:r>
       <w:r>
         <w:t>https://developer.twitter.com/en/docs/tweets/search/api-reference/get-search-tweets.html</w:t>
+      </w:r>
+    </w:p>
+  </w:footnote>
+  <w:footnote w:id="7">
+    <w:p>
+      <w:pPr>
+        <w:pStyle w:val="FootnoteText"/>
+      </w:pPr>
+      <w:r>
+        <w:rPr>
+          <w:rStyle w:val="FootnoteReference"/>
+        </w:rPr>
+        <w:footnoteRef/>
+      </w:r>
+      <w:r>
+        <w:t xml:space="preserve"> </w:t>
+      </w:r>
+      <w:r>
+        <w:t>https://developer.twitter.com/en/docs/basics/rate-limiting</w:t>
+      </w:r>
+    </w:p>
+  </w:footnote>
+  <w:footnote w:id="8">
+    <w:p>
+      <w:pPr>
+        <w:pStyle w:val="FootnoteText"/>
+      </w:pPr>
+      <w:r>
+        <w:rPr>
+          <w:rStyle w:val="FootnoteReference"/>
+        </w:rPr>
+        <w:footnoteRef/>
+      </w:r>
+      <w:r>
+        <w:t xml:space="preserve"> </w:t>
+      </w:r>
+      <w:r>
+        <w:t>https://developer.twitter.com/en/docs/accounts-and-users/follow-search-get-users/api-reference/get-users-search</w:t>
       </w:r>
     </w:p>
   </w:footnote>
@@ -4847,7 +7206,7 @@
 </file>
 
 <file path=customXml/itemProps1.xml><?xml version="1.0" encoding="utf-8"?>
-<ds:datastoreItem xmlns:ds="http://schemas.openxmlformats.org/officeDocument/2006/customXml" ds:itemID="{93AF8D23-C6C3-4DB3-9DE1-EE64B9278073}">
+<ds:datastoreItem xmlns:ds="http://schemas.openxmlformats.org/officeDocument/2006/customXml" ds:itemID="{9BD46E4B-493F-4F11-8170-76657C96C021}">
   <ds:schemaRefs>
     <ds:schemaRef ds:uri="http://schemas.openxmlformats.org/officeDocument/2006/bibliography"/>
   </ds:schemaRefs>

</xml_diff>

<commit_message>
write the documentation for data ingest
</commit_message>
<xml_diff>
--- a/www/docs/searching.docx
+++ b/www/docs/searching.docx
@@ -194,7 +194,7 @@
         <mc:AlternateContent>
           <mc:Choice Requires="wpg">
             <w:drawing>
-              <wp:anchor distT="0" distB="0" distL="114300" distR="114300" simplePos="0" relativeHeight="251671552" behindDoc="0" locked="0" layoutInCell="1" allowOverlap="1">
+              <wp:anchor distT="0" distB="0" distL="114300" distR="114300" simplePos="0" relativeHeight="251669504" behindDoc="0" locked="0" layoutInCell="1" allowOverlap="1">
                 <wp:simplePos x="0" y="0"/>
                 <wp:positionH relativeFrom="column">
                   <wp:posOffset>381000</wp:posOffset>
@@ -989,7 +989,7 @@
           </mc:Choice>
           <mc:Fallback>
             <w:pict>
-              <v:group id="Group 30" o:spid="_x0000_s1026" style="position:absolute;left:0;text-align:left;margin-left:30pt;margin-top:9.1pt;width:406.55pt;height:202.1pt;z-index:251671552" coordsize="51629,25666" o:gfxdata="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">
+              <v:group id="Group 30" o:spid="_x0000_s1026" style="position:absolute;left:0;text-align:left;margin-left:30pt;margin-top:9.1pt;width:406.55pt;height:202.1pt;z-index:251669504" coordsize="51629,25666" o:gfxdata="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">
                 <v:group id="Group 24" o:spid="_x0000_s1027" style="position:absolute;left:219;top:7315;width:51410;height:18351" coordorigin="219" coordsize="51425,18361" o:gfxdata="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">
                   <v:roundrect id="Rounded Rectangle 3" o:spid="_x0000_s1028" style="position:absolute;left:219;top:2048;width:9798;height:4826;visibility:visible;mso-wrap-style:square;v-text-anchor:middle" arcsize="10923f" o:gfxdata="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" fillcolor="#c00000" stroked="f" strokeweight="1pt">
                     <v:stroke joinstyle="miter"/>
@@ -1659,23 +1659,268 @@
       <w:r>
         <w:rPr>
           <w:rFonts w:asciiTheme="majorHAnsi" w:hAnsiTheme="majorHAnsi"/>
+          <w:sz w:val="20"/>
+        </w:rPr>
+        <w:t xml:space="preserve">The first time user enters the search page, an authorization must be performed by the user to grant the SMILE application for requesting data from twitter on user’s behalf. </w:t>
+      </w:r>
+      <w:r>
+        <w:rPr>
+          <w:rFonts w:asciiTheme="majorHAnsi" w:hAnsiTheme="majorHAnsi"/>
+          <w:sz w:val="20"/>
+        </w:rPr>
+        <w:t xml:space="preserve">After clicking the </w:t>
+      </w:r>
+      <w:r>
+        <w:rPr>
           <w:noProof/>
           <w:sz w:val="20"/>
         </w:rPr>
+        <w:drawing>
+          <wp:inline distT="0" distB="0" distL="0" distR="0" wp14:anchorId="0C315C9F" wp14:editId="228DCF9D">
+            <wp:extent cx="1866900" cy="189978"/>
+            <wp:effectExtent l="0" t="0" r="0" b="635"/>
+            <wp:docPr id="267" name="Picture 267"/>
+            <wp:cNvGraphicFramePr>
+              <a:graphicFrameLocks xmlns:a="http://schemas.openxmlformats.org/drawingml/2006/main" noChangeAspect="1"/>
+            </wp:cNvGraphicFramePr>
+            <a:graphic xmlns:a="http://schemas.openxmlformats.org/drawingml/2006/main">
+              <a:graphicData uri="http://schemas.openxmlformats.org/drawingml/2006/picture">
+                <pic:pic xmlns:pic="http://schemas.openxmlformats.org/drawingml/2006/picture">
+                  <pic:nvPicPr>
+                    <pic:cNvPr id="1" name=""/>
+                    <pic:cNvPicPr/>
+                  </pic:nvPicPr>
+                  <pic:blipFill>
+                    <a:blip r:embed="rId8"/>
+                    <a:stretch>
+                      <a:fillRect/>
+                    </a:stretch>
+                  </pic:blipFill>
+                  <pic:spPr>
+                    <a:xfrm>
+                      <a:off x="0" y="0"/>
+                      <a:ext cx="2026604" cy="206230"/>
+                    </a:xfrm>
+                    <a:prstGeom prst="rect">
+                      <a:avLst/>
+                    </a:prstGeom>
+                  </pic:spPr>
+                </pic:pic>
+              </a:graphicData>
+            </a:graphic>
+          </wp:inline>
+        </w:drawing>
+      </w:r>
+      <w:r>
+        <w:rPr>
+          <w:rFonts w:asciiTheme="majorHAnsi" w:hAnsiTheme="majorHAnsi"/>
+          <w:sz w:val="20"/>
+        </w:rPr>
+        <w:t xml:space="preserve"> button, SMILE will redirect user to </w:t>
+      </w:r>
+      <w:r>
+        <w:rPr>
+          <w:rFonts w:asciiTheme="majorHAnsi" w:hAnsiTheme="majorHAnsi"/>
+          <w:sz w:val="20"/>
+        </w:rPr>
+        <w:t xml:space="preserve">the </w:t>
+      </w:r>
+      <w:r>
+        <w:rPr>
+          <w:rFonts w:asciiTheme="majorHAnsi" w:hAnsiTheme="majorHAnsi"/>
+          <w:sz w:val="20"/>
+          <w:u w:val="dotted"/>
+        </w:rPr>
+        <w:t>T</w:t>
+      </w:r>
+      <w:r>
+        <w:rPr>
+          <w:rFonts w:asciiTheme="majorHAnsi" w:hAnsiTheme="majorHAnsi"/>
+          <w:sz w:val="20"/>
+          <w:u w:val="dotted"/>
+        </w:rPr>
+        <w:t>witter’s authorize page</w:t>
+      </w:r>
+      <w:r>
+        <w:rPr>
+          <w:rFonts w:asciiTheme="majorHAnsi" w:hAnsiTheme="majorHAnsi"/>
+          <w:sz w:val="20"/>
+        </w:rPr>
+        <w:t xml:space="preserve"> where </w:t>
+      </w:r>
+      <w:r>
+        <w:rPr>
+          <w:rFonts w:asciiTheme="majorHAnsi" w:hAnsiTheme="majorHAnsi"/>
+          <w:sz w:val="20"/>
+        </w:rPr>
+        <w:t>it</w:t>
+      </w:r>
+      <w:r>
+        <w:rPr>
+          <w:rFonts w:asciiTheme="majorHAnsi" w:hAnsiTheme="majorHAnsi"/>
+          <w:sz w:val="20"/>
+        </w:rPr>
+        <w:t xml:space="preserve"> asks for </w:t>
+      </w:r>
+      <w:r>
+        <w:rPr>
+          <w:rFonts w:asciiTheme="majorHAnsi" w:hAnsiTheme="majorHAnsi"/>
+          <w:sz w:val="20"/>
+        </w:rPr>
+        <w:t>u</w:t>
+      </w:r>
+      <w:r>
+        <w:rPr>
+          <w:rFonts w:asciiTheme="majorHAnsi" w:hAnsiTheme="majorHAnsi"/>
+          <w:sz w:val="20"/>
+        </w:rPr>
+        <w:t>sername and pass</w:t>
+      </w:r>
+      <w:r>
+        <w:rPr>
+          <w:rFonts w:asciiTheme="majorHAnsi" w:hAnsiTheme="majorHAnsi"/>
+          <w:sz w:val="20"/>
+        </w:rPr>
+        <w:t xml:space="preserve">word. Once you hit the “authorize app” </w:t>
+      </w:r>
+      <w:r>
+        <w:rPr>
+          <w:rFonts w:asciiTheme="majorHAnsi" w:hAnsiTheme="majorHAnsi"/>
+          <w:sz w:val="20"/>
+        </w:rPr>
         <w:lastRenderedPageBreak/>
+        <w:t xml:space="preserve">button, you have successfully fulfilled the </w:t>
+      </w:r>
+      <w:r>
+        <w:rPr>
+          <w:rFonts w:asciiTheme="majorHAnsi" w:hAnsiTheme="majorHAnsi"/>
+          <w:sz w:val="20"/>
+        </w:rPr>
+        <w:t>process</w:t>
+      </w:r>
+      <w:r>
+        <w:rPr>
+          <w:rFonts w:asciiTheme="majorHAnsi" w:hAnsiTheme="majorHAnsi"/>
+          <w:sz w:val="20"/>
+        </w:rPr>
+        <w:t xml:space="preserve"> and will be redirect to the SMILE search page. </w:t>
+      </w:r>
+      <w:r>
+        <w:rPr>
+          <w:rFonts w:asciiTheme="majorHAnsi" w:hAnsiTheme="majorHAnsi"/>
+          <w:sz w:val="20"/>
+        </w:rPr>
+        <w:t xml:space="preserve">This </w:t>
+      </w:r>
+      <w:r>
+        <w:rPr>
+          <w:rFonts w:asciiTheme="majorHAnsi" w:hAnsiTheme="majorHAnsi"/>
+          <w:sz w:val="20"/>
+        </w:rPr>
+        <w:t>process</w:t>
+      </w:r>
+      <w:r>
+        <w:rPr>
+          <w:rFonts w:asciiTheme="majorHAnsi" w:hAnsiTheme="majorHAnsi"/>
+          <w:sz w:val="20"/>
+        </w:rPr>
+        <w:t xml:space="preserve"> follows</w:t>
+      </w:r>
+      <w:r>
+        <w:rPr>
+          <w:rFonts w:asciiTheme="majorHAnsi" w:hAnsiTheme="majorHAnsi"/>
+          <w:sz w:val="20"/>
+        </w:rPr>
+        <w:t xml:space="preserve"> a generic 3-legged</w:t>
+      </w:r>
+      <w:r>
+        <w:rPr>
+          <w:rFonts w:asciiTheme="majorHAnsi" w:hAnsiTheme="majorHAnsi"/>
+          <w:sz w:val="20"/>
+        </w:rPr>
+        <w:t xml:space="preserve"> OAuth flow</w:t>
+      </w:r>
+      <w:r>
+        <w:rPr>
+          <w:rFonts w:asciiTheme="majorHAnsi" w:hAnsiTheme="majorHAnsi"/>
+          <w:sz w:val="20"/>
+        </w:rPr>
+        <w:t xml:space="preserve"> practice</w:t>
+      </w:r>
+      <w:r>
+        <w:rPr>
+          <w:rFonts w:asciiTheme="majorHAnsi" w:hAnsiTheme="majorHAnsi"/>
+          <w:sz w:val="20"/>
+        </w:rPr>
+        <w:t xml:space="preserve">. </w:t>
+      </w:r>
+    </w:p>
+    <w:p>
+      <w:pPr>
+        <w:rPr>
+          <w:noProof/>
+          <w:sz w:val="20"/>
+        </w:rPr>
+      </w:pPr>
+    </w:p>
+    <w:p>
+      <w:pPr>
+        <w:ind w:left="360"/>
+        <w:jc w:val="center"/>
+        <w:rPr>
+          <w:rFonts w:asciiTheme="majorHAnsi" w:hAnsiTheme="majorHAnsi"/>
+          <w:sz w:val="20"/>
+        </w:rPr>
+      </w:pPr>
+      <w:r>
+        <w:rPr>
+          <w:rFonts w:asciiTheme="majorHAnsi" w:hAnsiTheme="majorHAnsi"/>
+          <w:b/>
+          <w:sz w:val="20"/>
+        </w:rPr>
+        <w:t>Figure 2</w:t>
+      </w:r>
+      <w:r>
+        <w:rPr>
+          <w:rFonts w:asciiTheme="majorHAnsi" w:hAnsiTheme="majorHAnsi"/>
+          <w:sz w:val="20"/>
+        </w:rPr>
+        <w:t>. The authorization process in the SMILE application</w:t>
+      </w:r>
+      <w:r>
+        <w:rPr>
+          <w:rFonts w:asciiTheme="majorHAnsi" w:hAnsiTheme="majorHAnsi"/>
+          <w:sz w:val="20"/>
+        </w:rPr>
+        <w:t xml:space="preserve"> </w:t>
+      </w:r>
+    </w:p>
+    <w:p>
+      <w:pPr>
+        <w:rPr>
+          <w:rFonts w:asciiTheme="majorHAnsi" w:hAnsiTheme="majorHAnsi"/>
+          <w:sz w:val="20"/>
+        </w:rPr>
+      </w:pPr>
+      <w:r>
+        <w:rPr>
+          <w:rFonts w:asciiTheme="majorHAnsi" w:hAnsiTheme="majorHAnsi"/>
+          <w:noProof/>
+          <w:sz w:val="20"/>
+        </w:rPr>
         <mc:AlternateContent>
           <mc:Choice Requires="wpg">
             <w:drawing>
-              <wp:anchor distT="0" distB="0" distL="114300" distR="114300" simplePos="0" relativeHeight="251732992" behindDoc="0" locked="0" layoutInCell="1" allowOverlap="1">
+              <wp:anchor distT="0" distB="0" distL="114300" distR="114300" simplePos="0" relativeHeight="251730944" behindDoc="0" locked="0" layoutInCell="1" allowOverlap="1">
                 <wp:simplePos x="0" y="0"/>
-                <wp:positionH relativeFrom="column">
-                  <wp:posOffset>-82550</wp:posOffset>
+                <wp:positionH relativeFrom="margin">
+                  <wp:align>center</wp:align>
                 </wp:positionH>
                 <wp:positionV relativeFrom="paragraph">
-                  <wp:posOffset>997585</wp:posOffset>
+                  <wp:posOffset>543560</wp:posOffset>
                 </wp:positionV>
-                <wp:extent cx="6367780" cy="3458845"/>
-                <wp:effectExtent l="0" t="0" r="0" b="8255"/>
+                <wp:extent cx="5848350" cy="2760345"/>
+                <wp:effectExtent l="0" t="0" r="0" b="1905"/>
                 <wp:wrapTopAndBottom/>
                 <wp:docPr id="236" name="Group 236"/>
                 <wp:cNvGraphicFramePr/>
@@ -1686,9 +1931,9 @@
                       <wpg:grpSpPr>
                         <a:xfrm>
                           <a:off x="0" y="0"/>
-                          <a:ext cx="6367780" cy="3458845"/>
-                          <a:chOff x="0" y="0"/>
-                          <a:chExt cx="6367780" cy="3458845"/>
+                          <a:ext cx="5848350" cy="2760345"/>
+                          <a:chOff x="0" y="520700"/>
+                          <a:chExt cx="5848350" cy="2760345"/>
                         </a:xfrm>
                       </wpg:grpSpPr>
                       <pic:pic xmlns:pic="http://schemas.openxmlformats.org/drawingml/2006/picture">
@@ -1699,7 +1944,7 @@
                           </pic:cNvPicPr>
                         </pic:nvPicPr>
                         <pic:blipFill>
-                          <a:blip r:embed="rId8" cstate="print">
+                          <a:blip r:embed="rId9" cstate="print">
                             <a:extLst>
                               <a:ext uri="{28A0092B-C50C-407E-A947-70E740481C1C}">
                                 <a14:useLocalDpi xmlns:a14="http://schemas.microsoft.com/office/drawing/2010/main" val="0"/>
@@ -1728,20 +1973,20 @@
                           </pic:cNvPicPr>
                         </pic:nvPicPr>
                         <pic:blipFill rotWithShape="1">
-                          <a:blip r:embed="rId9">
+                          <a:blip r:embed="rId10">
                             <a:extLst>
                               <a:ext uri="{28A0092B-C50C-407E-A947-70E740481C1C}">
                                 <a14:useLocalDpi xmlns:a14="http://schemas.microsoft.com/office/drawing/2010/main" val="0"/>
                               </a:ext>
                             </a:extLst>
                           </a:blip>
-                          <a:srcRect t="480"/>
+                          <a:srcRect l="3150" t="7576" r="3853" b="13070"/>
                           <a:stretch/>
                         </pic:blipFill>
                         <pic:spPr bwMode="auto">
                           <a:xfrm>
-                            <a:off x="2940050" y="0"/>
-                            <a:ext cx="3427730" cy="3384550"/>
+                            <a:off x="2660650" y="520700"/>
+                            <a:ext cx="3187700" cy="2698750"/>
                           </a:xfrm>
                           <a:prstGeom prst="rect">
                             <a:avLst/>
@@ -1764,7 +2009,7 @@
                           </pic:cNvPicPr>
                         </pic:nvPicPr>
                         <pic:blipFill>
-                          <a:blip r:embed="rId10" cstate="print">
+                          <a:blip r:embed="rId11" cstate="print">
                             <a:extLst>
                               <a:ext uri="{28A0092B-C50C-407E-A947-70E740481C1C}">
                                 <a14:useLocalDpi xmlns:a14="http://schemas.microsoft.com/office/drawing/2010/main" val="0"/>
@@ -1858,7 +2103,7 @@
                         <wps:cNvSpPr txBox="1"/>
                         <wps:spPr>
                           <a:xfrm>
-                            <a:off x="6064250" y="3041650"/>
+                            <a:off x="5524500" y="2863850"/>
                             <a:ext cx="260350" cy="417195"/>
                           </a:xfrm>
                           <a:prstGeom prst="rect">
@@ -1992,12 +2237,18 @@
                     </wpg:wgp>
                   </a:graphicData>
                 </a:graphic>
+                <wp14:sizeRelH relativeFrom="margin">
+                  <wp14:pctWidth>0</wp14:pctWidth>
+                </wp14:sizeRelH>
+                <wp14:sizeRelV relativeFrom="margin">
+                  <wp14:pctHeight>0</wp14:pctHeight>
+                </wp14:sizeRelV>
               </wp:anchor>
             </w:drawing>
           </mc:Choice>
           <mc:Fallback>
             <w:pict>
-              <v:group id="Group 236" o:spid="_x0000_s1045" style="position:absolute;margin-left:-6.5pt;margin-top:78.55pt;width:501.4pt;height:272.35pt;z-index:251732992" coordsize="63677,34588" o:gfxdata="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">
+              <v:group id="Group 236" o:spid="_x0000_s1045" style="position:absolute;margin-left:0;margin-top:42.8pt;width:460.5pt;height:217.35pt;z-index:251730944;mso-position-horizontal:center;mso-position-horizontal-relative:margin;mso-width-relative:margin;mso-height-relative:margin" coordorigin=",5207" coordsize="58483,27603" o:gfxdata="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">
                 <v:shapetype id="_x0000_t75" coordsize="21600,21600" o:spt="75" o:preferrelative="t" path="m@4@5l@4@11@9@11@9@5xe" filled="f" stroked="f">
                   <v:stroke joinstyle="miter"/>
                   <v:formulas>
@@ -2018,15 +2269,15 @@
                   <o:lock v:ext="edit" aspectratio="t"/>
                 </v:shapetype>
                 <v:shape id="Picture 1" o:spid="_x0000_s1046" type="#_x0000_t75" style="position:absolute;left:254;top:6096;width:24701;height:11512;visibility:visible;mso-wrap-style:square" o:gfxdata="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">
-                  <v:imagedata r:id="rId11" o:title=""/>
+                  <v:imagedata r:id="rId12" o:title=""/>
                   <v:path arrowok="t"/>
                 </v:shape>
-                <v:shape id="Picture 31" o:spid="_x0000_s1047" type="#_x0000_t75" style="position:absolute;left:29400;width:34277;height:33845;visibility:visible;mso-wrap-style:square" o:gfxdata="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">
-                  <v:imagedata r:id="rId12" o:title="" croptop="315f"/>
+                <v:shape id="Picture 31" o:spid="_x0000_s1047" type="#_x0000_t75" style="position:absolute;left:26606;top:5207;width:31877;height:26987;visibility:visible;mso-wrap-style:square" o:gfxdata="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">
+                  <v:imagedata r:id="rId13" o:title="" croptop="4965f" cropbottom="8566f" cropleft="2064f" cropright="2525f"/>
                   <v:path arrowok="t"/>
                 </v:shape>
                 <v:shape id="Picture 192" o:spid="_x0000_s1048" type="#_x0000_t75" style="position:absolute;top:22161;width:25038;height:9252;visibility:visible;mso-wrap-style:square" o:gfxdata="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">
-                  <v:imagedata r:id="rId13" o:title=""/>
+                  <v:imagedata r:id="rId14" o:title=""/>
                   <v:path arrowok="t"/>
                 </v:shape>
                 <v:shape id="Text Box 233" o:spid="_x0000_s1049" type="#_x0000_t202" style="position:absolute;left:22606;top:14478;width:2603;height:4171;visibility:visible;mso-wrap-style:none;v-text-anchor:top" o:gfxdata="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" filled="f" stroked="f">
@@ -2076,7 +2327,7 @@
                     </w:txbxContent>
                   </v:textbox>
                 </v:shape>
-                <v:shape id="Text Box 234" o:spid="_x0000_s1050" type="#_x0000_t202" style="position:absolute;left:60642;top:30416;width:2604;height:4172;visibility:visible;mso-wrap-style:none;v-text-anchor:top" o:gfxdata="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" filled="f" stroked="f">
+                <v:shape id="Text Box 234" o:spid="_x0000_s1050" type="#_x0000_t202" style="position:absolute;left:55245;top:28638;width:2603;height:4172;visibility:visible;mso-wrap-style:none;v-text-anchor:top" o:gfxdata="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" filled="f" stroked="f">
                   <v:fill o:detectmouseclick="t"/>
                   <v:textbox style="mso-fit-shape-to-text:t">
                     <w:txbxContent>
@@ -2170,7 +2421,7 @@
                     </w:txbxContent>
                   </v:textbox>
                 </v:shape>
-                <w10:wrap type="topAndBottom"/>
+                <w10:wrap type="topAndBottom" anchorx="margin"/>
               </v:group>
             </w:pict>
           </mc:Fallback>
@@ -2181,244 +2432,6 @@
           <w:rFonts w:asciiTheme="majorHAnsi" w:hAnsiTheme="majorHAnsi"/>
           <w:sz w:val="20"/>
         </w:rPr>
-        <w:t xml:space="preserve">The first time user enters the search page, an authorization must be performed by the user to grant the SMILE application for requesting data from twitter on user’s behalf. </w:t>
-      </w:r>
-      <w:r>
-        <w:rPr>
-          <w:rFonts w:asciiTheme="majorHAnsi" w:hAnsiTheme="majorHAnsi"/>
-          <w:sz w:val="20"/>
-        </w:rPr>
-        <w:t xml:space="preserve">After clicking the </w:t>
-      </w:r>
-      <w:r>
-        <w:rPr>
-          <w:noProof/>
-          <w:sz w:val="20"/>
-        </w:rPr>
-        <w:drawing>
-          <wp:inline distT="0" distB="0" distL="0" distR="0" wp14:anchorId="0C315C9F" wp14:editId="228DCF9D">
-            <wp:extent cx="1866900" cy="189978"/>
-            <wp:effectExtent l="0" t="0" r="0" b="635"/>
-            <wp:docPr id="267" name="Picture 267"/>
-            <wp:cNvGraphicFramePr>
-              <a:graphicFrameLocks xmlns:a="http://schemas.openxmlformats.org/drawingml/2006/main" noChangeAspect="1"/>
-            </wp:cNvGraphicFramePr>
-            <a:graphic xmlns:a="http://schemas.openxmlformats.org/drawingml/2006/main">
-              <a:graphicData uri="http://schemas.openxmlformats.org/drawingml/2006/picture">
-                <pic:pic xmlns:pic="http://schemas.openxmlformats.org/drawingml/2006/picture">
-                  <pic:nvPicPr>
-                    <pic:cNvPr id="1" name=""/>
-                    <pic:cNvPicPr/>
-                  </pic:nvPicPr>
-                  <pic:blipFill>
-                    <a:blip r:embed="rId14"/>
-                    <a:stretch>
-                      <a:fillRect/>
-                    </a:stretch>
-                  </pic:blipFill>
-                  <pic:spPr>
-                    <a:xfrm>
-                      <a:off x="0" y="0"/>
-                      <a:ext cx="2026604" cy="206230"/>
-                    </a:xfrm>
-                    <a:prstGeom prst="rect">
-                      <a:avLst/>
-                    </a:prstGeom>
-                  </pic:spPr>
-                </pic:pic>
-              </a:graphicData>
-            </a:graphic>
-          </wp:inline>
-        </w:drawing>
-      </w:r>
-      <w:r>
-        <w:rPr>
-          <w:rFonts w:asciiTheme="majorHAnsi" w:hAnsiTheme="majorHAnsi"/>
-          <w:sz w:val="20"/>
-        </w:rPr>
-        <w:t xml:space="preserve"> button, SMILE will redirect user to </w:t>
-      </w:r>
-      <w:r>
-        <w:rPr>
-          <w:rFonts w:asciiTheme="majorHAnsi" w:hAnsiTheme="majorHAnsi"/>
-          <w:sz w:val="20"/>
-        </w:rPr>
-        <w:t xml:space="preserve">the </w:t>
-      </w:r>
-      <w:r>
-        <w:rPr>
-          <w:rFonts w:asciiTheme="majorHAnsi" w:hAnsiTheme="majorHAnsi"/>
-          <w:sz w:val="20"/>
-          <w:u w:val="dotted"/>
-        </w:rPr>
-        <w:t>T</w:t>
-      </w:r>
-      <w:r>
-        <w:rPr>
-          <w:rFonts w:asciiTheme="majorHAnsi" w:hAnsiTheme="majorHAnsi"/>
-          <w:sz w:val="20"/>
-          <w:u w:val="dotted"/>
-        </w:rPr>
-        <w:t>witter’s authorize page</w:t>
-      </w:r>
-      <w:r>
-        <w:rPr>
-          <w:rFonts w:asciiTheme="majorHAnsi" w:hAnsiTheme="majorHAnsi"/>
-          <w:sz w:val="20"/>
-        </w:rPr>
-        <w:t xml:space="preserve"> where </w:t>
-      </w:r>
-      <w:r>
-        <w:rPr>
-          <w:rFonts w:asciiTheme="majorHAnsi" w:hAnsiTheme="majorHAnsi"/>
-          <w:sz w:val="20"/>
-        </w:rPr>
-        <w:t>it</w:t>
-      </w:r>
-      <w:r>
-        <w:rPr>
-          <w:rFonts w:asciiTheme="majorHAnsi" w:hAnsiTheme="majorHAnsi"/>
-          <w:sz w:val="20"/>
-        </w:rPr>
-        <w:t xml:space="preserve"> asks for </w:t>
-      </w:r>
-      <w:r>
-        <w:rPr>
-          <w:rFonts w:asciiTheme="majorHAnsi" w:hAnsiTheme="majorHAnsi"/>
-          <w:sz w:val="20"/>
-        </w:rPr>
-        <w:t>u</w:t>
-      </w:r>
-      <w:r>
-        <w:rPr>
-          <w:rFonts w:asciiTheme="majorHAnsi" w:hAnsiTheme="majorHAnsi"/>
-          <w:sz w:val="20"/>
-        </w:rPr>
-        <w:t>sername and pass</w:t>
-      </w:r>
-      <w:r>
-        <w:rPr>
-          <w:rFonts w:asciiTheme="majorHAnsi" w:hAnsiTheme="majorHAnsi"/>
-          <w:sz w:val="20"/>
-        </w:rPr>
-        <w:t xml:space="preserve">word. Once you hit the “authorize app” button, you have successfully fulfilled the </w:t>
-      </w:r>
-      <w:r>
-        <w:rPr>
-          <w:rFonts w:asciiTheme="majorHAnsi" w:hAnsiTheme="majorHAnsi"/>
-          <w:sz w:val="20"/>
-        </w:rPr>
-        <w:t>process</w:t>
-      </w:r>
-      <w:r>
-        <w:rPr>
-          <w:rFonts w:asciiTheme="majorHAnsi" w:hAnsiTheme="majorHAnsi"/>
-          <w:sz w:val="20"/>
-        </w:rPr>
-        <w:t xml:space="preserve"> and will be redirect to the SMILE search page. </w:t>
-      </w:r>
-      <w:r>
-        <w:rPr>
-          <w:rFonts w:asciiTheme="majorHAnsi" w:hAnsiTheme="majorHAnsi"/>
-          <w:sz w:val="20"/>
-        </w:rPr>
-        <w:t xml:space="preserve">This </w:t>
-      </w:r>
-      <w:r>
-        <w:rPr>
-          <w:rFonts w:asciiTheme="majorHAnsi" w:hAnsiTheme="majorHAnsi"/>
-          <w:sz w:val="20"/>
-        </w:rPr>
-        <w:t>process</w:t>
-      </w:r>
-      <w:r>
-        <w:rPr>
-          <w:rFonts w:asciiTheme="majorHAnsi" w:hAnsiTheme="majorHAnsi"/>
-          <w:sz w:val="20"/>
-        </w:rPr>
-        <w:t xml:space="preserve"> follows</w:t>
-      </w:r>
-      <w:r>
-        <w:rPr>
-          <w:rFonts w:asciiTheme="majorHAnsi" w:hAnsiTheme="majorHAnsi"/>
-          <w:sz w:val="20"/>
-        </w:rPr>
-        <w:t xml:space="preserve"> a generic 3-legged</w:t>
-      </w:r>
-      <w:r>
-        <w:rPr>
-          <w:rFonts w:asciiTheme="majorHAnsi" w:hAnsiTheme="majorHAnsi"/>
-          <w:sz w:val="20"/>
-        </w:rPr>
-        <w:t xml:space="preserve"> OAuth flow</w:t>
-      </w:r>
-      <w:r>
-        <w:rPr>
-          <w:rFonts w:asciiTheme="majorHAnsi" w:hAnsiTheme="majorHAnsi"/>
-          <w:sz w:val="20"/>
-        </w:rPr>
-        <w:t xml:space="preserve"> practice</w:t>
-      </w:r>
-      <w:r>
-        <w:rPr>
-          <w:rFonts w:asciiTheme="majorHAnsi" w:hAnsiTheme="majorHAnsi"/>
-          <w:sz w:val="20"/>
-        </w:rPr>
-        <w:t xml:space="preserve">. </w:t>
-      </w:r>
-    </w:p>
-    <w:p>
-      <w:pPr>
-        <w:rPr>
-          <w:noProof/>
-          <w:sz w:val="20"/>
-        </w:rPr>
-      </w:pPr>
-    </w:p>
-    <w:p>
-      <w:pPr>
-        <w:ind w:left="360"/>
-        <w:jc w:val="center"/>
-        <w:rPr>
-          <w:rFonts w:asciiTheme="majorHAnsi" w:hAnsiTheme="majorHAnsi"/>
-          <w:sz w:val="20"/>
-        </w:rPr>
-      </w:pPr>
-      <w:r>
-        <w:rPr>
-          <w:rFonts w:asciiTheme="majorHAnsi" w:hAnsiTheme="majorHAnsi"/>
-          <w:b/>
-          <w:sz w:val="20"/>
-        </w:rPr>
-        <w:t>Figure 2</w:t>
-      </w:r>
-      <w:r>
-        <w:rPr>
-          <w:rFonts w:asciiTheme="majorHAnsi" w:hAnsiTheme="majorHAnsi"/>
-          <w:sz w:val="20"/>
-        </w:rPr>
-        <w:t>. The authorization process in the SMILE application</w:t>
-      </w:r>
-      <w:r>
-        <w:rPr>
-          <w:rFonts w:asciiTheme="majorHAnsi" w:hAnsiTheme="majorHAnsi"/>
-          <w:sz w:val="20"/>
-        </w:rPr>
-        <w:t xml:space="preserve"> </w:t>
-      </w:r>
-    </w:p>
-    <w:p>
-      <w:pPr>
-        <w:rPr>
-          <w:rFonts w:asciiTheme="majorHAnsi" w:hAnsiTheme="majorHAnsi"/>
-          <w:sz w:val="20"/>
-        </w:rPr>
-      </w:pPr>
-      <w:r>
-        <w:rPr>
-          <w:rFonts w:asciiTheme="majorHAnsi" w:hAnsiTheme="majorHAnsi"/>
-          <w:sz w:val="20"/>
-        </w:rPr>
         <w:t xml:space="preserve">OAuth </w:t>
       </w:r>
       <w:r>
@@ -2476,7 +2489,21 @@
           <w:rFonts w:asciiTheme="majorHAnsi" w:hAnsiTheme="majorHAnsi"/>
           <w:sz w:val="20"/>
         </w:rPr>
-        <w:t xml:space="preserve">A 3-legged OAuth flow is illustrated below (figure 3). </w:t>
+        <w:t>A 3-legged OAuth flow is illustrated below (</w:t>
+      </w:r>
+      <w:r>
+        <w:rPr>
+          <w:rFonts w:asciiTheme="majorHAnsi" w:hAnsiTheme="majorHAnsi"/>
+          <w:sz w:val="20"/>
+        </w:rPr>
+        <w:t>F</w:t>
+      </w:r>
+      <w:r>
+        <w:rPr>
+          <w:rFonts w:asciiTheme="majorHAnsi" w:hAnsiTheme="majorHAnsi"/>
+          <w:sz w:val="20"/>
+        </w:rPr>
+        <w:t xml:space="preserve">igure 3). </w:t>
       </w:r>
       <w:r>
         <w:rPr>
@@ -2638,7 +2665,7 @@
         <mc:AlternateContent>
           <mc:Choice Requires="wpg">
             <w:drawing>
-              <wp:anchor distT="0" distB="0" distL="114300" distR="114300" simplePos="0" relativeHeight="251725824" behindDoc="0" locked="0" layoutInCell="1" allowOverlap="1">
+              <wp:anchor distT="0" distB="0" distL="114300" distR="114300" simplePos="0" relativeHeight="251723776" behindDoc="0" locked="0" layoutInCell="1" allowOverlap="1">
                 <wp:simplePos x="0" y="0"/>
                 <wp:positionH relativeFrom="column">
                   <wp:posOffset>1092200</wp:posOffset>
@@ -3283,7 +3310,7 @@
           </mc:Choice>
           <mc:Fallback>
             <w:pict>
-              <v:group id="Group 232" o:spid="_x0000_s1052" style="position:absolute;left:0;text-align:left;margin-left:86pt;margin-top:13.5pt;width:332.6pt;height:499.95pt;z-index:251725824;mso-width-relative:margin;mso-height-relative:margin" coordsize="42240,63493" o:gfxdata="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">
+              <v:group id="Group 232" o:spid="_x0000_s1052" style="position:absolute;left:0;text-align:left;margin-left:86pt;margin-top:13.5pt;width:332.6pt;height:499.95pt;z-index:251723776;mso-width-relative:margin;mso-height-relative:margin" coordsize="42240,63493" o:gfxdata="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">
                 <v:shape id="Picture 197" o:spid="_x0000_s1053" type="#_x0000_t75" alt="https://malalanayake.files.wordpress.com/2013/01/oauth_graph.gif" style="position:absolute;width:42240;height:63493;visibility:visible;mso-wrap-style:square" o:gfxdata="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">
                   <v:imagedata r:id="rId16" o:title="oauth_graph"/>
                   <v:path arrowok="t"/>
@@ -4999,7 +5026,7 @@
         <mc:AlternateContent>
           <mc:Choice Requires="wps">
             <w:drawing>
-              <wp:anchor distT="0" distB="0" distL="114300" distR="114300" simplePos="0" relativeHeight="251737088" behindDoc="0" locked="0" layoutInCell="1" allowOverlap="1" wp14:anchorId="717212D6" wp14:editId="404995CD">
+              <wp:anchor distT="0" distB="0" distL="114300" distR="114300" simplePos="0" relativeHeight="251735040" behindDoc="0" locked="0" layoutInCell="1" allowOverlap="1" wp14:anchorId="717212D6" wp14:editId="404995CD">
                 <wp:simplePos x="0" y="0"/>
                 <wp:positionH relativeFrom="column">
                   <wp:posOffset>1301750</wp:posOffset>
@@ -5082,7 +5109,7 @@
           </mc:Choice>
           <mc:Fallback>
             <w:pict>
-              <v:shape w14:anchorId="717212D6" id="Text Box 2" o:spid="_x0000_s1085" type="#_x0000_t202" style="position:absolute;left:0;text-align:left;margin-left:102.5pt;margin-top:185.8pt;width:80pt;height:27.45pt;z-index:251737088;visibility:visible;mso-wrap-style:square;mso-width-percent:0;mso-wrap-distance-left:9pt;mso-wrap-distance-top:0;mso-wrap-distance-right:9pt;mso-wrap-distance-bottom:0;mso-position-horizontal:absolute;mso-position-horizontal-relative:text;mso-position-vertical:absolute;mso-position-vertical-relative:text;mso-width-percent:0;mso-width-relative:margin;v-text-anchor:top" o:gfxdata="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" filled="f" stroked="f" strokeweight="1pt">
+              <v:shape w14:anchorId="717212D6" id="Text Box 2" o:spid="_x0000_s1085" type="#_x0000_t202" style="position:absolute;left:0;text-align:left;margin-left:102.5pt;margin-top:185.8pt;width:80pt;height:27.45pt;z-index:251735040;visibility:visible;mso-wrap-style:square;mso-width-percent:0;mso-wrap-distance-left:9pt;mso-wrap-distance-top:0;mso-wrap-distance-right:9pt;mso-wrap-distance-bottom:0;mso-position-horizontal:absolute;mso-position-horizontal-relative:text;mso-position-vertical:absolute;mso-position-vertical-relative:text;mso-width-percent:0;mso-width-relative:margin;v-text-anchor:top" o:gfxdata="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" filled="f" stroked="f" strokeweight="1pt">
                 <v:textbox style="mso-fit-shape-to-text:t" inset="0,0,0,0">
                   <w:txbxContent>
                     <w:p>
@@ -5115,7 +5142,7 @@
         <mc:AlternateContent>
           <mc:Choice Requires="wps">
             <w:drawing>
-              <wp:anchor distT="0" distB="0" distL="114300" distR="114300" simplePos="0" relativeHeight="251735040" behindDoc="0" locked="0" layoutInCell="1" allowOverlap="1" wp14:anchorId="76A9547C" wp14:editId="591AFECC">
+              <wp:anchor distT="0" distB="0" distL="114300" distR="114300" simplePos="0" relativeHeight="251732992" behindDoc="0" locked="0" layoutInCell="1" allowOverlap="1" wp14:anchorId="76A9547C" wp14:editId="591AFECC">
                 <wp:simplePos x="0" y="0"/>
                 <wp:positionH relativeFrom="column">
                   <wp:posOffset>1066800</wp:posOffset>
@@ -5177,7 +5204,7 @@
           </mc:Choice>
           <mc:Fallback>
             <w:pict>
-              <v:rect w14:anchorId="1125B6DD" id="Rectangle 265" o:spid="_x0000_s1026" style="position:absolute;margin-left:84pt;margin-top:176.5pt;width:277pt;height:27.5pt;z-index:251735040;visibility:visible;mso-wrap-style:square;mso-wrap-distance-left:9pt;mso-wrap-distance-top:0;mso-wrap-distance-right:9pt;mso-wrap-distance-bottom:0;mso-position-horizontal:absolute;mso-position-horizontal-relative:text;mso-position-vertical:absolute;mso-position-vertical-relative:text;v-text-anchor:middle" o:gfxdata="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" filled="f" strokecolor="#c00000" strokeweight="1.5pt"/>
+              <v:rect w14:anchorId="3E8E708C" id="Rectangle 265" o:spid="_x0000_s1026" style="position:absolute;margin-left:84pt;margin-top:176.5pt;width:277pt;height:27.5pt;z-index:251732992;visibility:visible;mso-wrap-style:square;mso-wrap-distance-left:9pt;mso-wrap-distance-top:0;mso-wrap-distance-right:9pt;mso-wrap-distance-bottom:0;mso-position-horizontal:absolute;mso-position-horizontal-relative:text;mso-position-vertical:absolute;mso-position-vertical-relative:text;v-text-anchor:middle" o:gfxdata="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" filled="f" strokecolor="#c00000" strokeweight="1.5pt"/>
             </w:pict>
           </mc:Fallback>
         </mc:AlternateContent>
@@ -5878,8 +5905,6 @@
         </w:rPr>
         <w:t>“screen_name</w:t>
       </w:r>
-      <w:bookmarkStart w:id="0" w:name="_GoBack"/>
-      <w:bookmarkEnd w:id="0"/>
       <w:r>
         <w:rPr>
           <w:rFonts w:asciiTheme="majorHAnsi" w:hAnsiTheme="majorHAnsi"/>
@@ -5928,12 +5953,14 @@
         </w:numPr>
         <w:rPr>
           <w:rFonts w:asciiTheme="majorHAnsi" w:hAnsiTheme="majorHAnsi"/>
-          <w:sz w:val="20"/>
-        </w:rPr>
-      </w:pPr>
-      <w:r>
-        <w:rPr>
-          <w:rFonts w:asciiTheme="majorHAnsi" w:hAnsiTheme="majorHAnsi"/>
+          <w:b/>
+          <w:sz w:val="20"/>
+        </w:rPr>
+      </w:pPr>
+      <w:r>
+        <w:rPr>
+          <w:rFonts w:asciiTheme="majorHAnsi" w:hAnsiTheme="majorHAnsi"/>
+          <w:b/>
           <w:sz w:val="20"/>
         </w:rPr>
         <w:t>Data aggregation</w:t>
@@ -5941,9 +5968,1544 @@
       <w:r>
         <w:rPr>
           <w:rFonts w:asciiTheme="majorHAnsi" w:hAnsiTheme="majorHAnsi"/>
+          <w:b/>
           <w:sz w:val="20"/>
         </w:rPr>
         <w:t>, storage and distribution</w:t>
+      </w:r>
+    </w:p>
+    <w:p>
+      <w:pPr>
+        <w:ind w:left="360"/>
+        <w:rPr>
+          <w:rFonts w:asciiTheme="majorHAnsi" w:hAnsiTheme="majorHAnsi"/>
+          <w:sz w:val="20"/>
+        </w:rPr>
+      </w:pPr>
+      <w:r>
+        <w:rPr>
+          <w:rFonts w:asciiTheme="majorHAnsi" w:hAnsiTheme="majorHAnsi"/>
+          <w:sz w:val="20"/>
+        </w:rPr>
+        <w:t xml:space="preserve">After acquired the data from twitter, the analytics server </w:t>
+      </w:r>
+      <w:r>
+        <w:rPr>
+          <w:rFonts w:asciiTheme="majorHAnsi" w:hAnsiTheme="majorHAnsi"/>
+          <w:sz w:val="20"/>
+        </w:rPr>
+        <w:t>will parse</w:t>
+      </w:r>
+      <w:r>
+        <w:rPr>
+          <w:rFonts w:asciiTheme="majorHAnsi" w:hAnsiTheme="majorHAnsi"/>
+          <w:sz w:val="20"/>
+        </w:rPr>
+        <w:t xml:space="preserve"> the JSON format</w:t>
+      </w:r>
+      <w:r>
+        <w:rPr>
+          <w:rFonts w:asciiTheme="majorHAnsi" w:hAnsiTheme="majorHAnsi"/>
+          <w:sz w:val="20"/>
+        </w:rPr>
+        <w:t xml:space="preserve"> data from twitter</w:t>
+      </w:r>
+      <w:r>
+        <w:rPr>
+          <w:rFonts w:asciiTheme="majorHAnsi" w:hAnsiTheme="majorHAnsi"/>
+          <w:sz w:val="20"/>
+        </w:rPr>
+        <w:t xml:space="preserve"> </w:t>
+      </w:r>
+      <w:r>
+        <w:rPr>
+          <w:rFonts w:asciiTheme="majorHAnsi" w:hAnsiTheme="majorHAnsi"/>
+          <w:sz w:val="20"/>
+        </w:rPr>
+        <w:t xml:space="preserve">into a human readable CSV file which is </w:t>
+      </w:r>
+      <w:r>
+        <w:rPr>
+          <w:rFonts w:asciiTheme="majorHAnsi" w:hAnsiTheme="majorHAnsi"/>
+          <w:sz w:val="20"/>
+        </w:rPr>
+        <w:t>compatible with ex</w:t>
+      </w:r>
+      <w:r>
+        <w:rPr>
+          <w:rFonts w:asciiTheme="majorHAnsi" w:hAnsiTheme="majorHAnsi"/>
+          <w:sz w:val="20"/>
+        </w:rPr>
+        <w:t>cel a</w:t>
+      </w:r>
+      <w:r>
+        <w:rPr>
+          <w:rFonts w:asciiTheme="majorHAnsi" w:hAnsiTheme="majorHAnsi"/>
+          <w:sz w:val="20"/>
+        </w:rPr>
+        <w:t>s well as any generic</w:t>
+      </w:r>
+      <w:r>
+        <w:rPr>
+          <w:rFonts w:asciiTheme="majorHAnsi" w:hAnsiTheme="majorHAnsi"/>
+          <w:sz w:val="20"/>
+        </w:rPr>
+        <w:t xml:space="preserve"> text editor</w:t>
+      </w:r>
+      <w:r>
+        <w:rPr>
+          <w:rFonts w:asciiTheme="majorHAnsi" w:hAnsiTheme="majorHAnsi"/>
+          <w:sz w:val="20"/>
+        </w:rPr>
+        <w:t xml:space="preserve">. </w:t>
+      </w:r>
+      <w:r>
+        <w:rPr>
+          <w:rFonts w:asciiTheme="majorHAnsi" w:hAnsiTheme="majorHAnsi"/>
+          <w:sz w:val="20"/>
+        </w:rPr>
+        <w:t xml:space="preserve">The structure of the </w:t>
+      </w:r>
+      <w:r>
+        <w:rPr>
+          <w:rFonts w:asciiTheme="majorHAnsi" w:hAnsiTheme="majorHAnsi"/>
+          <w:sz w:val="20"/>
+        </w:rPr>
+        <w:t>CSV</w:t>
+      </w:r>
+      <w:r>
+        <w:rPr>
+          <w:rFonts w:asciiTheme="majorHAnsi" w:hAnsiTheme="majorHAnsi"/>
+          <w:sz w:val="20"/>
+        </w:rPr>
+        <w:t xml:space="preserve"> file is quite self-</w:t>
+      </w:r>
+      <w:r>
+        <w:rPr>
+          <w:rFonts w:asciiTheme="majorHAnsi" w:hAnsiTheme="majorHAnsi"/>
+          <w:sz w:val="20"/>
+        </w:rPr>
+        <w:t>explanatory</w:t>
+      </w:r>
+      <w:r>
+        <w:rPr>
+          <w:rFonts w:asciiTheme="majorHAnsi" w:hAnsiTheme="majorHAnsi"/>
+          <w:sz w:val="20"/>
+        </w:rPr>
+        <w:t xml:space="preserve">. The header row </w:t>
+      </w:r>
+      <w:r>
+        <w:rPr>
+          <w:rFonts w:asciiTheme="majorHAnsi" w:hAnsiTheme="majorHAnsi"/>
+          <w:sz w:val="20"/>
+        </w:rPr>
+        <w:t>is the field/label</w:t>
+      </w:r>
+      <w:r>
+        <w:rPr>
+          <w:rFonts w:asciiTheme="majorHAnsi" w:hAnsiTheme="majorHAnsi"/>
+          <w:sz w:val="20"/>
+        </w:rPr>
+        <w:t xml:space="preserve">, for example: </w:t>
+      </w:r>
+      <w:r>
+        <w:rPr>
+          <w:rFonts w:asciiTheme="majorHAnsi" w:hAnsiTheme="majorHAnsi"/>
+          <w:sz w:val="20"/>
+        </w:rPr>
+        <w:t>“</w:t>
+      </w:r>
+      <w:r>
+        <w:rPr>
+          <w:rFonts w:asciiTheme="majorHAnsi" w:hAnsiTheme="majorHAnsi"/>
+          <w:sz w:val="20"/>
+        </w:rPr>
+        <w:t>text</w:t>
+      </w:r>
+      <w:r>
+        <w:rPr>
+          <w:rFonts w:asciiTheme="majorHAnsi" w:hAnsiTheme="majorHAnsi"/>
+          <w:sz w:val="20"/>
+        </w:rPr>
+        <w:t>”</w:t>
+      </w:r>
+      <w:r>
+        <w:rPr>
+          <w:rFonts w:asciiTheme="majorHAnsi" w:hAnsiTheme="majorHAnsi"/>
+          <w:sz w:val="20"/>
+        </w:rPr>
+        <w:t xml:space="preserve">, </w:t>
+      </w:r>
+      <w:r>
+        <w:rPr>
+          <w:rFonts w:asciiTheme="majorHAnsi" w:hAnsiTheme="majorHAnsi"/>
+          <w:sz w:val="20"/>
+        </w:rPr>
+        <w:t>“</w:t>
+      </w:r>
+      <w:r>
+        <w:rPr>
+          <w:rFonts w:asciiTheme="majorHAnsi" w:hAnsiTheme="majorHAnsi"/>
+          <w:sz w:val="20"/>
+        </w:rPr>
+        <w:t>created_at</w:t>
+      </w:r>
+      <w:r>
+        <w:rPr>
+          <w:rFonts w:asciiTheme="majorHAnsi" w:hAnsiTheme="majorHAnsi"/>
+          <w:sz w:val="20"/>
+        </w:rPr>
+        <w:t>”</w:t>
+      </w:r>
+      <w:r>
+        <w:rPr>
+          <w:rFonts w:asciiTheme="majorHAnsi" w:hAnsiTheme="majorHAnsi"/>
+          <w:sz w:val="20"/>
+        </w:rPr>
+        <w:t xml:space="preserve">, </w:t>
+      </w:r>
+      <w:r>
+        <w:rPr>
+          <w:rFonts w:asciiTheme="majorHAnsi" w:hAnsiTheme="majorHAnsi"/>
+          <w:sz w:val="20"/>
+        </w:rPr>
+        <w:t>“</w:t>
+      </w:r>
+      <w:r>
+        <w:rPr>
+          <w:rFonts w:asciiTheme="majorHAnsi" w:hAnsiTheme="majorHAnsi"/>
+          <w:sz w:val="20"/>
+        </w:rPr>
+        <w:t>id</w:t>
+      </w:r>
+      <w:r>
+        <w:rPr>
+          <w:rFonts w:asciiTheme="majorHAnsi" w:hAnsiTheme="majorHAnsi"/>
+          <w:sz w:val="20"/>
+        </w:rPr>
+        <w:t>”</w:t>
+      </w:r>
+      <w:r>
+        <w:rPr>
+          <w:rFonts w:asciiTheme="majorHAnsi" w:hAnsiTheme="majorHAnsi"/>
+          <w:sz w:val="20"/>
+        </w:rPr>
+        <w:t xml:space="preserve">, </w:t>
+      </w:r>
+      <w:r>
+        <w:rPr>
+          <w:rFonts w:asciiTheme="majorHAnsi" w:hAnsiTheme="majorHAnsi"/>
+          <w:sz w:val="20"/>
+        </w:rPr>
+        <w:t>“</w:t>
+      </w:r>
+      <w:r>
+        <w:rPr>
+          <w:rFonts w:asciiTheme="majorHAnsi" w:hAnsiTheme="majorHAnsi"/>
+          <w:sz w:val="20"/>
+        </w:rPr>
+        <w:t>user.location</w:t>
+      </w:r>
+      <w:r>
+        <w:rPr>
+          <w:rFonts w:asciiTheme="majorHAnsi" w:hAnsiTheme="majorHAnsi"/>
+          <w:sz w:val="20"/>
+        </w:rPr>
+        <w:t>”</w:t>
+      </w:r>
+      <w:r>
+        <w:rPr>
+          <w:rFonts w:asciiTheme="majorHAnsi" w:hAnsiTheme="majorHAnsi"/>
+          <w:sz w:val="20"/>
+        </w:rPr>
+        <w:t xml:space="preserve"> and etc.,</w:t>
+      </w:r>
+      <w:r>
+        <w:rPr>
+          <w:rFonts w:asciiTheme="majorHAnsi" w:hAnsiTheme="majorHAnsi"/>
+          <w:sz w:val="20"/>
+        </w:rPr>
+        <w:t xml:space="preserve"> and </w:t>
+      </w:r>
+      <w:r>
+        <w:rPr>
+          <w:rFonts w:asciiTheme="majorHAnsi" w:hAnsiTheme="majorHAnsi"/>
+          <w:sz w:val="20"/>
+        </w:rPr>
+        <w:t>each</w:t>
+      </w:r>
+      <w:r>
+        <w:rPr>
+          <w:rFonts w:asciiTheme="majorHAnsi" w:hAnsiTheme="majorHAnsi"/>
+          <w:sz w:val="20"/>
+        </w:rPr>
+        <w:t xml:space="preserve"> row is one tweet.</w:t>
+      </w:r>
+      <w:r>
+        <w:rPr>
+          <w:rFonts w:asciiTheme="majorHAnsi" w:hAnsiTheme="majorHAnsi"/>
+          <w:sz w:val="20"/>
+        </w:rPr>
+        <w:t xml:space="preserve"> </w:t>
+      </w:r>
+      <w:r>
+        <w:rPr>
+          <w:rFonts w:asciiTheme="majorHAnsi" w:hAnsiTheme="majorHAnsi"/>
+          <w:sz w:val="20"/>
+        </w:rPr>
+        <w:t>The CSV</w:t>
+      </w:r>
+      <w:r>
+        <w:rPr>
+          <w:rFonts w:asciiTheme="majorHAnsi" w:hAnsiTheme="majorHAnsi"/>
+          <w:sz w:val="20"/>
+        </w:rPr>
+        <w:t xml:space="preserve"> file will be </w:t>
+      </w:r>
+      <w:r>
+        <w:rPr>
+          <w:rFonts w:asciiTheme="majorHAnsi" w:hAnsiTheme="majorHAnsi"/>
+          <w:sz w:val="20"/>
+          <w:u w:val="dotted"/>
+        </w:rPr>
+        <w:t>named</w:t>
+      </w:r>
+      <w:r>
+        <w:rPr>
+          <w:rFonts w:asciiTheme="majorHAnsi" w:hAnsiTheme="majorHAnsi"/>
+          <w:sz w:val="20"/>
+          <w:u w:val="dotted"/>
+        </w:rPr>
+        <w:t xml:space="preserve"> by user</w:t>
+      </w:r>
+      <w:r>
+        <w:rPr>
+          <w:rFonts w:asciiTheme="majorHAnsi" w:hAnsiTheme="majorHAnsi"/>
+          <w:sz w:val="20"/>
+        </w:rPr>
+        <w:t xml:space="preserve">, and </w:t>
+      </w:r>
+      <w:r>
+        <w:rPr>
+          <w:rFonts w:asciiTheme="majorHAnsi" w:hAnsiTheme="majorHAnsi"/>
+          <w:sz w:val="20"/>
+          <w:u w:val="dotted"/>
+        </w:rPr>
+        <w:t>stored in the corresponding session folder of user’s home directory on the socialmediamacroscope.org</w:t>
+      </w:r>
+      <w:r>
+        <w:rPr>
+          <w:rFonts w:asciiTheme="majorHAnsi" w:hAnsiTheme="majorHAnsi"/>
+          <w:sz w:val="20"/>
+        </w:rPr>
+        <w:t xml:space="preserve">.  </w:t>
+      </w:r>
+      <w:r>
+        <w:rPr>
+          <w:rFonts w:asciiTheme="majorHAnsi" w:hAnsiTheme="majorHAnsi"/>
+          <w:sz w:val="20"/>
+        </w:rPr>
+        <w:t>D</w:t>
+      </w:r>
+      <w:r>
+        <w:rPr>
+          <w:rFonts w:asciiTheme="majorHAnsi" w:hAnsiTheme="majorHAnsi"/>
+          <w:sz w:val="20"/>
+        </w:rPr>
+        <w:t xml:space="preserve">ue to security </w:t>
+      </w:r>
+      <w:r>
+        <w:rPr>
+          <w:rFonts w:asciiTheme="majorHAnsi" w:hAnsiTheme="majorHAnsi"/>
+          <w:sz w:val="20"/>
+        </w:rPr>
+        <w:t>concerns,</w:t>
+      </w:r>
+      <w:r>
+        <w:rPr>
+          <w:rFonts w:asciiTheme="majorHAnsi" w:hAnsiTheme="majorHAnsi"/>
+          <w:sz w:val="20"/>
+        </w:rPr>
+        <w:t xml:space="preserve"> d</w:t>
+      </w:r>
+      <w:r>
+        <w:rPr>
+          <w:rFonts w:asciiTheme="majorHAnsi" w:hAnsiTheme="majorHAnsi"/>
+          <w:sz w:val="20"/>
+        </w:rPr>
+        <w:t>irect acces</w:t>
+      </w:r>
+      <w:r>
+        <w:rPr>
+          <w:rFonts w:asciiTheme="majorHAnsi" w:hAnsiTheme="majorHAnsi"/>
+          <w:sz w:val="20"/>
+        </w:rPr>
+        <w:t xml:space="preserve">s to </w:t>
+      </w:r>
+      <w:r>
+        <w:rPr>
+          <w:rFonts w:asciiTheme="majorHAnsi" w:hAnsiTheme="majorHAnsi"/>
+          <w:sz w:val="20"/>
+        </w:rPr>
+        <w:t xml:space="preserve">the </w:t>
+      </w:r>
+      <w:r>
+        <w:rPr>
+          <w:rFonts w:asciiTheme="majorHAnsi" w:hAnsiTheme="majorHAnsi"/>
+          <w:sz w:val="20"/>
+        </w:rPr>
+        <w:t xml:space="preserve">session folder is only </w:t>
+      </w:r>
+      <w:r>
+        <w:rPr>
+          <w:rFonts w:asciiTheme="majorHAnsi" w:hAnsiTheme="majorHAnsi"/>
+          <w:sz w:val="20"/>
+        </w:rPr>
+        <w:t>for</w:t>
+      </w:r>
+      <w:r>
+        <w:rPr>
+          <w:rFonts w:asciiTheme="majorHAnsi" w:hAnsiTheme="majorHAnsi"/>
+          <w:sz w:val="20"/>
+        </w:rPr>
+        <w:t xml:space="preserve"> the</w:t>
+      </w:r>
+      <w:r>
+        <w:rPr>
+          <w:rFonts w:asciiTheme="majorHAnsi" w:hAnsiTheme="majorHAnsi"/>
+          <w:sz w:val="20"/>
+        </w:rPr>
+        <w:t xml:space="preserve"> website</w:t>
+      </w:r>
+      <w:r>
+        <w:rPr>
+          <w:rFonts w:asciiTheme="majorHAnsi" w:hAnsiTheme="majorHAnsi"/>
+          <w:sz w:val="20"/>
+        </w:rPr>
+        <w:t xml:space="preserve"> </w:t>
+      </w:r>
+      <w:r>
+        <w:rPr>
+          <w:rFonts w:asciiTheme="majorHAnsi" w:hAnsiTheme="majorHAnsi"/>
+          <w:sz w:val="20"/>
+        </w:rPr>
+        <w:t>administra</w:t>
+      </w:r>
+      <w:r>
+        <w:rPr>
+          <w:rFonts w:asciiTheme="majorHAnsi" w:hAnsiTheme="majorHAnsi"/>
+          <w:sz w:val="20"/>
+        </w:rPr>
+        <w:t>tor</w:t>
+      </w:r>
+      <w:r>
+        <w:rPr>
+          <w:rFonts w:asciiTheme="majorHAnsi" w:hAnsiTheme="majorHAnsi"/>
+          <w:sz w:val="20"/>
+        </w:rPr>
+        <w:t>, application developer</w:t>
+      </w:r>
+      <w:r>
+        <w:rPr>
+          <w:rFonts w:asciiTheme="majorHAnsi" w:hAnsiTheme="majorHAnsi"/>
+          <w:sz w:val="20"/>
+        </w:rPr>
+        <w:t>, but</w:t>
+      </w:r>
+      <w:r>
+        <w:rPr>
+          <w:rFonts w:asciiTheme="majorHAnsi" w:hAnsiTheme="majorHAnsi"/>
+          <w:sz w:val="20"/>
+        </w:rPr>
+        <w:t xml:space="preserve"> not to </w:t>
+      </w:r>
+      <w:r>
+        <w:rPr>
+          <w:rFonts w:asciiTheme="majorHAnsi" w:hAnsiTheme="majorHAnsi"/>
+          <w:sz w:val="20"/>
+        </w:rPr>
+        <w:t>the</w:t>
+      </w:r>
+      <w:r>
+        <w:rPr>
+          <w:rFonts w:asciiTheme="majorHAnsi" w:hAnsiTheme="majorHAnsi"/>
+          <w:sz w:val="20"/>
+        </w:rPr>
+        <w:t xml:space="preserve"> end user</w:t>
+      </w:r>
+      <w:r>
+        <w:rPr>
+          <w:rFonts w:asciiTheme="majorHAnsi" w:hAnsiTheme="majorHAnsi"/>
+          <w:sz w:val="20"/>
+        </w:rPr>
+        <w:t xml:space="preserve">. </w:t>
+      </w:r>
+      <w:r>
+        <w:rPr>
+          <w:rFonts w:asciiTheme="majorHAnsi" w:hAnsiTheme="majorHAnsi"/>
+          <w:sz w:val="20"/>
+        </w:rPr>
+        <w:t>However,</w:t>
+      </w:r>
+      <w:r>
+        <w:rPr>
+          <w:rFonts w:asciiTheme="majorHAnsi" w:hAnsiTheme="majorHAnsi"/>
+          <w:sz w:val="20"/>
+        </w:rPr>
+        <w:t xml:space="preserve"> in-situ (in-page) download is available, </w:t>
+      </w:r>
+      <w:r>
+        <w:rPr>
+          <w:rFonts w:asciiTheme="majorHAnsi" w:hAnsiTheme="majorHAnsi"/>
+          <w:sz w:val="20"/>
+        </w:rPr>
+        <w:t>meanwhile</w:t>
+      </w:r>
+      <w:r>
+        <w:rPr>
+          <w:rFonts w:asciiTheme="majorHAnsi" w:hAnsiTheme="majorHAnsi"/>
+          <w:sz w:val="20"/>
+        </w:rPr>
+        <w:t xml:space="preserve"> </w:t>
+      </w:r>
+      <w:r>
+        <w:rPr>
+          <w:rFonts w:asciiTheme="majorHAnsi" w:hAnsiTheme="majorHAnsi"/>
+          <w:sz w:val="20"/>
+        </w:rPr>
+        <w:t xml:space="preserve">the past search results can be found </w:t>
+      </w:r>
+      <w:r>
+        <w:rPr>
+          <w:rFonts w:asciiTheme="majorHAnsi" w:hAnsiTheme="majorHAnsi"/>
+          <w:sz w:val="20"/>
+        </w:rPr>
+        <w:t xml:space="preserve">in the history page. </w:t>
+      </w:r>
+    </w:p>
+    <w:p>
+      <w:pPr>
+        <w:ind w:left="360"/>
+        <w:rPr>
+          <w:rFonts w:asciiTheme="majorHAnsi" w:hAnsiTheme="majorHAnsi"/>
+          <w:sz w:val="20"/>
+        </w:rPr>
+      </w:pPr>
+      <w:r>
+        <w:rPr>
+          <w:rFonts w:asciiTheme="majorHAnsi" w:hAnsiTheme="majorHAnsi"/>
+          <w:noProof/>
+          <w:sz w:val="20"/>
+        </w:rPr>
+        <mc:AlternateContent>
+          <mc:Choice Requires="wpg">
+            <w:drawing>
+              <wp:anchor distT="0" distB="0" distL="114300" distR="114300" simplePos="0" relativeHeight="251738112" behindDoc="0" locked="0" layoutInCell="1" allowOverlap="1">
+                <wp:simplePos x="0" y="0"/>
+                <wp:positionH relativeFrom="column">
+                  <wp:posOffset>317500</wp:posOffset>
+                </wp:positionH>
+                <wp:positionV relativeFrom="paragraph">
+                  <wp:posOffset>864870</wp:posOffset>
+                </wp:positionV>
+                <wp:extent cx="5937250" cy="1143000"/>
+                <wp:effectExtent l="133350" t="114300" r="158750" b="171450"/>
+                <wp:wrapTopAndBottom/>
+                <wp:docPr id="283" name="Group 283"/>
+                <wp:cNvGraphicFramePr/>
+                <a:graphic xmlns:a="http://schemas.openxmlformats.org/drawingml/2006/main">
+                  <a:graphicData uri="http://schemas.microsoft.com/office/word/2010/wordprocessingGroup">
+                    <wpg:wgp>
+                      <wpg:cNvGrpSpPr/>
+                      <wpg:grpSpPr>
+                        <a:xfrm>
+                          <a:off x="0" y="0"/>
+                          <a:ext cx="5937250" cy="1143000"/>
+                          <a:chOff x="0" y="0"/>
+                          <a:chExt cx="6089015" cy="1264920"/>
+                        </a:xfrm>
+                      </wpg:grpSpPr>
+                      <pic:pic xmlns:pic="http://schemas.openxmlformats.org/drawingml/2006/picture">
+                        <pic:nvPicPr>
+                          <pic:cNvPr id="275" name="Picture 275"/>
+                          <pic:cNvPicPr>
+                            <a:picLocks noChangeAspect="1"/>
+                          </pic:cNvPicPr>
+                        </pic:nvPicPr>
+                        <pic:blipFill rotWithShape="1">
+                          <a:blip r:embed="rId24">
+                            <a:extLst>
+                              <a:ext uri="{28A0092B-C50C-407E-A947-70E740481C1C}">
+                                <a14:useLocalDpi xmlns:a14="http://schemas.microsoft.com/office/drawing/2010/main" val="0"/>
+                              </a:ext>
+                            </a:extLst>
+                          </a:blip>
+                          <a:srcRect t="2149" r="2148"/>
+                          <a:stretch/>
+                        </pic:blipFill>
+                        <pic:spPr bwMode="auto">
+                          <a:xfrm>
+                            <a:off x="3244850" y="0"/>
+                            <a:ext cx="2844165" cy="1263650"/>
+                          </a:xfrm>
+                          <a:prstGeom prst="rect">
+                            <a:avLst/>
+                          </a:prstGeom>
+                          <a:solidFill>
+                            <a:srgbClr val="FFFFFF">
+                              <a:shade val="85000"/>
+                            </a:srgbClr>
+                          </a:solidFill>
+                          <a:ln w="88900" cap="sq">
+                            <a:solidFill>
+                              <a:srgbClr val="FFFFFF"/>
+                            </a:solidFill>
+                            <a:miter lim="800000"/>
+                          </a:ln>
+                          <a:effectLst>
+                            <a:outerShdw blurRad="55000" dist="18000" dir="5400000" algn="tl" rotWithShape="0">
+                              <a:srgbClr val="000000">
+                                <a:alpha val="40000"/>
+                              </a:srgbClr>
+                            </a:outerShdw>
+                          </a:effectLst>
+                          <a:scene3d>
+                            <a:camera prst="orthographicFront"/>
+                            <a:lightRig rig="twoPt" dir="t">
+                              <a:rot lat="0" lon="0" rev="7200000"/>
+                            </a:lightRig>
+                          </a:scene3d>
+                          <a:sp3d>
+                            <a:bevelT w="25400" h="19050"/>
+                            <a:contourClr>
+                              <a:srgbClr val="FFFFFF"/>
+                            </a:contourClr>
+                          </a:sp3d>
+                          <a:extLst>
+                            <a:ext uri="{53640926-AAD7-44D8-BBD7-CCE9431645EC}">
+                              <a14:shadowObscured xmlns:a14="http://schemas.microsoft.com/office/drawing/2010/main"/>
+                            </a:ext>
+                          </a:extLst>
+                        </pic:spPr>
+                      </pic:pic>
+                      <pic:pic xmlns:pic="http://schemas.openxmlformats.org/drawingml/2006/picture">
+                        <pic:nvPicPr>
+                          <pic:cNvPr id="273" name="Picture 273"/>
+                          <pic:cNvPicPr>
+                            <a:picLocks noChangeAspect="1"/>
+                          </pic:cNvPicPr>
+                        </pic:nvPicPr>
+                        <pic:blipFill>
+                          <a:blip r:embed="rId25">
+                            <a:extLst>
+                              <a:ext uri="{28A0092B-C50C-407E-A947-70E740481C1C}">
+                                <a14:useLocalDpi xmlns:a14="http://schemas.microsoft.com/office/drawing/2010/main" val="0"/>
+                              </a:ext>
+                            </a:extLst>
+                          </a:blip>
+                          <a:stretch>
+                            <a:fillRect/>
+                          </a:stretch>
+                        </pic:blipFill>
+                        <pic:spPr>
+                          <a:xfrm>
+                            <a:off x="0" y="19050"/>
+                            <a:ext cx="2895600" cy="1245870"/>
+                          </a:xfrm>
+                          <a:prstGeom prst="rect">
+                            <a:avLst/>
+                          </a:prstGeom>
+                          <a:solidFill>
+                            <a:srgbClr val="FFFFFF">
+                              <a:shade val="85000"/>
+                            </a:srgbClr>
+                          </a:solidFill>
+                          <a:ln w="88900" cap="sq">
+                            <a:solidFill>
+                              <a:srgbClr val="FFFFFF"/>
+                            </a:solidFill>
+                            <a:miter lim="800000"/>
+                          </a:ln>
+                          <a:effectLst>
+                            <a:outerShdw blurRad="55000" dist="18000" dir="5400000" algn="tl" rotWithShape="0">
+                              <a:srgbClr val="000000">
+                                <a:alpha val="40000"/>
+                              </a:srgbClr>
+                            </a:outerShdw>
+                          </a:effectLst>
+                          <a:scene3d>
+                            <a:camera prst="orthographicFront"/>
+                            <a:lightRig rig="twoPt" dir="t">
+                              <a:rot lat="0" lon="0" rev="7200000"/>
+                            </a:lightRig>
+                          </a:scene3d>
+                          <a:sp3d>
+                            <a:bevelT w="25400" h="19050"/>
+                            <a:contourClr>
+                              <a:srgbClr val="FFFFFF"/>
+                            </a:contourClr>
+                          </a:sp3d>
+                        </pic:spPr>
+                      </pic:pic>
+                    </wpg:wgp>
+                  </a:graphicData>
+                </a:graphic>
+                <wp14:sizeRelH relativeFrom="margin">
+                  <wp14:pctWidth>0</wp14:pctWidth>
+                </wp14:sizeRelH>
+                <wp14:sizeRelV relativeFrom="margin">
+                  <wp14:pctHeight>0</wp14:pctHeight>
+                </wp14:sizeRelV>
+              </wp:anchor>
+            </w:drawing>
+          </mc:Choice>
+          <mc:Fallback>
+            <w:pict>
+              <v:group w14:anchorId="7F917391" id="Group 283" o:spid="_x0000_s1026" style="position:absolute;margin-left:25pt;margin-top:68.1pt;width:467.5pt;height:90pt;z-index:251738112;mso-width-relative:margin;mso-height-relative:margin" coordsize="60890,12649" o:gfxdata="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">
+                <v:shape id="Picture 275" o:spid="_x0000_s1027" type="#_x0000_t75" style="position:absolute;left:32448;width:28442;height:12636;visibility:visible;mso-wrap-style:square" o:gfxdata="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" filled="t" fillcolor="#ededed" stroked="t" strokecolor="white" strokeweight="7pt">
+                  <v:stroke endcap="square"/>
+                  <v:imagedata r:id="rId26" o:title="" croptop="1408f" cropright="1408f"/>
+                  <v:shadow on="t" color="black" opacity="26214f" origin="-.5,-.5" offset="0,.5mm"/>
+                  <v:path arrowok="t"/>
+                </v:shape>
+                <v:shape id="Picture 273" o:spid="_x0000_s1028" type="#_x0000_t75" style="position:absolute;top:190;width:28956;height:12459;visibility:visible;mso-wrap-style:square" o:gfxdata="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" filled="t" fillcolor="#ededed" stroked="t" strokecolor="white" strokeweight="7pt">
+                  <v:stroke endcap="square"/>
+                  <v:imagedata r:id="rId27" o:title=""/>
+                  <v:shadow on="t" color="black" opacity="26214f" origin="-.5,-.5" offset="0,.5mm"/>
+                  <v:path arrowok="t"/>
+                </v:shape>
+                <w10:wrap type="topAndBottom"/>
+              </v:group>
+            </w:pict>
+          </mc:Fallback>
+        </mc:AlternateContent>
+      </w:r>
+      <w:r>
+        <w:rPr>
+          <w:rFonts w:asciiTheme="majorHAnsi" w:hAnsiTheme="majorHAnsi"/>
+          <w:sz w:val="20"/>
+        </w:rPr>
+        <w:t xml:space="preserve">Once you click the </w:t>
+      </w:r>
+      <w:r>
+        <w:rPr>
+          <w:noProof/>
+        </w:rPr>
+        <w:drawing>
+          <wp:inline distT="0" distB="0" distL="0" distR="0" wp14:anchorId="16ABE233" wp14:editId="3F2DA887">
+            <wp:extent cx="558800" cy="188433"/>
+            <wp:effectExtent l="0" t="0" r="0" b="2540"/>
+            <wp:docPr id="272" name="Picture 272"/>
+            <wp:cNvGraphicFramePr>
+              <a:graphicFrameLocks xmlns:a="http://schemas.openxmlformats.org/drawingml/2006/main" noChangeAspect="1"/>
+            </wp:cNvGraphicFramePr>
+            <a:graphic xmlns:a="http://schemas.openxmlformats.org/drawingml/2006/main">
+              <a:graphicData uri="http://schemas.openxmlformats.org/drawingml/2006/picture">
+                <pic:pic xmlns:pic="http://schemas.openxmlformats.org/drawingml/2006/picture">
+                  <pic:nvPicPr>
+                    <pic:cNvPr id="1" name=""/>
+                    <pic:cNvPicPr/>
+                  </pic:nvPicPr>
+                  <pic:blipFill>
+                    <a:blip r:embed="rId28"/>
+                    <a:stretch>
+                      <a:fillRect/>
+                    </a:stretch>
+                  </pic:blipFill>
+                  <pic:spPr>
+                    <a:xfrm>
+                      <a:off x="0" y="0"/>
+                      <a:ext cx="581906" cy="196225"/>
+                    </a:xfrm>
+                    <a:prstGeom prst="rect">
+                      <a:avLst/>
+                    </a:prstGeom>
+                  </pic:spPr>
+                </pic:pic>
+              </a:graphicData>
+            </a:graphic>
+          </wp:inline>
+        </w:drawing>
+      </w:r>
+      <w:r>
+        <w:rPr>
+          <w:rFonts w:asciiTheme="majorHAnsi" w:hAnsiTheme="majorHAnsi"/>
+          <w:sz w:val="20"/>
+        </w:rPr>
+        <w:t xml:space="preserve"> button, a popup modal that prompts you to name the csv file will show up. </w:t>
+      </w:r>
+      <w:r>
+        <w:rPr>
+          <w:rFonts w:asciiTheme="majorHAnsi" w:hAnsiTheme="majorHAnsi"/>
+          <w:sz w:val="20"/>
+        </w:rPr>
+        <w:t>Keep in mind</w:t>
+      </w:r>
+      <w:r>
+        <w:rPr>
+          <w:rFonts w:asciiTheme="majorHAnsi" w:hAnsiTheme="majorHAnsi"/>
+          <w:sz w:val="20"/>
+        </w:rPr>
+        <w:t xml:space="preserve"> that a legal filename s</w:t>
+      </w:r>
+      <w:r>
+        <w:rPr>
+          <w:rFonts w:asciiTheme="majorHAnsi" w:hAnsiTheme="majorHAnsi"/>
+          <w:sz w:val="20"/>
+        </w:rPr>
+        <w:t xml:space="preserve">hould only include </w:t>
+      </w:r>
+      <w:r>
+        <w:rPr>
+          <w:rFonts w:asciiTheme="majorHAnsi" w:hAnsiTheme="majorHAnsi"/>
+          <w:sz w:val="20"/>
+        </w:rPr>
+        <w:t>alphabet, n</w:t>
+      </w:r>
+      <w:r>
+        <w:rPr>
+          <w:rFonts w:asciiTheme="majorHAnsi" w:hAnsiTheme="majorHAnsi"/>
+          <w:sz w:val="20"/>
+        </w:rPr>
+        <w:t xml:space="preserve">umber, </w:t>
+      </w:r>
+      <w:r>
+        <w:rPr>
+          <w:rFonts w:asciiTheme="majorHAnsi" w:hAnsiTheme="majorHAnsi"/>
+          <w:sz w:val="20"/>
+        </w:rPr>
+        <w:t>underscore and dash</w:t>
+      </w:r>
+      <w:r>
+        <w:rPr>
+          <w:rFonts w:asciiTheme="majorHAnsi" w:hAnsiTheme="majorHAnsi"/>
+          <w:sz w:val="20"/>
+        </w:rPr>
+        <w:t>; and please don’t include the file extension</w:t>
+      </w:r>
+      <w:r>
+        <w:rPr>
+          <w:rFonts w:asciiTheme="majorHAnsi" w:hAnsiTheme="majorHAnsi"/>
+          <w:sz w:val="20"/>
+        </w:rPr>
+        <w:t xml:space="preserve">. If you have already named another file </w:t>
+      </w:r>
+      <w:r>
+        <w:rPr>
+          <w:rFonts w:asciiTheme="majorHAnsi" w:hAnsiTheme="majorHAnsi"/>
+          <w:sz w:val="20"/>
+        </w:rPr>
+        <w:t>using</w:t>
+      </w:r>
+      <w:r>
+        <w:rPr>
+          <w:rFonts w:asciiTheme="majorHAnsi" w:hAnsiTheme="majorHAnsi"/>
+          <w:sz w:val="20"/>
+        </w:rPr>
+        <w:t xml:space="preserve"> the same name </w:t>
+      </w:r>
+      <w:r>
+        <w:rPr>
+          <w:rFonts w:asciiTheme="majorHAnsi" w:hAnsiTheme="majorHAnsi"/>
+          <w:sz w:val="20"/>
+        </w:rPr>
+        <w:t>in</w:t>
+      </w:r>
+      <w:r>
+        <w:rPr>
+          <w:rFonts w:asciiTheme="majorHAnsi" w:hAnsiTheme="majorHAnsi"/>
+          <w:sz w:val="20"/>
+        </w:rPr>
+        <w:t xml:space="preserve"> the same session, an alert to remind </w:t>
+      </w:r>
+      <w:r>
+        <w:rPr>
+          <w:rFonts w:asciiTheme="majorHAnsi" w:hAnsiTheme="majorHAnsi"/>
+          <w:sz w:val="20"/>
+        </w:rPr>
+        <w:t>you rename the file will appear (</w:t>
+      </w:r>
+      <w:r>
+        <w:rPr>
+          <w:rFonts w:asciiTheme="majorHAnsi" w:hAnsiTheme="majorHAnsi"/>
+          <w:sz w:val="20"/>
+        </w:rPr>
+        <w:t>Figure</w:t>
+      </w:r>
+      <w:r>
+        <w:rPr>
+          <w:rFonts w:asciiTheme="majorHAnsi" w:hAnsiTheme="majorHAnsi"/>
+          <w:sz w:val="20"/>
+        </w:rPr>
+        <w:t xml:space="preserve"> 5).</w:t>
+      </w:r>
+    </w:p>
+    <w:p>
+      <w:pPr>
+        <w:ind w:left="360"/>
+        <w:jc w:val="center"/>
+        <w:rPr>
+          <w:noProof/>
+        </w:rPr>
+      </w:pPr>
+      <w:r>
+        <w:rPr>
+          <w:rFonts w:asciiTheme="majorHAnsi" w:hAnsiTheme="majorHAnsi"/>
+          <w:b/>
+          <w:sz w:val="20"/>
+        </w:rPr>
+        <w:t>Figure 5.</w:t>
+      </w:r>
+      <w:r>
+        <w:rPr>
+          <w:rFonts w:asciiTheme="majorHAnsi" w:hAnsiTheme="majorHAnsi"/>
+          <w:sz w:val="20"/>
+        </w:rPr>
+        <w:t xml:space="preserve"> Saving the search result</w:t>
+      </w:r>
+    </w:p>
+    <w:p>
+      <w:pPr>
+        <w:ind w:left="360"/>
+        <w:rPr>
+          <w:rFonts w:asciiTheme="majorHAnsi" w:hAnsiTheme="majorHAnsi"/>
+          <w:sz w:val="20"/>
+        </w:rPr>
+      </w:pPr>
+      <w:r>
+        <w:rPr>
+          <w:rFonts w:asciiTheme="majorHAnsi" w:hAnsiTheme="majorHAnsi"/>
+          <w:sz w:val="20"/>
+        </w:rPr>
+        <w:t>If the query has performed successfully, you will s</w:t>
+      </w:r>
+      <w:r>
+        <w:rPr>
+          <w:rFonts w:asciiTheme="majorHAnsi" w:hAnsiTheme="majorHAnsi"/>
+          <w:sz w:val="20"/>
+        </w:rPr>
+        <w:t>ee a d</w:t>
+      </w:r>
+      <w:r>
+        <w:rPr>
+          <w:rFonts w:asciiTheme="majorHAnsi" w:hAnsiTheme="majorHAnsi"/>
+          <w:sz w:val="20"/>
+        </w:rPr>
+        <w:t xml:space="preserve">ownload modal popping </w:t>
+      </w:r>
+      <w:r>
+        <w:rPr>
+          <w:rFonts w:asciiTheme="majorHAnsi" w:hAnsiTheme="majorHAnsi"/>
+          <w:sz w:val="20"/>
+        </w:rPr>
+        <w:t xml:space="preserve">up with a “DOWNLOAD XXXXX.csv” link. You’ll have the whole access as well as the ownership of this twitter data. </w:t>
+      </w:r>
+      <w:r>
+        <w:rPr>
+          <w:rFonts w:asciiTheme="majorHAnsi" w:hAnsiTheme="majorHAnsi"/>
+          <w:sz w:val="20"/>
+        </w:rPr>
+        <w:t xml:space="preserve">Whatever you would like to do with this CSV file after downloading </w:t>
+      </w:r>
+      <w:r>
+        <w:rPr>
+          <w:rFonts w:asciiTheme="majorHAnsi" w:hAnsiTheme="majorHAnsi"/>
+          <w:sz w:val="20"/>
+        </w:rPr>
+        <w:t>is out of the scope of this documentation</w:t>
+      </w:r>
+      <w:r>
+        <w:rPr>
+          <w:rFonts w:asciiTheme="majorHAnsi" w:hAnsiTheme="majorHAnsi"/>
+          <w:sz w:val="20"/>
+        </w:rPr>
+        <w:t>;</w:t>
+      </w:r>
+      <w:r>
+        <w:rPr>
+          <w:rFonts w:asciiTheme="majorHAnsi" w:hAnsiTheme="majorHAnsi"/>
+          <w:sz w:val="20"/>
+        </w:rPr>
+        <w:t xml:space="preserve"> however</w:t>
+      </w:r>
+      <w:r>
+        <w:rPr>
+          <w:rFonts w:asciiTheme="majorHAnsi" w:hAnsiTheme="majorHAnsi"/>
+          <w:sz w:val="20"/>
+        </w:rPr>
+        <w:t xml:space="preserve"> it is</w:t>
+      </w:r>
+      <w:r>
+        <w:rPr>
+          <w:rFonts w:asciiTheme="majorHAnsi" w:hAnsiTheme="majorHAnsi"/>
+          <w:sz w:val="20"/>
+        </w:rPr>
+        <w:t xml:space="preserve"> </w:t>
+      </w:r>
+      <w:r>
+        <w:rPr>
+          <w:rFonts w:asciiTheme="majorHAnsi" w:hAnsiTheme="majorHAnsi"/>
+          <w:sz w:val="20"/>
+        </w:rPr>
+        <w:t>just</w:t>
+      </w:r>
+      <w:r>
+        <w:rPr>
+          <w:rFonts w:asciiTheme="majorHAnsi" w:hAnsiTheme="majorHAnsi"/>
+          <w:sz w:val="20"/>
+        </w:rPr>
+        <w:t xml:space="preserve"> a reminder that </w:t>
+      </w:r>
+      <w:r>
+        <w:rPr>
+          <w:rFonts w:asciiTheme="majorHAnsi" w:hAnsiTheme="majorHAnsi"/>
+          <w:sz w:val="20"/>
+          <w:u w:val="dotted"/>
+        </w:rPr>
+        <w:t xml:space="preserve">publically sharing </w:t>
+      </w:r>
+      <w:r>
+        <w:rPr>
+          <w:rFonts w:asciiTheme="majorHAnsi" w:hAnsiTheme="majorHAnsi"/>
+          <w:sz w:val="20"/>
+          <w:u w:val="dotted"/>
+        </w:rPr>
+        <w:t xml:space="preserve">the </w:t>
+      </w:r>
+      <w:r>
+        <w:rPr>
+          <w:rFonts w:asciiTheme="majorHAnsi" w:hAnsiTheme="majorHAnsi"/>
+          <w:sz w:val="20"/>
+          <w:u w:val="dotted"/>
+        </w:rPr>
+        <w:t>data is against twitter’s term</w:t>
+      </w:r>
+      <w:r>
+        <w:rPr>
+          <w:rFonts w:asciiTheme="majorHAnsi" w:hAnsiTheme="majorHAnsi"/>
+          <w:sz w:val="20"/>
+          <w:u w:val="dotted"/>
+        </w:rPr>
+        <w:t>s</w:t>
+      </w:r>
+      <w:r>
+        <w:rPr>
+          <w:rFonts w:asciiTheme="majorHAnsi" w:hAnsiTheme="majorHAnsi"/>
+          <w:sz w:val="20"/>
+          <w:u w:val="dotted"/>
+        </w:rPr>
+        <w:t xml:space="preserve"> of user</w:t>
+      </w:r>
+      <w:r>
+        <w:rPr>
+          <w:rFonts w:asciiTheme="majorHAnsi" w:hAnsiTheme="majorHAnsi"/>
+          <w:sz w:val="20"/>
+        </w:rPr>
+        <w:t xml:space="preserve">. </w:t>
+      </w:r>
+    </w:p>
+    <w:p>
+      <w:pPr>
+        <w:ind w:left="360"/>
+        <w:rPr>
+          <w:rFonts w:asciiTheme="majorHAnsi" w:hAnsiTheme="majorHAnsi"/>
+          <w:sz w:val="20"/>
+        </w:rPr>
+      </w:pPr>
+      <w:r>
+        <w:rPr>
+          <w:rFonts w:asciiTheme="majorHAnsi" w:hAnsiTheme="majorHAnsi"/>
+          <w:sz w:val="20"/>
+        </w:rPr>
+        <w:t xml:space="preserve">If you have accidentally left the search page and would like to get </w:t>
+      </w:r>
+      <w:r>
+        <w:rPr>
+          <w:rFonts w:asciiTheme="majorHAnsi" w:hAnsiTheme="majorHAnsi"/>
+          <w:sz w:val="20"/>
+        </w:rPr>
+        <w:t>back</w:t>
+      </w:r>
+      <w:r>
+        <w:rPr>
+          <w:rFonts w:asciiTheme="majorHAnsi" w:hAnsiTheme="majorHAnsi"/>
+          <w:sz w:val="20"/>
+        </w:rPr>
+        <w:t xml:space="preserve"> to you</w:t>
+      </w:r>
+      <w:r>
+        <w:rPr>
+          <w:rFonts w:asciiTheme="majorHAnsi" w:hAnsiTheme="majorHAnsi"/>
+          <w:sz w:val="20"/>
+        </w:rPr>
+        <w:t xml:space="preserve">r previous search results, a history page is available for that purpose. </w:t>
+      </w:r>
+      <w:r>
+        <w:rPr>
+          <w:rFonts w:asciiTheme="majorHAnsi" w:hAnsiTheme="majorHAnsi"/>
+          <w:sz w:val="20"/>
+        </w:rPr>
+        <w:t xml:space="preserve">All the SMILE generated data </w:t>
+      </w:r>
+      <w:r>
+        <w:rPr>
+          <w:rFonts w:asciiTheme="majorHAnsi" w:hAnsiTheme="majorHAnsi"/>
+          <w:sz w:val="20"/>
+        </w:rPr>
+        <w:t>in</w:t>
+      </w:r>
+      <w:r>
+        <w:rPr>
+          <w:rFonts w:asciiTheme="majorHAnsi" w:hAnsiTheme="majorHAnsi"/>
+          <w:sz w:val="20"/>
+        </w:rPr>
+        <w:t xml:space="preserve"> the same session can be found through </w:t>
+      </w:r>
+      <w:r>
+        <w:rPr>
+          <w:rFonts w:asciiTheme="majorHAnsi" w:hAnsiTheme="majorHAnsi"/>
+          <w:sz w:val="20"/>
+        </w:rPr>
+        <w:t>this</w:t>
+      </w:r>
+      <w:r>
+        <w:rPr>
+          <w:rFonts w:asciiTheme="majorHAnsi" w:hAnsiTheme="majorHAnsi"/>
+          <w:sz w:val="20"/>
+        </w:rPr>
+        <w:t xml:space="preserve"> page. </w:t>
+      </w:r>
+      <w:r>
+        <w:rPr>
+          <w:rFonts w:asciiTheme="majorHAnsi" w:hAnsiTheme="majorHAnsi"/>
+          <w:sz w:val="20"/>
+        </w:rPr>
+        <w:t>First</w:t>
+      </w:r>
+      <w:r>
+        <w:rPr>
+          <w:rFonts w:asciiTheme="majorHAnsi" w:hAnsiTheme="majorHAnsi"/>
+          <w:sz w:val="20"/>
+        </w:rPr>
+        <w:t>,</w:t>
+      </w:r>
+      <w:r>
+        <w:rPr>
+          <w:rFonts w:asciiTheme="majorHAnsi" w:hAnsiTheme="majorHAnsi"/>
+          <w:sz w:val="20"/>
+        </w:rPr>
+        <w:t xml:space="preserve"> the user should </w:t>
+      </w:r>
+      <w:r>
+        <w:rPr>
+          <w:rFonts w:asciiTheme="majorHAnsi" w:hAnsiTheme="majorHAnsi"/>
+          <w:sz w:val="20"/>
+        </w:rPr>
+        <w:t>click the</w:t>
+      </w:r>
+      <w:r>
+        <w:rPr>
+          <w:rFonts w:asciiTheme="majorHAnsi" w:hAnsiTheme="majorHAnsi"/>
+          <w:sz w:val="20"/>
+        </w:rPr>
+        <w:t xml:space="preserve"> “History” button on the top</w:t>
+      </w:r>
+      <w:r>
+        <w:rPr>
+          <w:rFonts w:asciiTheme="majorHAnsi" w:hAnsiTheme="majorHAnsi"/>
+          <w:sz w:val="20"/>
+        </w:rPr>
+        <w:t xml:space="preserve"> </w:t>
+      </w:r>
+      <w:r>
+        <w:rPr>
+          <w:rFonts w:asciiTheme="majorHAnsi" w:hAnsiTheme="majorHAnsi"/>
+          <w:sz w:val="20"/>
+        </w:rPr>
+        <w:t>bar</w:t>
+      </w:r>
+      <w:r>
+        <w:rPr>
+          <w:rFonts w:asciiTheme="majorHAnsi" w:hAnsiTheme="majorHAnsi"/>
+          <w:sz w:val="20"/>
+        </w:rPr>
+        <w:t xml:space="preserve">, then on the left panel expand “Social Media Data” </w:t>
+      </w:r>
+      <w:r>
+        <w:rPr>
+          <w:rFonts w:asciiTheme="majorHAnsi" w:hAnsiTheme="majorHAnsi"/>
+          <w:sz w:val="20"/>
+        </w:rPr>
+        <w:sym w:font="Wingdings" w:char="F0E0"/>
+      </w:r>
+      <w:r>
+        <w:rPr>
+          <w:rFonts w:asciiTheme="majorHAnsi" w:hAnsiTheme="majorHAnsi"/>
+          <w:sz w:val="20"/>
+        </w:rPr>
+        <w:t xml:space="preserve"> “Twitter Tweet” </w:t>
+      </w:r>
+      <w:r>
+        <w:rPr>
+          <w:rFonts w:asciiTheme="majorHAnsi" w:hAnsiTheme="majorHAnsi"/>
+          <w:sz w:val="20"/>
+        </w:rPr>
+        <w:t>(</w:t>
+      </w:r>
+      <w:r>
+        <w:rPr>
+          <w:rFonts w:asciiTheme="majorHAnsi" w:hAnsiTheme="majorHAnsi"/>
+          <w:sz w:val="20"/>
+        </w:rPr>
+        <w:t>for example</w:t>
+      </w:r>
+      <w:r>
+        <w:rPr>
+          <w:rFonts w:asciiTheme="majorHAnsi" w:hAnsiTheme="majorHAnsi"/>
+          <w:sz w:val="20"/>
+        </w:rPr>
+        <w:t>)</w:t>
+      </w:r>
+      <w:r>
+        <w:rPr>
+          <w:rFonts w:asciiTheme="majorHAnsi" w:hAnsiTheme="majorHAnsi"/>
+          <w:sz w:val="20"/>
+        </w:rPr>
+        <w:t xml:space="preserve"> </w:t>
+      </w:r>
+      <w:r>
+        <w:rPr>
+          <w:rFonts w:asciiTheme="majorHAnsi" w:hAnsiTheme="majorHAnsi"/>
+          <w:sz w:val="20"/>
+        </w:rPr>
+        <w:sym w:font="Wingdings" w:char="F0E0"/>
+      </w:r>
+      <w:r>
+        <w:rPr>
+          <w:rFonts w:asciiTheme="majorHAnsi" w:hAnsiTheme="majorHAnsi"/>
+          <w:sz w:val="20"/>
+        </w:rPr>
+        <w:t xml:space="preserve"> “view”</w:t>
+      </w:r>
+      <w:r>
+        <w:rPr>
+          <w:rFonts w:asciiTheme="majorHAnsi" w:hAnsiTheme="majorHAnsi"/>
+          <w:sz w:val="20"/>
+        </w:rPr>
+        <w:t xml:space="preserve">. In the </w:t>
+      </w:r>
+      <w:r>
+        <w:rPr>
+          <w:rFonts w:asciiTheme="majorHAnsi" w:hAnsiTheme="majorHAnsi"/>
+          <w:sz w:val="20"/>
+        </w:rPr>
+        <w:t>“O</w:t>
+      </w:r>
+      <w:r>
+        <w:rPr>
+          <w:rFonts w:asciiTheme="majorHAnsi" w:hAnsiTheme="majorHAnsi"/>
+          <w:sz w:val="20"/>
+        </w:rPr>
+        <w:t>verview</w:t>
+      </w:r>
+      <w:r>
+        <w:rPr>
+          <w:rFonts w:asciiTheme="majorHAnsi" w:hAnsiTheme="majorHAnsi"/>
+          <w:sz w:val="20"/>
+        </w:rPr>
+        <w:t>” part</w:t>
+      </w:r>
+      <w:r>
+        <w:rPr>
+          <w:rFonts w:asciiTheme="majorHAnsi" w:hAnsiTheme="majorHAnsi"/>
+          <w:sz w:val="20"/>
+        </w:rPr>
+        <w:t xml:space="preserve"> of that data in the right panel, there’s a link in the </w:t>
+      </w:r>
+      <w:r>
+        <w:rPr>
+          <w:rFonts w:asciiTheme="majorHAnsi" w:hAnsiTheme="majorHAnsi"/>
+          <w:sz w:val="20"/>
+        </w:rPr>
+        <w:t>“</w:t>
+      </w:r>
+      <w:r>
+        <w:rPr>
+          <w:rFonts w:asciiTheme="majorHAnsi" w:hAnsiTheme="majorHAnsi"/>
+          <w:sz w:val="20"/>
+        </w:rPr>
+        <w:t>downloadable</w:t>
+      </w:r>
+      <w:r>
+        <w:rPr>
+          <w:rFonts w:asciiTheme="majorHAnsi" w:hAnsiTheme="majorHAnsi"/>
+          <w:sz w:val="20"/>
+        </w:rPr>
+        <w:t>s”</w:t>
+      </w:r>
+      <w:r>
+        <w:rPr>
+          <w:rFonts w:asciiTheme="majorHAnsi" w:hAnsiTheme="majorHAnsi"/>
+          <w:sz w:val="20"/>
+        </w:rPr>
+        <w:t xml:space="preserve"> column that will lead you to the CSV file</w:t>
+      </w:r>
+      <w:r>
+        <w:rPr>
+          <w:rFonts w:asciiTheme="majorHAnsi" w:hAnsiTheme="majorHAnsi"/>
+          <w:sz w:val="20"/>
+        </w:rPr>
+        <w:t xml:space="preserve"> (Figure 6)</w:t>
+      </w:r>
+      <w:r>
+        <w:rPr>
+          <w:rFonts w:asciiTheme="majorHAnsi" w:hAnsiTheme="majorHAnsi"/>
+          <w:sz w:val="20"/>
+        </w:rPr>
+        <w:t>.</w:t>
+      </w:r>
+    </w:p>
+    <w:p>
+      <w:pPr>
+        <w:rPr>
+          <w:noProof/>
+        </w:rPr>
+      </w:pPr>
+      <w:r>
+        <w:rPr>
+          <w:noProof/>
+        </w:rPr>
+        <mc:AlternateContent>
+          <mc:Choice Requires="wpg">
+            <w:drawing>
+              <wp:anchor distT="0" distB="0" distL="114300" distR="114300" simplePos="0" relativeHeight="251745280" behindDoc="0" locked="0" layoutInCell="1" allowOverlap="1">
+                <wp:simplePos x="0" y="0"/>
+                <wp:positionH relativeFrom="column">
+                  <wp:posOffset>476250</wp:posOffset>
+                </wp:positionH>
+                <wp:positionV relativeFrom="paragraph">
+                  <wp:posOffset>194310</wp:posOffset>
+                </wp:positionV>
+                <wp:extent cx="5245100" cy="1873250"/>
+                <wp:effectExtent l="0" t="0" r="0" b="0"/>
+                <wp:wrapTopAndBottom/>
+                <wp:docPr id="282" name="Group 282"/>
+                <wp:cNvGraphicFramePr/>
+                <a:graphic xmlns:a="http://schemas.openxmlformats.org/drawingml/2006/main">
+                  <a:graphicData uri="http://schemas.microsoft.com/office/word/2010/wordprocessingGroup">
+                    <wpg:wgp>
+                      <wpg:cNvGrpSpPr/>
+                      <wpg:grpSpPr>
+                        <a:xfrm>
+                          <a:off x="0" y="0"/>
+                          <a:ext cx="5245100" cy="1873250"/>
+                          <a:chOff x="12700" y="0"/>
+                          <a:chExt cx="5435600" cy="2095500"/>
+                        </a:xfrm>
+                      </wpg:grpSpPr>
+                      <pic:pic xmlns:pic="http://schemas.openxmlformats.org/drawingml/2006/picture">
+                        <pic:nvPicPr>
+                          <pic:cNvPr id="278" name="Picture 278"/>
+                          <pic:cNvPicPr>
+                            <a:picLocks noChangeAspect="1"/>
+                          </pic:cNvPicPr>
+                        </pic:nvPicPr>
+                        <pic:blipFill>
+                          <a:blip r:embed="rId29">
+                            <a:extLst>
+                              <a:ext uri="{28A0092B-C50C-407E-A947-70E740481C1C}">
+                                <a14:useLocalDpi xmlns:a14="http://schemas.microsoft.com/office/drawing/2010/main" val="0"/>
+                              </a:ext>
+                            </a:extLst>
+                          </a:blip>
+                          <a:stretch>
+                            <a:fillRect/>
+                          </a:stretch>
+                        </pic:blipFill>
+                        <pic:spPr>
+                          <a:xfrm>
+                            <a:off x="12700" y="12700"/>
+                            <a:ext cx="2597150" cy="1298575"/>
+                          </a:xfrm>
+                          <a:prstGeom prst="rect">
+                            <a:avLst/>
+                          </a:prstGeom>
+                        </pic:spPr>
+                      </pic:pic>
+                      <pic:pic xmlns:pic="http://schemas.openxmlformats.org/drawingml/2006/picture">
+                        <pic:nvPicPr>
+                          <pic:cNvPr id="279" name="Picture 279"/>
+                          <pic:cNvPicPr>
+                            <a:picLocks noChangeAspect="1"/>
+                          </pic:cNvPicPr>
+                        </pic:nvPicPr>
+                        <pic:blipFill rotWithShape="1">
+                          <a:blip r:embed="rId30">
+                            <a:extLst>
+                              <a:ext uri="{28A0092B-C50C-407E-A947-70E740481C1C}">
+                                <a14:useLocalDpi xmlns:a14="http://schemas.microsoft.com/office/drawing/2010/main" val="0"/>
+                              </a:ext>
+                            </a:extLst>
+                          </a:blip>
+                          <a:srcRect r="58432"/>
+                          <a:stretch/>
+                        </pic:blipFill>
+                        <pic:spPr bwMode="auto">
+                          <a:xfrm>
+                            <a:off x="2787650" y="0"/>
+                            <a:ext cx="2660650" cy="2095500"/>
+                          </a:xfrm>
+                          <a:prstGeom prst="rect">
+                            <a:avLst/>
+                          </a:prstGeom>
+                          <a:ln>
+                            <a:noFill/>
+                          </a:ln>
+                          <a:extLst>
+                            <a:ext uri="{53640926-AAD7-44D8-BBD7-CCE9431645EC}">
+                              <a14:shadowObscured xmlns:a14="http://schemas.microsoft.com/office/drawing/2010/main"/>
+                            </a:ext>
+                          </a:extLst>
+                        </pic:spPr>
+                      </pic:pic>
+                      <wps:wsp>
+                        <wps:cNvPr id="280" name="Rectangle 280"/>
+                        <wps:cNvSpPr/>
+                        <wps:spPr>
+                          <a:xfrm>
+                            <a:off x="503908" y="1082798"/>
+                            <a:ext cx="378742" cy="228478"/>
+                          </a:xfrm>
+                          <a:prstGeom prst="rect">
+                            <a:avLst/>
+                          </a:prstGeom>
+                          <a:noFill/>
+                          <a:ln w="19050">
+                            <a:solidFill>
+                              <a:srgbClr val="C00000"/>
+                            </a:solidFill>
+                          </a:ln>
+                        </wps:spPr>
+                        <wps:style>
+                          <a:lnRef idx="2">
+                            <a:schemeClr val="accent1">
+                              <a:shade val="50000"/>
+                            </a:schemeClr>
+                          </a:lnRef>
+                          <a:fillRef idx="1">
+                            <a:schemeClr val="accent1"/>
+                          </a:fillRef>
+                          <a:effectRef idx="0">
+                            <a:schemeClr val="accent1"/>
+                          </a:effectRef>
+                          <a:fontRef idx="minor">
+                            <a:schemeClr val="lt1"/>
+                          </a:fontRef>
+                        </wps:style>
+                        <wps:bodyPr rot="0" spcFirstLastPara="0" vertOverflow="overflow" horzOverflow="overflow" vert="horz" wrap="square" lIns="91440" tIns="45720" rIns="91440" bIns="45720" numCol="1" spcCol="0" rtlCol="0" fromWordArt="0" anchor="ctr" anchorCtr="0" forceAA="0" compatLnSpc="1">
+                          <a:prstTxWarp prst="textNoShape">
+                            <a:avLst/>
+                          </a:prstTxWarp>
+                          <a:noAutofit/>
+                        </wps:bodyPr>
+                      </wps:wsp>
+                      <wps:wsp>
+                        <wps:cNvPr id="281" name="Rectangle 281"/>
+                        <wps:cNvSpPr/>
+                        <wps:spPr>
+                          <a:xfrm>
+                            <a:off x="2838450" y="1574800"/>
+                            <a:ext cx="1314450" cy="184150"/>
+                          </a:xfrm>
+                          <a:prstGeom prst="rect">
+                            <a:avLst/>
+                          </a:prstGeom>
+                          <a:noFill/>
+                          <a:ln w="19050">
+                            <a:solidFill>
+                              <a:srgbClr val="C00000"/>
+                            </a:solidFill>
+                          </a:ln>
+                        </wps:spPr>
+                        <wps:style>
+                          <a:lnRef idx="2">
+                            <a:schemeClr val="accent1">
+                              <a:shade val="50000"/>
+                            </a:schemeClr>
+                          </a:lnRef>
+                          <a:fillRef idx="1">
+                            <a:schemeClr val="accent1"/>
+                          </a:fillRef>
+                          <a:effectRef idx="0">
+                            <a:schemeClr val="accent1"/>
+                          </a:effectRef>
+                          <a:fontRef idx="minor">
+                            <a:schemeClr val="lt1"/>
+                          </a:fontRef>
+                        </wps:style>
+                        <wps:bodyPr rot="0" spcFirstLastPara="0" vertOverflow="overflow" horzOverflow="overflow" vert="horz" wrap="square" lIns="91440" tIns="45720" rIns="91440" bIns="45720" numCol="1" spcCol="0" rtlCol="0" fromWordArt="0" anchor="ctr" anchorCtr="0" forceAA="0" compatLnSpc="1">
+                          <a:prstTxWarp prst="textNoShape">
+                            <a:avLst/>
+                          </a:prstTxWarp>
+                          <a:noAutofit/>
+                        </wps:bodyPr>
+                      </wps:wsp>
+                    </wpg:wgp>
+                  </a:graphicData>
+                </a:graphic>
+                <wp14:sizeRelH relativeFrom="margin">
+                  <wp14:pctWidth>0</wp14:pctWidth>
+                </wp14:sizeRelH>
+                <wp14:sizeRelV relativeFrom="margin">
+                  <wp14:pctHeight>0</wp14:pctHeight>
+                </wp14:sizeRelV>
+              </wp:anchor>
+            </w:drawing>
+          </mc:Choice>
+          <mc:Fallback>
+            <w:pict>
+              <v:group w14:anchorId="62169162" id="Group 282" o:spid="_x0000_s1026" style="position:absolute;margin-left:37.5pt;margin-top:15.3pt;width:413pt;height:147.5pt;z-index:251745280;mso-width-relative:margin;mso-height-relative:margin" coordorigin="127" coordsize="54356,20955" o:gfxdata="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">
+                <v:shape id="Picture 278" o:spid="_x0000_s1027" type="#_x0000_t75" style="position:absolute;left:127;top:127;width:25971;height:12985;visibility:visible;mso-wrap-style:square" o:gfxdata="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">
+                  <v:imagedata r:id="rId31" o:title=""/>
+                  <v:path arrowok="t"/>
+                </v:shape>
+                <v:shape id="Picture 279" o:spid="_x0000_s1028" type="#_x0000_t75" style="position:absolute;left:27876;width:26607;height:20955;visibility:visible;mso-wrap-style:square" o:gfxdata="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">
+                  <v:imagedata r:id="rId32" o:title="" cropright="38294f"/>
+                  <v:path arrowok="t"/>
+                </v:shape>
+                <v:rect id="Rectangle 280" o:spid="_x0000_s1029" style="position:absolute;left:5039;top:10827;width:3787;height:2285;visibility:visible;mso-wrap-style:square;v-text-anchor:middle" o:gfxdata="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" filled="f" strokecolor="#c00000" strokeweight="1.5pt"/>
+                <v:rect id="Rectangle 281" o:spid="_x0000_s1030" style="position:absolute;left:28384;top:15748;width:13145;height:1841;visibility:visible;mso-wrap-style:square;v-text-anchor:middle" o:gfxdata="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" filled="f" strokecolor="#c00000" strokeweight="1.5pt"/>
+                <w10:wrap type="topAndBottom"/>
+              </v:group>
+            </w:pict>
+          </mc:Fallback>
+        </mc:AlternateContent>
+      </w:r>
+    </w:p>
+    <w:p>
+      <w:pPr>
+        <w:ind w:left="360"/>
+        <w:jc w:val="center"/>
+        <w:rPr>
+          <w:rFonts w:asciiTheme="majorHAnsi" w:hAnsiTheme="majorHAnsi"/>
+          <w:b/>
+          <w:sz w:val="20"/>
+        </w:rPr>
+      </w:pPr>
+      <w:r>
+        <w:rPr>
+          <w:rFonts w:asciiTheme="majorHAnsi" w:hAnsiTheme="majorHAnsi"/>
+          <w:b/>
+          <w:sz w:val="20"/>
+        </w:rPr>
+        <w:t xml:space="preserve">Figure 6. </w:t>
+      </w:r>
+      <w:r>
+        <w:rPr>
+          <w:rFonts w:asciiTheme="majorHAnsi" w:hAnsiTheme="majorHAnsi"/>
+          <w:sz w:val="20"/>
+        </w:rPr>
+        <w:t>Find past search results in the history page</w:t>
       </w:r>
     </w:p>
     <w:p>
@@ -5955,15 +7517,207 @@
         </w:numPr>
         <w:rPr>
           <w:rFonts w:asciiTheme="majorHAnsi" w:hAnsiTheme="majorHAnsi"/>
-          <w:sz w:val="20"/>
-        </w:rPr>
-      </w:pPr>
-      <w:r>
-        <w:rPr>
-          <w:rFonts w:asciiTheme="majorHAnsi" w:hAnsiTheme="majorHAnsi"/>
-          <w:sz w:val="20"/>
-        </w:rPr>
-        <w:t>A Short Intro of GraphQL – the next generation API language</w:t>
+          <w:b/>
+          <w:sz w:val="20"/>
+        </w:rPr>
+      </w:pPr>
+      <w:r>
+        <w:rPr>
+          <w:rFonts w:asciiTheme="majorHAnsi" w:hAnsiTheme="majorHAnsi"/>
+          <w:b/>
+          <w:sz w:val="20"/>
+        </w:rPr>
+        <w:lastRenderedPageBreak/>
+        <w:t>A Short Intro</w:t>
+      </w:r>
+      <w:r>
+        <w:rPr>
+          <w:rFonts w:asciiTheme="majorHAnsi" w:hAnsiTheme="majorHAnsi"/>
+          <w:b/>
+          <w:sz w:val="20"/>
+        </w:rPr>
+        <w:t>duction</w:t>
+      </w:r>
+      <w:r>
+        <w:rPr>
+          <w:rFonts w:asciiTheme="majorHAnsi" w:hAnsiTheme="majorHAnsi"/>
+          <w:b/>
+          <w:sz w:val="20"/>
+        </w:rPr>
+        <w:t xml:space="preserve"> of GraphQL – the next generation API language</w:t>
+      </w:r>
+    </w:p>
+    <w:p>
+      <w:pPr>
+        <w:ind w:left="360"/>
+        <w:rPr>
+          <w:rFonts w:asciiTheme="majorHAnsi" w:hAnsiTheme="majorHAnsi"/>
+          <w:sz w:val="20"/>
+        </w:rPr>
+      </w:pPr>
+      <w:r>
+        <w:rPr>
+          <w:rFonts w:asciiTheme="majorHAnsi" w:hAnsiTheme="majorHAnsi"/>
+          <w:sz w:val="20"/>
+        </w:rPr>
+        <w:t>GraphQL is an application layer query language</w:t>
+      </w:r>
+      <w:r>
+        <w:rPr>
+          <w:rFonts w:asciiTheme="majorHAnsi" w:hAnsiTheme="majorHAnsi"/>
+          <w:sz w:val="20"/>
+        </w:rPr>
+        <w:t xml:space="preserve"> that </w:t>
+      </w:r>
+      <w:r>
+        <w:rPr>
+          <w:rFonts w:asciiTheme="majorHAnsi" w:hAnsiTheme="majorHAnsi"/>
+          <w:sz w:val="20"/>
+        </w:rPr>
+        <w:t>developed</w:t>
+      </w:r>
+      <w:r>
+        <w:rPr>
+          <w:rFonts w:asciiTheme="majorHAnsi" w:hAnsiTheme="majorHAnsi"/>
+          <w:sz w:val="20"/>
+        </w:rPr>
+        <w:t xml:space="preserve"> by Facebook </w:t>
+      </w:r>
+      <w:r>
+        <w:rPr>
+          <w:rFonts w:asciiTheme="majorHAnsi" w:hAnsiTheme="majorHAnsi"/>
+          <w:sz w:val="20"/>
+        </w:rPr>
+        <w:t xml:space="preserve">and later open sourced to the community </w:t>
+      </w:r>
+      <w:r>
+        <w:rPr>
+          <w:rFonts w:asciiTheme="majorHAnsi" w:hAnsiTheme="majorHAnsi"/>
+          <w:sz w:val="20"/>
+        </w:rPr>
+        <w:t>in 2015</w:t>
+      </w:r>
+      <w:r>
+        <w:rPr>
+          <w:rFonts w:asciiTheme="majorHAnsi" w:hAnsiTheme="majorHAnsi"/>
+          <w:sz w:val="20"/>
+        </w:rPr>
+        <w:t xml:space="preserve">. </w:t>
+      </w:r>
+      <w:r>
+        <w:rPr>
+          <w:rFonts w:asciiTheme="majorHAnsi" w:hAnsiTheme="majorHAnsi"/>
+          <w:sz w:val="20"/>
+        </w:rPr>
+        <w:t xml:space="preserve">In GraphQL, the </w:t>
+      </w:r>
+      <w:r>
+        <w:rPr>
+          <w:rFonts w:asciiTheme="majorHAnsi" w:hAnsiTheme="majorHAnsi"/>
+          <w:sz w:val="20"/>
+        </w:rPr>
+        <w:t xml:space="preserve">schema of the resources </w:t>
+      </w:r>
+      <w:r>
+        <w:rPr>
+          <w:rFonts w:asciiTheme="majorHAnsi" w:hAnsiTheme="majorHAnsi"/>
+          <w:sz w:val="20"/>
+        </w:rPr>
+        <w:t xml:space="preserve">is pre-defined, as well as the </w:t>
+      </w:r>
+      <w:r>
+        <w:rPr>
+          <w:rFonts w:asciiTheme="majorHAnsi" w:hAnsiTheme="majorHAnsi"/>
+          <w:sz w:val="20"/>
+        </w:rPr>
+        <w:t>queries and mutations you can perform on those resources.</w:t>
+      </w:r>
+      <w:r>
+        <w:rPr>
+          <w:rFonts w:asciiTheme="majorHAnsi" w:hAnsiTheme="majorHAnsi"/>
+          <w:sz w:val="20"/>
+        </w:rPr>
+        <w:t xml:space="preserve"> </w:t>
+      </w:r>
+      <w:r>
+        <w:rPr>
+          <w:rFonts w:asciiTheme="majorHAnsi" w:hAnsiTheme="majorHAnsi"/>
+          <w:sz w:val="20"/>
+        </w:rPr>
+        <w:t>Hence, it can easily</w:t>
+      </w:r>
+      <w:r>
+        <w:rPr>
+          <w:rFonts w:asciiTheme="majorHAnsi" w:hAnsiTheme="majorHAnsi"/>
+          <w:sz w:val="20"/>
+        </w:rPr>
+        <w:t xml:space="preserve"> interpret a</w:t>
+      </w:r>
+      <w:r>
+        <w:rPr>
+          <w:rFonts w:asciiTheme="majorHAnsi" w:hAnsiTheme="majorHAnsi"/>
+          <w:sz w:val="20"/>
+        </w:rPr>
+        <w:t xml:space="preserve"> string from a server or client, </w:t>
+      </w:r>
+      <w:r>
+        <w:rPr>
+          <w:rFonts w:asciiTheme="majorHAnsi" w:hAnsiTheme="majorHAnsi"/>
+          <w:sz w:val="20"/>
+        </w:rPr>
+        <w:t>and return that data in an understandable, stable, and predictable format. As the official website for GraphQL puts it, “</w:t>
+      </w:r>
+      <w:r>
+        <w:rPr>
+          <w:rFonts w:asciiTheme="majorHAnsi" w:hAnsiTheme="majorHAnsi"/>
+          <w:sz w:val="20"/>
+          <w:u w:val="dotted"/>
+        </w:rPr>
+        <w:t>Describe your data, ask for what you want, get predictable results.</w:t>
+      </w:r>
+      <w:r>
+        <w:rPr>
+          <w:rFonts w:asciiTheme="majorHAnsi" w:hAnsiTheme="majorHAnsi"/>
+          <w:sz w:val="20"/>
+        </w:rPr>
+        <w:t>”</w:t>
+      </w:r>
+      <w:r>
+        <w:rPr>
+          <w:rFonts w:asciiTheme="majorHAnsi" w:hAnsiTheme="majorHAnsi"/>
+          <w:sz w:val="20"/>
+        </w:rPr>
+        <w:t xml:space="preserve"> </w:t>
+      </w:r>
+    </w:p>
+    <w:p>
+      <w:pPr>
+        <w:ind w:left="360"/>
+        <w:rPr>
+          <w:rFonts w:asciiTheme="majorHAnsi" w:hAnsiTheme="majorHAnsi"/>
+          <w:sz w:val="20"/>
+        </w:rPr>
+      </w:pPr>
+      <w:r>
+        <w:rPr>
+          <w:rFonts w:asciiTheme="majorHAnsi" w:hAnsiTheme="majorHAnsi"/>
+          <w:sz w:val="20"/>
+        </w:rPr>
+        <w:t>GraphQL is used in the SMIL</w:t>
+      </w:r>
+      <w:r>
+        <w:rPr>
+          <w:rFonts w:asciiTheme="majorHAnsi" w:hAnsiTheme="majorHAnsi"/>
+          <w:sz w:val="20"/>
+        </w:rPr>
+        <w:t xml:space="preserve">E application as the underlying data server. </w:t>
+      </w:r>
+      <w:r>
+        <w:rPr>
+          <w:rFonts w:asciiTheme="majorHAnsi" w:hAnsiTheme="majorHAnsi"/>
+          <w:sz w:val="20"/>
+        </w:rPr>
+        <w:t>We chose GraphQL as the query language for a few reasons:</w:t>
       </w:r>
     </w:p>
     <w:p>
@@ -5971,7 +7725,7 @@
         <w:pStyle w:val="ListParagraph"/>
         <w:numPr>
           <w:ilvl w:val="0"/>
-          <w:numId w:val="1"/>
+          <w:numId w:val="3"/>
         </w:numPr>
         <w:rPr>
           <w:rFonts w:asciiTheme="majorHAnsi" w:hAnsiTheme="majorHAnsi"/>
@@ -5983,16 +7737,413 @@
           <w:rFonts w:asciiTheme="majorHAnsi" w:hAnsiTheme="majorHAnsi"/>
           <w:sz w:val="20"/>
         </w:rPr>
-        <w:t>Pagination</w:t>
+        <w:t>It is versatile with different data source</w:t>
+      </w:r>
+      <w:r>
+        <w:rPr>
+          <w:rFonts w:asciiTheme="majorHAnsi" w:hAnsiTheme="majorHAnsi"/>
+          <w:sz w:val="20"/>
+        </w:rPr>
+        <w:t>s</w:t>
+      </w:r>
+      <w:r>
+        <w:rPr>
+          <w:rFonts w:asciiTheme="majorHAnsi" w:hAnsiTheme="majorHAnsi"/>
+          <w:sz w:val="20"/>
+        </w:rPr>
+        <w:t>, database and storage engine</w:t>
+      </w:r>
+      <w:r>
+        <w:rPr>
+          <w:rFonts w:asciiTheme="majorHAnsi" w:hAnsiTheme="majorHAnsi"/>
+          <w:sz w:val="20"/>
+        </w:rPr>
+        <w:t>s</w:t>
+      </w:r>
+      <w:r>
+        <w:rPr>
+          <w:rFonts w:asciiTheme="majorHAnsi" w:hAnsiTheme="majorHAnsi"/>
+          <w:sz w:val="20"/>
+        </w:rPr>
+        <w:t xml:space="preserve">. </w:t>
+      </w:r>
+      <w:r>
+        <w:rPr>
+          <w:rFonts w:asciiTheme="majorHAnsi" w:hAnsiTheme="majorHAnsi"/>
+          <w:sz w:val="20"/>
+        </w:rPr>
+        <w:t>In another word,</w:t>
+      </w:r>
+      <w:r>
+        <w:rPr>
+          <w:rFonts w:asciiTheme="majorHAnsi" w:hAnsiTheme="majorHAnsi"/>
+          <w:sz w:val="20"/>
+        </w:rPr>
+        <w:t xml:space="preserve"> i</w:t>
+      </w:r>
+      <w:r>
+        <w:rPr>
+          <w:rFonts w:asciiTheme="majorHAnsi" w:hAnsiTheme="majorHAnsi"/>
+          <w:sz w:val="20"/>
+        </w:rPr>
+        <w:t>t can be backed by any source of existing data</w:t>
+      </w:r>
+      <w:r>
+        <w:rPr>
+          <w:rFonts w:asciiTheme="majorHAnsi" w:hAnsiTheme="majorHAnsi"/>
+          <w:sz w:val="20"/>
+        </w:rPr>
+        <w:t>.</w:t>
+      </w:r>
+      <w:r>
+        <w:rPr>
+          <w:rFonts w:asciiTheme="majorHAnsi" w:hAnsiTheme="majorHAnsi"/>
+          <w:sz w:val="20"/>
+        </w:rPr>
+        <w:t xml:space="preserve"> In the SMILE application, so far we have three data sources</w:t>
+      </w:r>
+      <w:r>
+        <w:rPr>
+          <w:rFonts w:asciiTheme="majorHAnsi" w:hAnsiTheme="majorHAnsi"/>
+          <w:sz w:val="20"/>
+        </w:rPr>
+        <w:t>, two</w:t>
+      </w:r>
+      <w:r>
+        <w:rPr>
+          <w:rFonts w:asciiTheme="majorHAnsi" w:hAnsiTheme="majorHAnsi"/>
+          <w:sz w:val="20"/>
+        </w:rPr>
+        <w:t xml:space="preserve"> of them comes from twitter’s API and the third is the archived in </w:t>
+      </w:r>
+      <w:r>
+        <w:rPr>
+          <w:rFonts w:asciiTheme="majorHAnsi" w:hAnsiTheme="majorHAnsi"/>
+          <w:sz w:val="20"/>
+        </w:rPr>
+        <w:t>the</w:t>
+      </w:r>
+      <w:r>
+        <w:rPr>
+          <w:rFonts w:asciiTheme="majorHAnsi" w:hAnsiTheme="majorHAnsi"/>
+          <w:sz w:val="20"/>
+        </w:rPr>
+        <w:t xml:space="preserve"> AWS </w:t>
+      </w:r>
+      <w:r>
+        <w:rPr>
+          <w:rFonts w:asciiTheme="majorHAnsi" w:hAnsiTheme="majorHAnsi"/>
+          <w:sz w:val="20"/>
+        </w:rPr>
+        <w:t>elastic search</w:t>
+      </w:r>
+      <w:r>
+        <w:rPr>
+          <w:rFonts w:asciiTheme="majorHAnsi" w:hAnsiTheme="majorHAnsi"/>
+          <w:sz w:val="20"/>
+        </w:rPr>
+        <w:t xml:space="preserve"> database.</w:t>
+      </w:r>
+      <w:r>
+        <w:rPr>
+          <w:rFonts w:asciiTheme="majorHAnsi" w:hAnsiTheme="majorHAnsi"/>
+          <w:sz w:val="20"/>
+        </w:rPr>
+        <w:t xml:space="preserve"> In the future, we plan to add more sources such as d</w:t>
+      </w:r>
+      <w:r>
+        <w:rPr>
+          <w:rFonts w:asciiTheme="majorHAnsi" w:hAnsiTheme="majorHAnsi"/>
+          <w:sz w:val="20"/>
+        </w:rPr>
+        <w:t>ifferent social media platforms and</w:t>
+      </w:r>
+      <w:r>
+        <w:rPr>
+          <w:rFonts w:asciiTheme="majorHAnsi" w:hAnsiTheme="majorHAnsi"/>
+          <w:sz w:val="20"/>
+        </w:rPr>
+        <w:t xml:space="preserve"> different </w:t>
+      </w:r>
+      <w:r>
+        <w:rPr>
+          <w:rFonts w:asciiTheme="majorHAnsi" w:hAnsiTheme="majorHAnsi"/>
+          <w:sz w:val="20"/>
+        </w:rPr>
+        <w:t xml:space="preserve">archives </w:t>
+      </w:r>
+      <w:r>
+        <w:rPr>
+          <w:rFonts w:asciiTheme="majorHAnsi" w:hAnsiTheme="majorHAnsi"/>
+          <w:sz w:val="20"/>
+        </w:rPr>
+        <w:t xml:space="preserve">hosting by </w:t>
+      </w:r>
+      <w:r>
+        <w:rPr>
+          <w:rFonts w:asciiTheme="majorHAnsi" w:hAnsiTheme="majorHAnsi"/>
+          <w:sz w:val="20"/>
+        </w:rPr>
+        <w:t xml:space="preserve">various </w:t>
+      </w:r>
+      <w:r>
+        <w:rPr>
+          <w:rFonts w:asciiTheme="majorHAnsi" w:hAnsiTheme="majorHAnsi"/>
+          <w:sz w:val="20"/>
+        </w:rPr>
+        <w:t>institutions</w:t>
+      </w:r>
+      <w:r>
+        <w:rPr>
+          <w:rFonts w:asciiTheme="majorHAnsi" w:hAnsiTheme="majorHAnsi"/>
+          <w:sz w:val="20"/>
+        </w:rPr>
+        <w:t>.</w:t>
       </w:r>
     </w:p>
     <w:p>
       <w:pPr>
-        <w:rPr>
-          <w:rFonts w:asciiTheme="majorHAnsi" w:hAnsiTheme="majorHAnsi"/>
-          <w:sz w:val="20"/>
-        </w:rPr>
-      </w:pPr>
+        <w:pStyle w:val="ListParagraph"/>
+        <w:numPr>
+          <w:ilvl w:val="0"/>
+          <w:numId w:val="3"/>
+        </w:numPr>
+        <w:rPr>
+          <w:rFonts w:asciiTheme="majorHAnsi" w:hAnsiTheme="majorHAnsi"/>
+          <w:sz w:val="20"/>
+        </w:rPr>
+      </w:pPr>
+      <w:r>
+        <w:rPr>
+          <w:rFonts w:asciiTheme="majorHAnsi" w:hAnsiTheme="majorHAnsi"/>
+          <w:sz w:val="20"/>
+        </w:rPr>
+        <w:t>I</w:t>
+      </w:r>
+      <w:r>
+        <w:rPr>
+          <w:rFonts w:asciiTheme="majorHAnsi" w:hAnsiTheme="majorHAnsi"/>
+          <w:sz w:val="20"/>
+        </w:rPr>
+        <w:t>n contrast to REST APIs which expose a suite of URLs each of</w:t>
+      </w:r>
+      <w:r>
+        <w:rPr>
+          <w:rFonts w:asciiTheme="majorHAnsi" w:hAnsiTheme="majorHAnsi"/>
+          <w:sz w:val="20"/>
+        </w:rPr>
+        <w:t xml:space="preserve"> which expose a single resource, GraphQL provides a single endpoint which expresses the full set of capabilities of the service. With increase number of resources we would like to include in our application, a single and central endpoint to serve data</w:t>
+      </w:r>
+      <w:r>
+        <w:rPr>
+          <w:rFonts w:asciiTheme="majorHAnsi" w:hAnsiTheme="majorHAnsi"/>
+          <w:sz w:val="20"/>
+        </w:rPr>
+        <w:t xml:space="preserve"> over HTTP</w:t>
+      </w:r>
+      <w:r>
+        <w:rPr>
+          <w:rFonts w:asciiTheme="majorHAnsi" w:hAnsiTheme="majorHAnsi"/>
+          <w:sz w:val="20"/>
+        </w:rPr>
+        <w:t xml:space="preserve"> is immensely helpful.</w:t>
+      </w:r>
+    </w:p>
+    <w:p>
+      <w:pPr>
+        <w:pStyle w:val="ListParagraph"/>
+        <w:numPr>
+          <w:ilvl w:val="0"/>
+          <w:numId w:val="3"/>
+        </w:numPr>
+        <w:rPr>
+          <w:rFonts w:asciiTheme="majorHAnsi" w:hAnsiTheme="majorHAnsi"/>
+          <w:sz w:val="20"/>
+        </w:rPr>
+      </w:pPr>
+      <w:r>
+        <w:rPr>
+          <w:rFonts w:asciiTheme="majorHAnsi" w:hAnsiTheme="majorHAnsi"/>
+          <w:sz w:val="20"/>
+        </w:rPr>
+        <w:t>The client can define explicit interest on specific attributes of specific reso</w:t>
+      </w:r>
+      <w:r>
+        <w:rPr>
+          <w:rFonts w:asciiTheme="majorHAnsi" w:hAnsiTheme="majorHAnsi"/>
+          <w:sz w:val="20"/>
+        </w:rPr>
+        <w:t xml:space="preserve">urces to retrieve when querying. And the returning results are in </w:t>
+      </w:r>
+      <w:r>
+        <w:rPr>
+          <w:rFonts w:asciiTheme="majorHAnsi" w:hAnsiTheme="majorHAnsi"/>
+          <w:sz w:val="20"/>
+        </w:rPr>
+        <w:t>conformity with</w:t>
+      </w:r>
+      <w:r>
+        <w:rPr>
+          <w:rFonts w:asciiTheme="majorHAnsi" w:hAnsiTheme="majorHAnsi"/>
+          <w:sz w:val="20"/>
+        </w:rPr>
+        <w:t xml:space="preserve"> the structure of your query. For example, user can specify that they only want </w:t>
+      </w:r>
+      <w:r>
+        <w:rPr>
+          <w:rFonts w:asciiTheme="majorHAnsi" w:hAnsiTheme="majorHAnsi"/>
+          <w:sz w:val="20"/>
+        </w:rPr>
+        <w:t>“text”,</w:t>
+      </w:r>
+      <w:r>
+        <w:rPr>
+          <w:rFonts w:asciiTheme="majorHAnsi" w:hAnsiTheme="majorHAnsi"/>
+          <w:sz w:val="20"/>
+        </w:rPr>
+        <w:t xml:space="preserve"> </w:t>
+      </w:r>
+      <w:r>
+        <w:rPr>
+          <w:rFonts w:asciiTheme="majorHAnsi" w:hAnsiTheme="majorHAnsi"/>
+          <w:sz w:val="20"/>
+        </w:rPr>
+        <w:t>”created_at”, “id” fields when searching for tweets, and other redundant fields such as “author id”, “</w:t>
+      </w:r>
+      <w:r>
+        <w:rPr>
+          <w:rFonts w:asciiTheme="majorHAnsi" w:hAnsiTheme="majorHAnsi"/>
+          <w:sz w:val="20"/>
+        </w:rPr>
+        <w:t>author_</w:t>
+      </w:r>
+      <w:r>
+        <w:rPr>
+          <w:rFonts w:asciiTheme="majorHAnsi" w:hAnsiTheme="majorHAnsi"/>
+          <w:sz w:val="20"/>
+        </w:rPr>
+        <w:t>screen_name”</w:t>
+      </w:r>
+      <w:r>
+        <w:rPr>
+          <w:rFonts w:asciiTheme="majorHAnsi" w:hAnsiTheme="majorHAnsi"/>
+          <w:sz w:val="20"/>
+        </w:rPr>
+        <w:t xml:space="preserve"> will not </w:t>
+      </w:r>
+      <w:r>
+        <w:rPr>
+          <w:rFonts w:asciiTheme="majorHAnsi" w:hAnsiTheme="majorHAnsi"/>
+          <w:sz w:val="20"/>
+        </w:rPr>
+        <w:t>show up.</w:t>
+      </w:r>
+      <w:r>
+        <w:rPr>
+          <w:rFonts w:asciiTheme="majorHAnsi" w:hAnsiTheme="majorHAnsi"/>
+          <w:sz w:val="20"/>
+        </w:rPr>
+        <w:t xml:space="preserve"> </w:t>
+      </w:r>
+      <w:r>
+        <w:rPr>
+          <w:rFonts w:asciiTheme="majorHAnsi" w:hAnsiTheme="majorHAnsi"/>
+          <w:sz w:val="20"/>
+        </w:rPr>
+        <w:t xml:space="preserve">Another example is showed in Figure 7. </w:t>
+      </w:r>
+      <w:r>
+        <w:rPr>
+          <w:rFonts w:asciiTheme="majorHAnsi" w:hAnsiTheme="majorHAnsi"/>
+          <w:sz w:val="20"/>
+        </w:rPr>
+        <w:t>The left panel is the query, and the right panel is the returned data.</w:t>
+      </w:r>
+    </w:p>
+    <w:p>
+      <w:pPr>
+        <w:ind w:left="720"/>
+        <w:jc w:val="center"/>
+        <w:rPr>
+          <w:rFonts w:asciiTheme="majorHAnsi" w:hAnsiTheme="majorHAnsi"/>
+          <w:sz w:val="20"/>
+        </w:rPr>
+      </w:pPr>
+      <w:r>
+        <w:rPr>
+          <w:noProof/>
+        </w:rPr>
+        <w:drawing>
+          <wp:inline distT="0" distB="0" distL="0" distR="0" wp14:anchorId="62984774" wp14:editId="34B116EF">
+            <wp:extent cx="5372100" cy="1168752"/>
+            <wp:effectExtent l="0" t="0" r="0" b="0"/>
+            <wp:docPr id="284" name="Picture 284"/>
+            <wp:cNvGraphicFramePr>
+              <a:graphicFrameLocks xmlns:a="http://schemas.openxmlformats.org/drawingml/2006/main" noChangeAspect="1"/>
+            </wp:cNvGraphicFramePr>
+            <a:graphic xmlns:a="http://schemas.openxmlformats.org/drawingml/2006/main">
+              <a:graphicData uri="http://schemas.openxmlformats.org/drawingml/2006/picture">
+                <pic:pic xmlns:pic="http://schemas.openxmlformats.org/drawingml/2006/picture">
+                  <pic:nvPicPr>
+                    <pic:cNvPr id="1" name=""/>
+                    <pic:cNvPicPr/>
+                  </pic:nvPicPr>
+                  <pic:blipFill>
+                    <a:blip r:embed="rId33"/>
+                    <a:stretch>
+                      <a:fillRect/>
+                    </a:stretch>
+                  </pic:blipFill>
+                  <pic:spPr>
+                    <a:xfrm>
+                      <a:off x="0" y="0"/>
+                      <a:ext cx="5412133" cy="1177462"/>
+                    </a:xfrm>
+                    <a:prstGeom prst="rect">
+                      <a:avLst/>
+                    </a:prstGeom>
+                  </pic:spPr>
+                </pic:pic>
+              </a:graphicData>
+            </a:graphic>
+          </wp:inline>
+        </w:drawing>
+      </w:r>
+    </w:p>
+    <w:p>
+      <w:pPr>
+        <w:ind w:left="720"/>
+        <w:jc w:val="center"/>
+        <w:rPr>
+          <w:rFonts w:asciiTheme="majorHAnsi" w:hAnsiTheme="majorHAnsi"/>
+          <w:sz w:val="20"/>
+        </w:rPr>
+      </w:pPr>
+      <w:r>
+        <w:rPr>
+          <w:rFonts w:asciiTheme="majorHAnsi" w:hAnsiTheme="majorHAnsi"/>
+          <w:b/>
+          <w:sz w:val="20"/>
+        </w:rPr>
+        <w:t>Figure 7.</w:t>
+      </w:r>
+      <w:r>
+        <w:rPr>
+          <w:rFonts w:asciiTheme="majorHAnsi" w:hAnsiTheme="majorHAnsi"/>
+          <w:sz w:val="20"/>
+        </w:rPr>
+        <w:t xml:space="preserve"> An example of GraphQL query and result</w:t>
+      </w:r>
+    </w:p>
+    <w:p>
+      <w:pPr>
+        <w:rPr>
+          <w:rFonts w:asciiTheme="majorHAnsi" w:hAnsiTheme="majorHAnsi"/>
+          <w:sz w:val="20"/>
+        </w:rPr>
+      </w:pPr>
+      <w:bookmarkStart w:id="0" w:name="_GoBack"/>
+      <w:bookmarkEnd w:id="0"/>
     </w:p>
     <w:sectPr>
       <w:type w:val="continuous"/>
@@ -6299,9 +8450,9 @@
     </w:lvl>
   </w:abstractNum>
   <w:abstractNum w:abstractNumId="1" w15:restartNumberingAfterBreak="0">
-    <w:nsid w:val="42A61DD4"/>
+    <w:nsid w:val="1D3F3FD0"/>
     <w:multiLevelType w:val="hybridMultilevel"/>
-    <w:tmpl w:val="EC844880"/>
+    <w:tmpl w:val="B77EF91C"/>
     <w:lvl w:ilvl="0" w:tplc="04090001">
       <w:start w:val="1"/>
       <w:numFmt w:val="bullet"/>
@@ -6411,10 +8562,126 @@
       </w:rPr>
     </w:lvl>
   </w:abstractNum>
+  <w:abstractNum w:abstractNumId="2" w15:restartNumberingAfterBreak="0">
+    <w:nsid w:val="42A61DD4"/>
+    <w:multiLevelType w:val="hybridMultilevel"/>
+    <w:tmpl w:val="EC844880"/>
+    <w:lvl w:ilvl="0" w:tplc="04090001">
+      <w:start w:val="1"/>
+      <w:numFmt w:val="bullet"/>
+      <w:lvlText w:val=""/>
+      <w:lvlJc w:val="left"/>
+      <w:pPr>
+        <w:ind w:left="1080" w:hanging="360"/>
+      </w:pPr>
+      <w:rPr>
+        <w:rFonts w:ascii="Symbol" w:hAnsi="Symbol" w:hint="default"/>
+      </w:rPr>
+    </w:lvl>
+    <w:lvl w:ilvl="1" w:tplc="04090003" w:tentative="1">
+      <w:start w:val="1"/>
+      <w:numFmt w:val="bullet"/>
+      <w:lvlText w:val="o"/>
+      <w:lvlJc w:val="left"/>
+      <w:pPr>
+        <w:ind w:left="1800" w:hanging="360"/>
+      </w:pPr>
+      <w:rPr>
+        <w:rFonts w:ascii="Courier New" w:hAnsi="Courier New" w:cs="Courier New" w:hint="default"/>
+      </w:rPr>
+    </w:lvl>
+    <w:lvl w:ilvl="2" w:tplc="04090005" w:tentative="1">
+      <w:start w:val="1"/>
+      <w:numFmt w:val="bullet"/>
+      <w:lvlText w:val=""/>
+      <w:lvlJc w:val="left"/>
+      <w:pPr>
+        <w:ind w:left="2520" w:hanging="360"/>
+      </w:pPr>
+      <w:rPr>
+        <w:rFonts w:ascii="Wingdings" w:hAnsi="Wingdings" w:hint="default"/>
+      </w:rPr>
+    </w:lvl>
+    <w:lvl w:ilvl="3" w:tplc="04090001" w:tentative="1">
+      <w:start w:val="1"/>
+      <w:numFmt w:val="bullet"/>
+      <w:lvlText w:val=""/>
+      <w:lvlJc w:val="left"/>
+      <w:pPr>
+        <w:ind w:left="3240" w:hanging="360"/>
+      </w:pPr>
+      <w:rPr>
+        <w:rFonts w:ascii="Symbol" w:hAnsi="Symbol" w:hint="default"/>
+      </w:rPr>
+    </w:lvl>
+    <w:lvl w:ilvl="4" w:tplc="04090003" w:tentative="1">
+      <w:start w:val="1"/>
+      <w:numFmt w:val="bullet"/>
+      <w:lvlText w:val="o"/>
+      <w:lvlJc w:val="left"/>
+      <w:pPr>
+        <w:ind w:left="3960" w:hanging="360"/>
+      </w:pPr>
+      <w:rPr>
+        <w:rFonts w:ascii="Courier New" w:hAnsi="Courier New" w:cs="Courier New" w:hint="default"/>
+      </w:rPr>
+    </w:lvl>
+    <w:lvl w:ilvl="5" w:tplc="04090005" w:tentative="1">
+      <w:start w:val="1"/>
+      <w:numFmt w:val="bullet"/>
+      <w:lvlText w:val=""/>
+      <w:lvlJc w:val="left"/>
+      <w:pPr>
+        <w:ind w:left="4680" w:hanging="360"/>
+      </w:pPr>
+      <w:rPr>
+        <w:rFonts w:ascii="Wingdings" w:hAnsi="Wingdings" w:hint="default"/>
+      </w:rPr>
+    </w:lvl>
+    <w:lvl w:ilvl="6" w:tplc="04090001" w:tentative="1">
+      <w:start w:val="1"/>
+      <w:numFmt w:val="bullet"/>
+      <w:lvlText w:val=""/>
+      <w:lvlJc w:val="left"/>
+      <w:pPr>
+        <w:ind w:left="5400" w:hanging="360"/>
+      </w:pPr>
+      <w:rPr>
+        <w:rFonts w:ascii="Symbol" w:hAnsi="Symbol" w:hint="default"/>
+      </w:rPr>
+    </w:lvl>
+    <w:lvl w:ilvl="7" w:tplc="04090003" w:tentative="1">
+      <w:start w:val="1"/>
+      <w:numFmt w:val="bullet"/>
+      <w:lvlText w:val="o"/>
+      <w:lvlJc w:val="left"/>
+      <w:pPr>
+        <w:ind w:left="6120" w:hanging="360"/>
+      </w:pPr>
+      <w:rPr>
+        <w:rFonts w:ascii="Courier New" w:hAnsi="Courier New" w:cs="Courier New" w:hint="default"/>
+      </w:rPr>
+    </w:lvl>
+    <w:lvl w:ilvl="8" w:tplc="04090005" w:tentative="1">
+      <w:start w:val="1"/>
+      <w:numFmt w:val="bullet"/>
+      <w:lvlText w:val=""/>
+      <w:lvlJc w:val="left"/>
+      <w:pPr>
+        <w:ind w:left="6840" w:hanging="360"/>
+      </w:pPr>
+      <w:rPr>
+        <w:rFonts w:ascii="Wingdings" w:hAnsi="Wingdings" w:hint="default"/>
+      </w:rPr>
+    </w:lvl>
+  </w:abstractNum>
   <w:num w:numId="1">
     <w:abstractNumId w:val="0"/>
   </w:num>
   <w:num w:numId="2">
+    <w:abstractNumId w:val="2"/>
+  </w:num>
+  <w:num w:numId="3">
     <w:abstractNumId w:val="1"/>
   </w:num>
 </w:numbering>
@@ -7206,7 +9473,7 @@
 </file>
 
 <file path=customXml/itemProps1.xml><?xml version="1.0" encoding="utf-8"?>
-<ds:datastoreItem xmlns:ds="http://schemas.openxmlformats.org/officeDocument/2006/customXml" ds:itemID="{9BD46E4B-493F-4F11-8170-76657C96C021}">
+<ds:datastoreItem xmlns:ds="http://schemas.openxmlformats.org/officeDocument/2006/customXml" ds:itemID="{835C04A2-3B54-4F43-AC35-68FDAAC0CB8A}">
   <ds:schemaRefs>
     <ds:schemaRef ds:uri="http://schemas.openxmlformats.org/officeDocument/2006/bibliography"/>
   </ds:schemaRefs>

</xml_diff>